<commit_message>
Frontend v4.1.0: top menu bar, full-width content, large-screen scaling, dynamic height
- Replace the sidebar with a top menu bar; the team list moves into a Team menu
- Remove the 1480px content cap so pages fill the full-width section
- Scale the layout with CSS zoom (1.1-1.55) above 1700px wide; tooltips corrected for zoom
- Page height follows its content; empty Team overview shows tiles and getting-started steps
- 17 new layout checks (89 total); docs, change log and finalisation guide updated

Co-Authored-By: Claude Opus 5.5 <noreply@anthropic.com>
Claude-Session: https://claude.ai/code/session_014y1MJU3GKp2dkeyoic78UT
</commit_message>
<xml_diff>
--- a/one-to-one/ESG-1to1-Finalisation-Guide.docx
+++ b/one-to-one/ESG-1to1-Finalisation-Guide.docx
@@ -34,7 +34,7 @@
         <w:pStyle w:val="BodyText"/>
       </w:pPr>
       <w:r>
-        <w:t xml:space="preserve">Version: system v4.0.0 (frontend) · solution 1.0.0.0 · guide dated 15-Oct-2026</w:t>
+        <w:t xml:space="preserve">Version: system v4.1.0 (frontend) · solution 1.0.0.0 · guide dated 15-Oct-2026</w:t>
       </w:r>
     </w:p>
     <w:p>
@@ -208,7 +208,7 @@
         <w:pStyle w:val="Compact"/>
       </w:pPr>
       <w:r>
-        <w:t xml:space="preserve">frontend: 72 automated checks;</w:t>
+        <w:t xml:space="preserve">frontend: 89 automated checks;</w:t>
       </w:r>
     </w:p>
     <w:p>
@@ -1430,7 +1430,7 @@
         <w:t xml:space="preserve"> </w:t>
       </w:r>
       <w:r>
-        <w:t xml:space="preserve">(v4.0.0). After installing, the sidebar footer must show</w:t>
+        <w:t xml:space="preserve">(v4.1.0). After installing, the top menu bar must show</w:t>
       </w:r>
       <w:r>
         <w:t xml:space="preserve"> </w:t>
@@ -1440,10 +1440,13 @@
           <w:bCs/>
           <w:b/>
         </w:rPr>
-        <w:t xml:space="preserve">v4.0.0</w:t>
-      </w:r>
-      <w:r>
-        <w:t xml:space="preserve">.</w:t>
+        <w:t xml:space="preserve">v4.1.0</w:t>
+      </w:r>
+      <w:r>
+        <w:t xml:space="preserve"> </w:t>
+      </w:r>
+      <w:r>
+        <w:t xml:space="preserve">(right-hand end).</w:t>
       </w:r>
     </w:p>
     <w:p>
@@ -3631,6 +3634,19 @@
         <w:t xml:space="preserve">off</w:t>
       </w:r>
       <w:r>
+        <w:t xml:space="preserve">; on the Content tab, News posts and Slides</w:t>
+      </w:r>
+      <w:r>
+        <w:t xml:space="preserve"> </w:t>
+      </w:r>
+      <w:r>
+        <w:rPr>
+          <w:bCs/>
+          <w:b/>
+        </w:rPr>
+        <w:t xml:space="preserve">off</w:t>
+      </w:r>
+      <w:r>
         <w:t xml:space="preserve">.</w:t>
       </w:r>
     </w:p>
@@ -3643,6 +3659,34 @@
         <w:pStyle w:val="Compact"/>
       </w:pPr>
       <w:r>
+        <w:t xml:space="preserve">If you upload a newer version later:</w:t>
+      </w:r>
+      <w:r>
+        <w:t xml:space="preserve"> </w:t>
+      </w:r>
+      <w:r>
+        <w:rPr>
+          <w:bCs/>
+          <w:b/>
+        </w:rPr>
+        <w:t xml:space="preserve">Reset layout cache</w:t>
+      </w:r>
+      <w:r>
+        <w:t xml:space="preserve"> </w:t>
+      </w:r>
+      <w:r>
+        <w:t xml:space="preserve">in the web part settings, then republish.</w:t>
+      </w:r>
+    </w:p>
+    <w:p>
+      <w:pPr>
+        <w:numPr>
+          <w:ilvl w:val="1"/>
+          <w:numId w:val="1015"/>
+        </w:numPr>
+        <w:pStyle w:val="Compact"/>
+      </w:pPr>
+      <w:r>
         <w:rPr>
           <w:bCs/>
           <w:b/>
@@ -3861,13 +3905,29 @@
           <w:bCs/>
           <w:b/>
         </w:rPr>
-        <w:t xml:space="preserve">sidebar</w:t>
-      </w:r>
-      <w:r>
-        <w:t xml:space="preserve"> </w:t>
-      </w:r>
-      <w:r>
-        <w:t xml:space="preserve">with Team overview, Monthly reviews, Expectations, Actions and ⚙ Settings;</w:t>
+        <w:t xml:space="preserve">top menu bar</w:t>
+      </w:r>
+      <w:r>
+        <w:t xml:space="preserve"> </w:t>
+      </w:r>
+      <w:r>
+        <w:t xml:space="preserve">with Team overview, Monthly reviews, Expectations, Actions,</w:t>
+      </w:r>
+      <w:r>
+        <w:t xml:space="preserve"> </w:t>
+      </w:r>
+      <w:r>
+        <w:rPr>
+          <w:bCs/>
+          <w:b/>
+        </w:rPr>
+        <w:t xml:space="preserve">Team (0) ▾</w:t>
+      </w:r>
+      <w:r>
+        <w:t xml:space="preserve"> </w:t>
+      </w:r>
+      <w:r>
+        <w:t xml:space="preserve">and ⚙ Settings;</w:t>
       </w:r>
     </w:p>
     <w:p>
@@ -3918,13 +3978,13 @@
           <w:bCs/>
           <w:b/>
         </w:rPr>
-        <w:t xml:space="preserve">v4.0.0</w:t>
-      </w:r>
-      <w:r>
-        <w:t xml:space="preserve"> </w:t>
-      </w:r>
-      <w:r>
-        <w:t xml:space="preserve">at the bottom of the sidebar.</w:t>
+        <w:t xml:space="preserve">v4.1.0</w:t>
+      </w:r>
+      <w:r>
+        <w:t xml:space="preserve"> </w:t>
+      </w:r>
+      <w:r>
+        <w:t xml:space="preserve">at the right-hand end of the top menu bar.</w:t>
       </w:r>
     </w:p>
     <w:p>
@@ -4097,7 +4157,7 @@
         <w:pStyle w:val="Compact"/>
       </w:pPr>
       <w:r>
-        <w:t xml:space="preserve">☐ The sidebar and content fill the page width.</w:t>
+        <w:t xml:space="preserve">☐ The menu bar and content fill the page width.</w:t>
       </w:r>
     </w:p>
     <w:p>
@@ -5066,7 +5126,7 @@
         <w:t xml:space="preserve"> </w:t>
       </w:r>
       <w:r>
-        <w:t xml:space="preserve">in the sidebar.</w:t>
+        <w:t xml:space="preserve">in the top menu bar.</w:t>
       </w:r>
     </w:p>
     <w:p>
@@ -11805,7 +11865,7 @@
               <w:rPr>
                 <w:sz w:val="18"/>
               </w:rPr>
-              <w:t xml:space="preserve">Lands on own review, or "Review not found". The sidebar never shows TL items, because the role comes from SharePoint permissions. Even if the TL view were forced, every figure would come only from A's own items.</w:t>
+              <w:t xml:space="preserve">Lands on own review, or "Review not found". The menu bar never shows TL items, because the role comes from SharePoint permissions. Even if the TL view were forced, every figure would come only from A's own items.</w:t>
             </w:r>
           </w:p>
         </w:tc>

</xml_diff>

<commit_message>
Guide: align first look and Phase B with v4.1.0
- Individual expectation and report print move to Phase B (both need a technician)
- Add Reset layout cache check and troubleshooting row
- F17 / profile wording for the Team menu; code size ~1,800 lines
- Regenerate FINALISATION_GUIDE.md and the Word guide

Co-Authored-By: Claude Opus 5.5 <noreply@anthropic.com>
Claude-Session: https://claude.ai/code/session_014y1MJU3GKp2dkeyoic78UT
</commit_message>
<xml_diff>
--- a/one-to-one/ESG-1to1-Finalisation-Guide.docx
+++ b/one-to-one/ESG-1to1-Finalisation-Guide.docx
@@ -3883,6 +3883,93 @@
         <w:pStyle w:val="Compact"/>
       </w:pPr>
       <w:r>
+        <w:t xml:space="preserve">☐</w:t>
+      </w:r>
+      <w:r>
+        <w:t xml:space="preserve"> </w:t>
+      </w:r>
+      <w:r>
+        <w:rPr>
+          <w:bCs/>
+          <w:b/>
+        </w:rPr>
+        <w:t xml:space="preserve">Version check.</w:t>
+      </w:r>
+      <w:r>
+        <w:t xml:space="preserve"> </w:t>
+      </w:r>
+      <w:r>
+        <w:t xml:space="preserve">If you replaced</w:t>
+      </w:r>
+      <w:r>
+        <w:t xml:space="preserve"> </w:t>
+      </w:r>
+      <w:r>
+        <w:rPr>
+          <w:rStyle w:val="VerbatimChar"/>
+        </w:rPr>
+        <w:t xml:space="preserve">one-to-one.html</w:t>
+      </w:r>
+      <w:r>
+        <w:t xml:space="preserve"> </w:t>
+      </w:r>
+      <w:r>
+        <w:t xml:space="preserve">/</w:t>
+      </w:r>
+      <w:r>
+        <w:t xml:space="preserve"> </w:t>
+      </w:r>
+      <w:r>
+        <w:rPr>
+          <w:rStyle w:val="VerbatimChar"/>
+        </w:rPr>
+        <w:t xml:space="preserve">one-to-one.js</w:t>
+      </w:r>
+      <w:r>
+        <w:t xml:space="preserve"> </w:t>
+      </w:r>
+      <w:r>
+        <w:t xml:space="preserve">after first choosing the layout: web part settings (pencil) →</w:t>
+      </w:r>
+      <w:r>
+        <w:t xml:space="preserve"> </w:t>
+      </w:r>
+      <w:r>
+        <w:rPr>
+          <w:bCs/>
+          <w:b/>
+        </w:rPr>
+        <w:t xml:space="preserve">Reset layout cache</w:t>
+      </w:r>
+      <w:r>
+        <w:t xml:space="preserve"> </w:t>
+      </w:r>
+      <w:r>
+        <w:t xml:space="preserve">→</w:t>
+      </w:r>
+      <w:r>
+        <w:t xml:space="preserve"> </w:t>
+      </w:r>
+      <w:r>
+        <w:rPr>
+          <w:bCs/>
+          <w:b/>
+        </w:rPr>
+        <w:t xml:space="preserve">Republish</w:t>
+      </w:r>
+      <w:r>
+        <w:t xml:space="preserve">.</w:t>
+      </w:r>
+    </w:p>
+    <w:p>
+      <w:pPr>
+        <w:numPr>
+          <w:ilvl w:val="0"/>
+          <w:numId w:val="1017"/>
+        </w:numPr>
+        <w:pStyle w:val="Compact"/>
+      </w:pPr>
+      <w:r>
         <w:t xml:space="preserve">☐ Open the site. You should see:</w:t>
       </w:r>
     </w:p>
@@ -3908,10 +3995,7 @@
         <w:t xml:space="preserve">top menu bar</w:t>
       </w:r>
       <w:r>
-        <w:t xml:space="preserve"> </w:t>
-      </w:r>
-      <w:r>
-        <w:t xml:space="preserve">with Team overview, Monthly reviews, Expectations, Actions,</w:t>
+        <w:t xml:space="preserve">: Team overview, Monthly reviews, Expectations and Actions on the left;</w:t>
       </w:r>
       <w:r>
         <w:t xml:space="preserve"> </w:t>
@@ -3927,7 +4011,23 @@
         <w:t xml:space="preserve"> </w:t>
       </w:r>
       <w:r>
-        <w:t xml:space="preserve">and ⚙ Settings;</w:t>
+        <w:t xml:space="preserve">and</w:t>
+      </w:r>
+      <w:r>
+        <w:t xml:space="preserve"> </w:t>
+      </w:r>
+      <w:r>
+        <w:rPr>
+          <w:bCs/>
+          <w:b/>
+        </w:rPr>
+        <w:t xml:space="preserve">⚙ Settings</w:t>
+      </w:r>
+      <w:r>
+        <w:t xml:space="preserve"> </w:t>
+      </w:r>
+      <w:r>
+        <w:t xml:space="preserve">on the right;</w:t>
       </w:r>
     </w:p>
     <w:p>
@@ -3939,30 +4039,23 @@
         <w:pStyle w:val="Compact"/>
       </w:pPr>
       <w:r>
+        <w:t xml:space="preserve">the month, deadline, ↻ Refresh and</w:t>
+      </w:r>
+      <w:r>
+        <w:t xml:space="preserve"> </w:t>
+      </w:r>
+      <w:r>
         <w:rPr>
           <w:bCs/>
           <w:b/>
         </w:rPr>
-        <w:t xml:space="preserve">Team overview</w:t>
-      </w:r>
-      <w:r>
-        <w:t xml:space="preserve"> </w:t>
-      </w:r>
-      <w:r>
-        <w:t xml:space="preserve">showing</w:t>
-      </w:r>
-      <w:r>
-        <w:t xml:space="preserve"> </w:t>
-      </w:r>
-      <w:r>
-        <w:rPr>
-          <w:iCs/>
-          <w:i/>
-        </w:rPr>
-        <w:t xml:space="preserve">"No technicians yet"</w:t>
-      </w:r>
-      <w:r>
-        <w:t xml:space="preserve">;</w:t>
+        <w:t xml:space="preserve">v4.1.0</w:t>
+      </w:r>
+      <w:r>
+        <w:t xml:space="preserve"> </w:t>
+      </w:r>
+      <w:r>
+        <w:t xml:space="preserve">at the far right;</w:t>
       </w:r>
     </w:p>
     <w:p>
@@ -3978,13 +4071,29 @@
           <w:bCs/>
           <w:b/>
         </w:rPr>
-        <w:t xml:space="preserve">v4.1.0</w:t>
-      </w:r>
-      <w:r>
-        <w:t xml:space="preserve"> </w:t>
-      </w:r>
-      <w:r>
-        <w:t xml:space="preserve">at the right-hand end of the top menu bar.</w:t>
+        <w:t xml:space="preserve">Team overview</w:t>
+      </w:r>
+      <w:r>
+        <w:t xml:space="preserve"> </w:t>
+      </w:r>
+      <w:r>
+        <w:t xml:space="preserve">showing six tiles at 0, then</w:t>
+      </w:r>
+      <w:r>
+        <w:t xml:space="preserve"> </w:t>
+      </w:r>
+      <w:r>
+        <w:rPr>
+          <w:iCs/>
+          <w:i/>
+        </w:rPr>
+        <w:t xml:space="preserve">"No technicians yet"</w:t>
+      </w:r>
+      <w:r>
+        <w:t xml:space="preserve"> </w:t>
+      </w:r>
+      <w:r>
+        <w:t xml:space="preserve">with four numbered getting-started steps.</w:t>
       </w:r>
     </w:p>
     <w:p>
@@ -4075,6 +4184,28 @@
         </w:rPr>
         <w:t xml:space="preserve">Expectations:</w:t>
       </w:r>
+      <w:r>
+        <w:t xml:space="preserve"> </w:t>
+      </w:r>
+      <w:r>
+        <w:t xml:space="preserve">add one</w:t>
+      </w:r>
+      <w:r>
+        <w:t xml:space="preserve"> </w:t>
+      </w:r>
+      <w:r>
+        <w:rPr>
+          <w:iCs/>
+          <w:i/>
+        </w:rPr>
+        <w:t xml:space="preserve">Shared</w:t>
+      </w:r>
+      <w:r>
+        <w:t xml:space="preserve"> </w:t>
+      </w:r>
+      <w:r>
+        <w:t xml:space="preserve">expectation. This proves item creation and the Yes/No column work in your tenant.</w:t>
+      </w:r>
     </w:p>
     <w:p>
       <w:pPr>
@@ -4085,39 +4216,23 @@
         <w:pStyle w:val="Compact"/>
       </w:pPr>
       <w:r>
-        <w:t xml:space="preserve">Add one</w:t>
-      </w:r>
-      <w:r>
-        <w:t xml:space="preserve"> </w:t>
-      </w:r>
-      <w:r>
-        <w:rPr>
-          <w:iCs/>
-          <w:i/>
-        </w:rPr>
-        <w:t xml:space="preserve">Shared</w:t>
-      </w:r>
-      <w:r>
-        <w:t xml:space="preserve"> </w:t>
-      </w:r>
-      <w:r>
-        <w:t xml:space="preserve">expectation and one</w:t>
-      </w:r>
-      <w:r>
-        <w:t xml:space="preserve"> </w:t>
-      </w:r>
-      <w:r>
-        <w:rPr>
-          <w:iCs/>
-          <w:i/>
-        </w:rPr>
-        <w:t xml:space="preserve">Individual</w:t>
-      </w:r>
-      <w:r>
-        <w:t xml:space="preserve"> </w:t>
-      </w:r>
-      <w:r>
-        <w:t xml:space="preserve">expectation for yourself. This proves item creation, Yes/No and Person columns work in your tenant.</w:t>
+        <w:t xml:space="preserve">Leave it Active if it's a real one; otherwise</w:t>
+      </w:r>
+      <w:r>
+        <w:t xml:space="preserve"> </w:t>
+      </w:r>
+      <w:r>
+        <w:rPr>
+          <w:bCs/>
+          <w:b/>
+        </w:rPr>
+        <w:t xml:space="preserve">Retire</w:t>
+      </w:r>
+      <w:r>
+        <w:t xml:space="preserve"> </w:t>
+      </w:r>
+      <w:r>
+        <w:t xml:space="preserve">it.</w:t>
       </w:r>
     </w:p>
     <w:p>
@@ -4129,23 +4244,23 @@
         <w:pStyle w:val="Compact"/>
       </w:pPr>
       <w:r>
-        <w:t xml:space="preserve">Then</w:t>
-      </w:r>
-      <w:r>
-        <w:t xml:space="preserve"> </w:t>
-      </w:r>
-      <w:r>
-        <w:rPr>
-          <w:bCs/>
-          <w:b/>
-        </w:rPr>
-        <w:t xml:space="preserve">Retire</w:t>
-      </w:r>
-      <w:r>
-        <w:t xml:space="preserve"> </w:t>
-      </w:r>
-      <w:r>
-        <w:t xml:space="preserve">the Individual one.</w:t>
+        <w:t xml:space="preserve">The</w:t>
+      </w:r>
+      <w:r>
+        <w:t xml:space="preserve"> </w:t>
+      </w:r>
+      <w:r>
+        <w:rPr>
+          <w:iCs/>
+          <w:i/>
+        </w:rPr>
+        <w:t xml:space="preserve">Individual</w:t>
+      </w:r>
+      <w:r>
+        <w:t xml:space="preserve"> </w:t>
+      </w:r>
+      <w:r>
+        <w:t xml:space="preserve">expectation (Person column) is tested in Phase B: the Technician dropdown is empty until someone is in the Technicians list.</w:t>
       </w:r>
     </w:p>
     <w:p>
@@ -4157,35 +4272,47 @@
         <w:pStyle w:val="Compact"/>
       </w:pPr>
       <w:r>
-        <w:t xml:space="preserve">☐ The menu bar and content fill the page width.</w:t>
+        <w:t xml:space="preserve">☐</w:t>
+      </w:r>
+      <w:r>
+        <w:t xml:space="preserve"> </w:t>
+      </w:r>
+      <w:r>
+        <w:rPr>
+          <w:bCs/>
+          <w:b/>
+        </w:rPr>
+        <w:t xml:space="preserve">Width and size:</w:t>
+      </w:r>
+      <w:r>
+        <w:t xml:space="preserve"> </w:t>
+      </w:r>
+      <w:r>
+        <w:t xml:space="preserve">the menu bar and content fill the page width, and the page ends where its content ends.</w:t>
       </w:r>
     </w:p>
     <w:p>
       <w:pPr>
         <w:numPr>
-          <w:ilvl w:val="0"/>
-          <w:numId w:val="1017"/>
+          <w:ilvl w:val="1"/>
+          <w:numId w:val="1020"/>
         </w:numPr>
         <w:pStyle w:val="Compact"/>
       </w:pPr>
       <w:r>
-        <w:t xml:space="preserve">☐</w:t>
-      </w:r>
-      <w:r>
-        <w:t xml:space="preserve"> </w:t>
-      </w:r>
-      <w:r>
-        <w:rPr>
-          <w:bCs/>
-          <w:b/>
-        </w:rPr>
-        <w:t xml:space="preserve">Print / Save as PDF</w:t>
-      </w:r>
-      <w:r>
-        <w:t xml:space="preserve"> </w:t>
-      </w:r>
-      <w:r>
-        <w:t xml:space="preserve">on a report opens a print window. If not, allow pop-ups for the SharePoint site.</w:t>
+        <w:t xml:space="preserve">On a large monitor the layout scales itself up.</w:t>
+      </w:r>
+    </w:p>
+    <w:p>
+      <w:pPr>
+        <w:numPr>
+          <w:ilvl w:val="1"/>
+          <w:numId w:val="1020"/>
+        </w:numPr>
+        <w:pStyle w:val="Compact"/>
+      </w:pPr>
+      <w:r>
+        <w:t xml:space="preserve">Ctrl + / Ctrl − still adjusts it per person.</w:t>
       </w:r>
     </w:p>
     <w:p>
@@ -4226,64 +4353,48 @@
       <w:pPr>
         <w:numPr>
           <w:ilvl w:val="0"/>
-          <w:numId w:val="1020"/>
-        </w:numPr>
-        <w:pStyle w:val="Compact"/>
-      </w:pPr>
-      <w:r>
-        <w:t xml:space="preserve">☐</w:t>
-      </w:r>
-      <w:r>
-        <w:t xml:space="preserve"> </w:t>
-      </w:r>
-      <w:r>
-        <w:rPr>
-          <w:bCs/>
-          <w:b/>
-        </w:rPr>
-        <w:t xml:space="preserve">Solutions → ESG 1-to-1</w:t>
-      </w:r>
-      <w:r>
-        <w:t xml:space="preserve"> </w:t>
-      </w:r>
-      <w:r>
-        <w:t xml:space="preserve">→ select each flow →</w:t>
-      </w:r>
-      <w:r>
-        <w:t xml:space="preserve"> </w:t>
-      </w:r>
-      <w:r>
-        <w:rPr>
-          <w:bCs/>
-          <w:b/>
-        </w:rPr>
-        <w:t xml:space="preserve">Turn on</w:t>
-      </w:r>
-      <w:r>
-        <w:t xml:space="preserve">:</w:t>
-      </w:r>
-    </w:p>
-    <w:p>
-      <w:pPr>
-        <w:numPr>
-          <w:ilvl w:val="1"/>
           <w:numId w:val="1021"/>
         </w:numPr>
         <w:pStyle w:val="Compact"/>
       </w:pPr>
       <w:r>
+        <w:t xml:space="preserve">☐</w:t>
+      </w:r>
+      <w:r>
+        <w:t xml:space="preserve"> </w:t>
+      </w:r>
+      <w:r>
         <w:rPr>
           <w:bCs/>
           <w:b/>
         </w:rPr>
-        <w:t xml:space="preserve">1 Daily scheduler</w:t>
+        <w:t xml:space="preserve">Solutions → ESG 1-to-1</w:t>
+      </w:r>
+      <w:r>
+        <w:t xml:space="preserve"> </w:t>
+      </w:r>
+      <w:r>
+        <w:t xml:space="preserve">→ select each flow →</w:t>
+      </w:r>
+      <w:r>
+        <w:t xml:space="preserve"> </w:t>
+      </w:r>
+      <w:r>
+        <w:rPr>
+          <w:bCs/>
+          <w:b/>
+        </w:rPr>
+        <w:t xml:space="preserve">Turn on</w:t>
+      </w:r>
+      <w:r>
+        <w:t xml:space="preserve">:</w:t>
       </w:r>
     </w:p>
     <w:p>
       <w:pPr>
         <w:numPr>
           <w:ilvl w:val="1"/>
-          <w:numId w:val="1021"/>
+          <w:numId w:val="1022"/>
         </w:numPr>
         <w:pStyle w:val="Compact"/>
       </w:pPr>
@@ -4292,14 +4403,30 @@
           <w:bCs/>
           <w:b/>
         </w:rPr>
-        <w:t xml:space="preserve">2 Review submitted</w:t>
+        <w:t xml:space="preserve">1 Daily scheduler</w:t>
       </w:r>
     </w:p>
     <w:p>
       <w:pPr>
         <w:numPr>
           <w:ilvl w:val="1"/>
-          <w:numId w:val="1021"/>
+          <w:numId w:val="1022"/>
+        </w:numPr>
+        <w:pStyle w:val="Compact"/>
+      </w:pPr>
+      <w:r>
+        <w:rPr>
+          <w:bCs/>
+          <w:b/>
+        </w:rPr>
+        <w:t xml:space="preserve">2 Review submitted</w:t>
+      </w:r>
+    </w:p>
+    <w:p>
+      <w:pPr>
+        <w:numPr>
+          <w:ilvl w:val="1"/>
+          <w:numId w:val="1022"/>
         </w:numPr>
         <w:pStyle w:val="Compact"/>
       </w:pPr>
@@ -4333,173 +4460,39 @@
       <w:pPr>
         <w:numPr>
           <w:ilvl w:val="0"/>
-          <w:numId w:val="1022"/>
-        </w:numPr>
-        <w:pStyle w:val="Compact"/>
-      </w:pPr>
-      <w:r>
-        <w:t xml:space="preserve">Open</w:t>
-      </w:r>
-      <w:r>
-        <w:t xml:space="preserve"> </w:t>
-      </w:r>
-      <w:r>
-        <w:rPr>
-          <w:rStyle w:val="VerbatimChar"/>
-        </w:rPr>
-        <w:t xml:space="preserve">legacy-package-builder.html</w:t>
-      </w:r>
-      <w:r>
-        <w:t xml:space="preserve"> </w:t>
-      </w:r>
-      <w:r>
-        <w:t xml:space="preserve">in Edge or Chrome (double-click the file). It works offline.</w:t>
-      </w:r>
-    </w:p>
-    <w:p>
-      <w:pPr>
-        <w:numPr>
-          <w:ilvl w:val="0"/>
-          <w:numId w:val="1022"/>
-        </w:numPr>
-        <w:pStyle w:val="Compact"/>
-      </w:pPr>
-      <w:r>
-        <w:t xml:space="preserve">Enter the</w:t>
-      </w:r>
-      <w:r>
-        <w:t xml:space="preserve"> </w:t>
-      </w:r>
-      <w:r>
-        <w:rPr>
-          <w:bCs/>
-          <w:b/>
-        </w:rPr>
-        <w:t xml:space="preserve">site URL</w:t>
-      </w:r>
-      <w:r>
-        <w:t xml:space="preserve"> </w:t>
-      </w:r>
-      <w:r>
-        <w:t xml:space="preserve">and</w:t>
-      </w:r>
-      <w:r>
-        <w:t xml:space="preserve"> </w:t>
-      </w:r>
-      <w:r>
-        <w:rPr>
-          <w:bCs/>
-          <w:b/>
-        </w:rPr>
-        <w:t xml:space="preserve">your email</w:t>
-      </w:r>
-      <w:r>
-        <w:t xml:space="preserve">, then click</w:t>
-      </w:r>
-      <w:r>
-        <w:t xml:space="preserve"> </w:t>
-      </w:r>
-      <w:r>
-        <w:rPr>
-          <w:bCs/>
-          <w:b/>
-        </w:rPr>
-        <w:t xml:space="preserve">Create the four packages</w:t>
-      </w:r>
-      <w:r>
-        <w:t xml:space="preserve">. Four zips download:</w:t>
-      </w:r>
-      <w:r>
-        <w:t xml:space="preserve"> </w:t>
-      </w:r>
-      <w:r>
-        <w:rPr>
-          <w:rStyle w:val="VerbatimChar"/>
-        </w:rPr>
-        <w:t xml:space="preserve">ESG-1to1-0-legacy.zip</w:t>
-      </w:r>
-      <w:r>
-        <w:t xml:space="preserve"> </w:t>
-      </w:r>
-      <w:r>
-        <w:t xml:space="preserve">to</w:t>
-      </w:r>
-      <w:r>
-        <w:t xml:space="preserve"> </w:t>
-      </w:r>
-      <w:r>
-        <w:rPr>
-          <w:rStyle w:val="VerbatimChar"/>
-        </w:rPr>
-        <w:t xml:space="preserve">ESG-1to1-3-legacy.zip</w:t>
-      </w:r>
-      <w:r>
-        <w:t xml:space="preserve">.</w:t>
-      </w:r>
-    </w:p>
-    <w:p>
-      <w:pPr>
-        <w:numPr>
-          <w:ilvl w:val="0"/>
-          <w:numId w:val="1022"/>
-        </w:numPr>
-        <w:pStyle w:val="Compact"/>
-      </w:pPr>
-      <w:r>
-        <w:t xml:space="preserve">For each zip, in order 0, 1, 2, 3:</w:t>
-      </w:r>
-    </w:p>
-    <w:p>
-      <w:pPr>
-        <w:numPr>
-          <w:ilvl w:val="1"/>
           <w:numId w:val="1023"/>
         </w:numPr>
         <w:pStyle w:val="Compact"/>
       </w:pPr>
       <w:r>
-        <w:t xml:space="preserve">Power Automate →</w:t>
-      </w:r>
-      <w:r>
-        <w:t xml:space="preserve"> </w:t>
-      </w:r>
-      <w:r>
-        <w:rPr>
-          <w:bCs/>
-          <w:b/>
-        </w:rPr>
-        <w:t xml:space="preserve">My flows → Import → Import Package (Legacy)</w:t>
-      </w:r>
-      <w:r>
-        <w:t xml:space="preserve"> </w:t>
-      </w:r>
-      <w:r>
-        <w:t xml:space="preserve">→</w:t>
-      </w:r>
-      <w:r>
-        <w:t xml:space="preserve"> </w:t>
-      </w:r>
-      <w:r>
-        <w:rPr>
-          <w:bCs/>
-          <w:b/>
-        </w:rPr>
-        <w:t xml:space="preserve">Upload</w:t>
-      </w:r>
-      <w:r>
-        <w:t xml:space="preserve">.</w:t>
+        <w:t xml:space="preserve">Open</w:t>
+      </w:r>
+      <w:r>
+        <w:t xml:space="preserve"> </w:t>
+      </w:r>
+      <w:r>
+        <w:rPr>
+          <w:rStyle w:val="VerbatimChar"/>
+        </w:rPr>
+        <w:t xml:space="preserve">legacy-package-builder.html</w:t>
+      </w:r>
+      <w:r>
+        <w:t xml:space="preserve"> </w:t>
+      </w:r>
+      <w:r>
+        <w:t xml:space="preserve">in Edge or Chrome (double-click the file). It works offline.</w:t>
       </w:r>
     </w:p>
     <w:p>
       <w:pPr>
         <w:numPr>
-          <w:ilvl w:val="1"/>
+          <w:ilvl w:val="0"/>
           <w:numId w:val="1023"/>
         </w:numPr>
         <w:pStyle w:val="Compact"/>
       </w:pPr>
       <w:r>
-        <w:t xml:space="preserve">Under</w:t>
+        <w:t xml:space="preserve">Enter the</w:t>
       </w:r>
       <w:r>
         <w:t xml:space="preserve"> </w:t>
@@ -4509,10 +4502,13 @@
           <w:bCs/>
           <w:b/>
         </w:rPr>
-        <w:t xml:space="preserve">Related resources</w:t>
-      </w:r>
-      <w:r>
-        <w:t xml:space="preserve">, click each connection (spanner icon), pick your own connection, and click</w:t>
+        <w:t xml:space="preserve">site URL</w:t>
+      </w:r>
+      <w:r>
+        <w:t xml:space="preserve"> </w:t>
+      </w:r>
+      <w:r>
+        <w:t xml:space="preserve">and</w:t>
       </w:r>
       <w:r>
         <w:t xml:space="preserve"> </w:t>
@@ -4522,7 +4518,47 @@
           <w:bCs/>
           <w:b/>
         </w:rPr>
-        <w:t xml:space="preserve">Save</w:t>
+        <w:t xml:space="preserve">your email</w:t>
+      </w:r>
+      <w:r>
+        <w:t xml:space="preserve">, then click</w:t>
+      </w:r>
+      <w:r>
+        <w:t xml:space="preserve"> </w:t>
+      </w:r>
+      <w:r>
+        <w:rPr>
+          <w:bCs/>
+          <w:b/>
+        </w:rPr>
+        <w:t xml:space="preserve">Create the four packages</w:t>
+      </w:r>
+      <w:r>
+        <w:t xml:space="preserve">. Four zips download:</w:t>
+      </w:r>
+      <w:r>
+        <w:t xml:space="preserve"> </w:t>
+      </w:r>
+      <w:r>
+        <w:rPr>
+          <w:rStyle w:val="VerbatimChar"/>
+        </w:rPr>
+        <w:t xml:space="preserve">ESG-1to1-0-legacy.zip</w:t>
+      </w:r>
+      <w:r>
+        <w:t xml:space="preserve"> </w:t>
+      </w:r>
+      <w:r>
+        <w:t xml:space="preserve">to</w:t>
+      </w:r>
+      <w:r>
+        <w:t xml:space="preserve"> </w:t>
+      </w:r>
+      <w:r>
+        <w:rPr>
+          <w:rStyle w:val="VerbatimChar"/>
+        </w:rPr>
+        <w:t xml:space="preserve">ESG-1to1-3-legacy.zip</w:t>
       </w:r>
       <w:r>
         <w:t xml:space="preserve">.</w:t>
@@ -4531,12 +4567,103 @@
     <w:p>
       <w:pPr>
         <w:numPr>
-          <w:ilvl w:val="1"/>
+          <w:ilvl w:val="0"/>
           <w:numId w:val="1023"/>
         </w:numPr>
         <w:pStyle w:val="Compact"/>
       </w:pPr>
       <w:r>
+        <w:t xml:space="preserve">For each zip, in order 0, 1, 2, 3:</w:t>
+      </w:r>
+    </w:p>
+    <w:p>
+      <w:pPr>
+        <w:numPr>
+          <w:ilvl w:val="1"/>
+          <w:numId w:val="1024"/>
+        </w:numPr>
+        <w:pStyle w:val="Compact"/>
+      </w:pPr>
+      <w:r>
+        <w:t xml:space="preserve">Power Automate →</w:t>
+      </w:r>
+      <w:r>
+        <w:t xml:space="preserve"> </w:t>
+      </w:r>
+      <w:r>
+        <w:rPr>
+          <w:bCs/>
+          <w:b/>
+        </w:rPr>
+        <w:t xml:space="preserve">My flows → Import → Import Package (Legacy)</w:t>
+      </w:r>
+      <w:r>
+        <w:t xml:space="preserve"> </w:t>
+      </w:r>
+      <w:r>
+        <w:t xml:space="preserve">→</w:t>
+      </w:r>
+      <w:r>
+        <w:t xml:space="preserve"> </w:t>
+      </w:r>
+      <w:r>
+        <w:rPr>
+          <w:bCs/>
+          <w:b/>
+        </w:rPr>
+        <w:t xml:space="preserve">Upload</w:t>
+      </w:r>
+      <w:r>
+        <w:t xml:space="preserve">.</w:t>
+      </w:r>
+    </w:p>
+    <w:p>
+      <w:pPr>
+        <w:numPr>
+          <w:ilvl w:val="1"/>
+          <w:numId w:val="1024"/>
+        </w:numPr>
+        <w:pStyle w:val="Compact"/>
+      </w:pPr>
+      <w:r>
+        <w:t xml:space="preserve">Under</w:t>
+      </w:r>
+      <w:r>
+        <w:t xml:space="preserve"> </w:t>
+      </w:r>
+      <w:r>
+        <w:rPr>
+          <w:bCs/>
+          <w:b/>
+        </w:rPr>
+        <w:t xml:space="preserve">Related resources</w:t>
+      </w:r>
+      <w:r>
+        <w:t xml:space="preserve">, click each connection (spanner icon), pick your own connection, and click</w:t>
+      </w:r>
+      <w:r>
+        <w:t xml:space="preserve"> </w:t>
+      </w:r>
+      <w:r>
+        <w:rPr>
+          <w:bCs/>
+          <w:b/>
+        </w:rPr>
+        <w:t xml:space="preserve">Save</w:t>
+      </w:r>
+      <w:r>
+        <w:t xml:space="preserve">.</w:t>
+      </w:r>
+    </w:p>
+    <w:p>
+      <w:pPr>
+        <w:numPr>
+          <w:ilvl w:val="1"/>
+          <w:numId w:val="1024"/>
+        </w:numPr>
+        <w:pStyle w:val="Compact"/>
+      </w:pPr>
+      <w:r>
         <w:t xml:space="preserve">Under</w:t>
       </w:r>
       <w:r>
@@ -4570,12 +4697,37 @@
       <w:pPr>
         <w:numPr>
           <w:ilvl w:val="1"/>
+          <w:numId w:val="1024"/>
+        </w:numPr>
+        <w:pStyle w:val="Compact"/>
+      </w:pPr>
+      <w:r>
+        <w:t xml:space="preserve">Click</w:t>
+      </w:r>
+      <w:r>
+        <w:t xml:space="preserve"> </w:t>
+      </w:r>
+      <w:r>
+        <w:rPr>
+          <w:bCs/>
+          <w:b/>
+        </w:rPr>
+        <w:t xml:space="preserve">Import</w:t>
+      </w:r>
+      <w:r>
+        <w:t xml:space="preserve">.</w:t>
+      </w:r>
+    </w:p>
+    <w:p>
+      <w:pPr>
+        <w:numPr>
+          <w:ilvl w:val="0"/>
           <w:numId w:val="1023"/>
         </w:numPr>
         <w:pStyle w:val="Compact"/>
       </w:pPr>
       <w:r>
-        <w:t xml:space="preserve">Click</w:t>
+        <w:t xml:space="preserve">Continue at §4.3 (run the setup flow), then §4.4–§4.7. Find the flows under</w:t>
       </w:r>
       <w:r>
         <w:t xml:space="preserve"> </w:t>
@@ -4585,7 +4737,23 @@
           <w:bCs/>
           <w:b/>
         </w:rPr>
-        <w:t xml:space="preserve">Import</w:t>
+        <w:t xml:space="preserve">My flows</w:t>
+      </w:r>
+      <w:r>
+        <w:t xml:space="preserve"> </w:t>
+      </w:r>
+      <w:r>
+        <w:t xml:space="preserve">rather than</w:t>
+      </w:r>
+      <w:r>
+        <w:t xml:space="preserve"> </w:t>
+      </w:r>
+      <w:r>
+        <w:rPr>
+          <w:iCs/>
+          <w:i/>
+        </w:rPr>
+        <w:t xml:space="preserve">Solutions</w:t>
       </w:r>
       <w:r>
         <w:t xml:space="preserve">.</w:t>
@@ -4593,84 +4761,43 @@
     </w:p>
     <w:p>
       <w:pPr>
+        <w:pStyle w:val="FirstParagraph"/>
+      </w:pPr>
+      <w:r>
+        <w:rPr>
+          <w:bCs/>
+          <w:b/>
+        </w:rPr>
+        <w:t xml:space="preserve">Differences in legacy mode:</w:t>
+      </w:r>
+    </w:p>
+    <w:p>
+      <w:pPr>
         <w:numPr>
           <w:ilvl w:val="0"/>
-          <w:numId w:val="1022"/>
+          <w:numId w:val="1025"/>
         </w:numPr>
         <w:pStyle w:val="Compact"/>
       </w:pPr>
       <w:r>
-        <w:t xml:space="preserve">Continue at §4.3 (run the setup flow), then §4.4–§4.7. Find the flows under</w:t>
-      </w:r>
-      <w:r>
-        <w:t xml:space="preserve"> </w:t>
-      </w:r>
-      <w:r>
-        <w:rPr>
-          <w:bCs/>
-          <w:b/>
-        </w:rPr>
-        <w:t xml:space="preserve">My flows</w:t>
-      </w:r>
-      <w:r>
-        <w:t xml:space="preserve"> </w:t>
-      </w:r>
-      <w:r>
-        <w:t xml:space="preserve">rather than</w:t>
-      </w:r>
-      <w:r>
-        <w:t xml:space="preserve"> </w:t>
+        <w:t xml:space="preserve">The site URL and email are written into the flows. To change them later, re-run the builder and re-import (</w:t>
       </w:r>
       <w:r>
         <w:rPr>
           <w:iCs/>
           <w:i/>
         </w:rPr>
-        <w:t xml:space="preserve">Solutions</w:t>
-      </w:r>
-      <w:r>
-        <w:t xml:space="preserve">.</w:t>
+        <w:t xml:space="preserve">Update</w:t>
+      </w:r>
+      <w:r>
+        <w:t xml:space="preserve">), or edit the flows.</w:t>
       </w:r>
     </w:p>
     <w:p>
       <w:pPr>
-        <w:pStyle w:val="FirstParagraph"/>
-      </w:pPr>
-      <w:r>
-        <w:rPr>
-          <w:bCs/>
-          <w:b/>
-        </w:rPr>
-        <w:t xml:space="preserve">Differences in legacy mode:</w:t>
-      </w:r>
-    </w:p>
-    <w:p>
-      <w:pPr>
         <w:numPr>
           <w:ilvl w:val="0"/>
-          <w:numId w:val="1024"/>
-        </w:numPr>
-        <w:pStyle w:val="Compact"/>
-      </w:pPr>
-      <w:r>
-        <w:t xml:space="preserve">The site URL and email are written into the flows. To change them later, re-run the builder and re-import (</w:t>
-      </w:r>
-      <w:r>
-        <w:rPr>
-          <w:iCs/>
-          <w:i/>
-        </w:rPr>
-        <w:t xml:space="preserve">Update</w:t>
-      </w:r>
-      <w:r>
-        <w:t xml:space="preserve">), or edit the flows.</w:t>
-      </w:r>
-    </w:p>
-    <w:p>
-      <w:pPr>
-        <w:numPr>
-          <w:ilvl w:val="0"/>
-          <w:numId w:val="1024"/>
+          <w:numId w:val="1025"/>
         </w:numPr>
         <w:pStyle w:val="Compact"/>
       </w:pPr>
@@ -4754,121 +4881,28 @@
       <w:pPr>
         <w:numPr>
           <w:ilvl w:val="0"/>
-          <w:numId w:val="1025"/>
-        </w:numPr>
-        <w:pStyle w:val="Compact"/>
-      </w:pPr>
-      <w:r>
-        <w:t xml:space="preserve">☐</w:t>
-      </w:r>
-      <w:r>
-        <w:t xml:space="preserve"> </w:t>
-      </w:r>
-      <w:r>
-        <w:rPr>
-          <w:bCs/>
-          <w:b/>
-        </w:rPr>
-        <w:t xml:space="preserve">Technicians list → + New</w:t>
-      </w:r>
-      <w:r>
-        <w:t xml:space="preserve"> </w:t>
-      </w:r>
-      <w:r>
-        <w:t xml:space="preserve">for</w:t>
-      </w:r>
-      <w:r>
-        <w:t xml:space="preserve"> </w:t>
-      </w:r>
-      <w:r>
-        <w:rPr>
-          <w:bCs/>
-          <w:b/>
-        </w:rPr>
-        <w:t xml:space="preserve">Test A</w:t>
-      </w:r>
-      <w:r>
-        <w:t xml:space="preserve">, then again for</w:t>
-      </w:r>
-      <w:r>
-        <w:t xml:space="preserve"> </w:t>
-      </w:r>
-      <w:r>
-        <w:rPr>
-          <w:bCs/>
-          <w:b/>
-        </w:rPr>
-        <w:t xml:space="preserve">Test B</w:t>
-      </w:r>
-      <w:r>
-        <w:t xml:space="preserve">:</w:t>
-      </w:r>
-    </w:p>
-    <w:p>
-      <w:pPr>
-        <w:numPr>
-          <w:ilvl w:val="1"/>
           <w:numId w:val="1026"/>
         </w:numPr>
         <w:pStyle w:val="Compact"/>
       </w:pPr>
       <w:r>
-        <w:t xml:space="preserve">Title = name;</w:t>
-      </w:r>
-    </w:p>
-    <w:p>
-      <w:pPr>
-        <w:numPr>
-          <w:ilvl w:val="1"/>
-          <w:numId w:val="1026"/>
-        </w:numPr>
-        <w:pStyle w:val="Compact"/>
-      </w:pPr>
-      <w:r>
-        <w:t xml:space="preserve">Technician = their account;</w:t>
-      </w:r>
-    </w:p>
-    <w:p>
-      <w:pPr>
-        <w:numPr>
-          <w:ilvl w:val="1"/>
-          <w:numId w:val="1026"/>
-        </w:numPr>
-        <w:pStyle w:val="Compact"/>
-      </w:pPr>
+        <w:t xml:space="preserve">☐</w:t>
+      </w:r>
+      <w:r>
+        <w:t xml:space="preserve"> </w:t>
+      </w:r>
       <w:r>
         <w:rPr>
           <w:bCs/>
           <w:b/>
         </w:rPr>
-        <w:t xml:space="preserve">Active = Yes</w:t>
-      </w:r>
-      <w:r>
-        <w:t xml:space="preserve">;</w:t>
-      </w:r>
-    </w:p>
-    <w:p>
-      <w:pPr>
-        <w:numPr>
-          <w:ilvl w:val="1"/>
-          <w:numId w:val="1026"/>
-        </w:numPr>
-        <w:pStyle w:val="Compact"/>
-      </w:pPr>
-      <w:r>
-        <w:t xml:space="preserve">leave TechnicianAadId blank.</w:t>
-      </w:r>
-    </w:p>
-    <w:p>
-      <w:pPr>
-        <w:numPr>
-          <w:ilvl w:val="0"/>
-          <w:numId w:val="1025"/>
-        </w:numPr>
-        <w:pStyle w:val="Compact"/>
-      </w:pPr>
-      <w:r>
-        <w:t xml:space="preserve">☐</w:t>
+        <w:t xml:space="preserve">Technicians list → + New</w:t>
+      </w:r>
+      <w:r>
+        <w:t xml:space="preserve"> </w:t>
+      </w:r>
+      <w:r>
+        <w:t xml:space="preserve">for</w:t>
       </w:r>
       <w:r>
         <w:t xml:space="preserve"> </w:t>
@@ -4878,149 +4912,23 @@
           <w:bCs/>
           <w:b/>
         </w:rPr>
-        <w:t xml:space="preserve">Site permissions →</w:t>
+        <w:t xml:space="preserve">Test A</w:t>
+      </w:r>
+      <w:r>
+        <w:t xml:space="preserve">, then again for</w:t>
+      </w:r>
+      <w:r>
+        <w:t xml:space="preserve"> </w:t>
       </w:r>
       <w:r>
         <w:rPr>
           <w:bCs/>
           <w:b/>
         </w:rPr>
-        <w:t xml:space="preserve"> </w:t>
-      </w:r>
-      <w:r>
-        <w:rPr>
-          <w:rStyle w:val="VerbatimChar"/>
-          <w:bCs/>
-          <w:b/>
-        </w:rPr>
-        <w:t xml:space="preserve">1-to-1 Technicians</w:t>
-      </w:r>
-      <w:r>
-        <w:rPr>
-          <w:bCs/>
-          <w:b/>
-        </w:rPr>
-        <w:t xml:space="preserve"> </w:t>
-      </w:r>
-      <w:r>
-        <w:rPr>
-          <w:bCs/>
-          <w:b/>
-        </w:rPr>
-        <w:t xml:space="preserve">→ New → Add users:</w:t>
-      </w:r>
-      <w:r>
-        <w:t xml:space="preserve"> </w:t>
-      </w:r>
-      <w:r>
-        <w:t xml:space="preserve">Test A and Test B.</w:t>
-      </w:r>
-      <w:r>
-        <w:t xml:space="preserve"> </w:t>
-      </w:r>
-      <w:r>
-        <w:rPr>
-          <w:bCs/>
-          <w:b/>
-        </w:rPr>
-        <w:t xml:space="preserve">Untick "Send an email invitation".</w:t>
-      </w:r>
-    </w:p>
-    <w:p>
-      <w:pPr>
-        <w:numPr>
-          <w:ilvl w:val="0"/>
-          <w:numId w:val="1025"/>
-        </w:numPr>
-        <w:pStyle w:val="Compact"/>
-      </w:pPr>
-      <w:r>
-        <w:t xml:space="preserve">☐</w:t>
-      </w:r>
-      <w:r>
-        <w:t xml:space="preserve"> </w:t>
-      </w:r>
-      <w:r>
-        <w:rPr>
-          <w:bCs/>
-          <w:b/>
-        </w:rPr>
-        <w:t xml:space="preserve">⚙ Settings:</w:t>
-      </w:r>
-      <w:r>
-        <w:t xml:space="preserve"> </w:t>
-      </w:r>
-      <w:r>
-        <w:t xml:space="preserve">give each an appraisal date. Use a summer date, e.g.</w:t>
-      </w:r>
-      <w:r>
-        <w:t xml:space="preserve"> </w:t>
-      </w:r>
-      <w:r>
-        <w:rPr>
-          <w:rStyle w:val="VerbatimChar"/>
-        </w:rPr>
-        <w:t xml:space="preserve">15-Jul-2027</w:t>
-      </w:r>
-      <w:r>
-        <w:t xml:space="preserve">. Save, reopen, and check it</w:t>
-      </w:r>
-      <w:r>
-        <w:t xml:space="preserve"> </w:t>
-      </w:r>
-      <w:r>
-        <w:rPr>
-          <w:bCs/>
-          <w:b/>
-        </w:rPr>
-        <w:t xml:space="preserve">still shows the same day</w:t>
-      </w:r>
-      <w:r>
-        <w:t xml:space="preserve"> </w:t>
-      </w:r>
-      <w:r>
-        <w:t xml:space="preserve">(tests F27 and R16).</w:t>
-      </w:r>
-    </w:p>
-    <w:p>
-      <w:pPr>
-        <w:numPr>
-          <w:ilvl w:val="0"/>
-          <w:numId w:val="1025"/>
-        </w:numPr>
-        <w:pStyle w:val="Compact"/>
-      </w:pPr>
-      <w:r>
-        <w:t xml:space="preserve">☐</w:t>
-      </w:r>
-      <w:r>
-        <w:t xml:space="preserve"> </w:t>
-      </w:r>
-      <w:r>
-        <w:rPr>
-          <w:bCs/>
-          <w:b/>
-        </w:rPr>
-        <w:t xml:space="preserve">Power Automate → Flow 1 → Run.</w:t>
-      </w:r>
-      <w:r>
-        <w:t xml:space="preserve"> </w:t>
-      </w:r>
-      <w:r>
-        <w:t xml:space="preserve">Test A and Test B each get</w:t>
-      </w:r>
-      <w:r>
-        <w:t xml:space="preserve"> </w:t>
-      </w:r>
-      <w:r>
-        <w:rPr>
-          <w:iCs/>
-          <w:i/>
-        </w:rPr>
-        <w:t xml:space="preserve">"Your 1-to-1 for … is ready"</w:t>
-      </w:r>
-      <w:r>
-        <w:t xml:space="preserve">.</w:t>
+        <w:t xml:space="preserve">Test B</w:t>
+      </w:r>
+      <w:r>
+        <w:t xml:space="preserve">:</w:t>
       </w:r>
     </w:p>
     <w:p>
@@ -5032,28 +4940,61 @@
         <w:pStyle w:val="Compact"/>
       </w:pPr>
       <w:r>
+        <w:t xml:space="preserve">Title = name;</w:t>
+      </w:r>
+    </w:p>
+    <w:p>
+      <w:pPr>
+        <w:numPr>
+          <w:ilvl w:val="1"/>
+          <w:numId w:val="1027"/>
+        </w:numPr>
+        <w:pStyle w:val="Compact"/>
+      </w:pPr>
+      <w:r>
+        <w:t xml:space="preserve">Technician = their account;</w:t>
+      </w:r>
+    </w:p>
+    <w:p>
+      <w:pPr>
+        <w:numPr>
+          <w:ilvl w:val="1"/>
+          <w:numId w:val="1027"/>
+        </w:numPr>
+        <w:pStyle w:val="Compact"/>
+      </w:pPr>
+      <w:r>
         <w:rPr>
           <w:bCs/>
           <w:b/>
         </w:rPr>
-        <w:t xml:space="preserve">Run it again:</w:t>
-      </w:r>
-      <w:r>
-        <w:t xml:space="preserve"> </w:t>
-      </w:r>
-      <w:r>
-        <w:t xml:space="preserve">no new items, no second email.</w:t>
+        <w:t xml:space="preserve">Active = Yes</w:t>
+      </w:r>
+      <w:r>
+        <w:t xml:space="preserve">;</w:t>
       </w:r>
     </w:p>
     <w:p>
       <w:pPr>
         <w:numPr>
-          <w:ilvl w:val="0"/>
-          <w:numId w:val="1025"/>
+          <w:ilvl w:val="1"/>
+          <w:numId w:val="1027"/>
         </w:numPr>
         <w:pStyle w:val="Compact"/>
       </w:pPr>
       <w:r>
+        <w:t xml:space="preserve">leave TechnicianAadId blank.</w:t>
+      </w:r>
+    </w:p>
+    <w:p>
+      <w:pPr>
+        <w:numPr>
+          <w:ilvl w:val="0"/>
+          <w:numId w:val="1026"/>
+        </w:numPr>
+        <w:pStyle w:val="Compact"/>
+      </w:pPr>
+      <w:r>
         <w:t xml:space="preserve">☐</w:t>
       </w:r>
       <w:r>
@@ -5064,20 +5005,59 @@
           <w:bCs/>
           <w:b/>
         </w:rPr>
-        <w:t xml:space="preserve">As you:</w:t>
-      </w:r>
-      <w:r>
-        <w:t xml:space="preserve"> </w:t>
-      </w:r>
-      <w:r>
-        <w:t xml:space="preserve">Team overview lists Test A and Test B.</w:t>
+        <w:t xml:space="preserve">Site permissions →</w:t>
+      </w:r>
+      <w:r>
+        <w:rPr>
+          <w:bCs/>
+          <w:b/>
+        </w:rPr>
+        <w:t xml:space="preserve"> </w:t>
+      </w:r>
+      <w:r>
+        <w:rPr>
+          <w:rStyle w:val="VerbatimChar"/>
+          <w:bCs/>
+          <w:b/>
+        </w:rPr>
+        <w:t xml:space="preserve">1-to-1 Technicians</w:t>
+      </w:r>
+      <w:r>
+        <w:rPr>
+          <w:bCs/>
+          <w:b/>
+        </w:rPr>
+        <w:t xml:space="preserve"> </w:t>
+      </w:r>
+      <w:r>
+        <w:rPr>
+          <w:bCs/>
+          <w:b/>
+        </w:rPr>
+        <w:t xml:space="preserve">→ New → Add users:</w:t>
+      </w:r>
+      <w:r>
+        <w:t xml:space="preserve"> </w:t>
+      </w:r>
+      <w:r>
+        <w:t xml:space="preserve">Test A and Test B.</w:t>
+      </w:r>
+      <w:r>
+        <w:t xml:space="preserve"> </w:t>
+      </w:r>
+      <w:r>
+        <w:rPr>
+          <w:bCs/>
+          <w:b/>
+        </w:rPr>
+        <w:t xml:space="preserve">Untick "Send an email invitation".</w:t>
       </w:r>
     </w:p>
     <w:p>
       <w:pPr>
         <w:numPr>
           <w:ilvl w:val="0"/>
-          <w:numId w:val="1025"/>
+          <w:numId w:val="1026"/>
         </w:numPr>
         <w:pStyle w:val="Compact"/>
       </w:pPr>
@@ -5092,13 +5072,183 @@
           <w:bCs/>
           <w:b/>
         </w:rPr>
-        <w:t xml:space="preserve">As Test A</w:t>
-      </w:r>
-      <w:r>
-        <w:t xml:space="preserve"> </w:t>
-      </w:r>
-      <w:r>
-        <w:t xml:space="preserve">(InPrivate window):</w:t>
+        <w:t xml:space="preserve">Reload the page.</w:t>
+      </w:r>
+      <w:r>
+        <w:t xml:space="preserve"> </w:t>
+      </w:r>
+      <w:r>
+        <w:t xml:space="preserve">The top bar shows</w:t>
+      </w:r>
+      <w:r>
+        <w:t xml:space="preserve"> </w:t>
+      </w:r>
+      <w:r>
+        <w:rPr>
+          <w:bCs/>
+          <w:b/>
+        </w:rPr>
+        <w:t xml:space="preserve">Team (2) ▾</w:t>
+      </w:r>
+      <w:r>
+        <w:t xml:space="preserve">, and opening it lists Test A and Test B.</w:t>
+      </w:r>
+    </w:p>
+    <w:p>
+      <w:pPr>
+        <w:numPr>
+          <w:ilvl w:val="0"/>
+          <w:numId w:val="1026"/>
+        </w:numPr>
+        <w:pStyle w:val="Compact"/>
+      </w:pPr>
+      <w:r>
+        <w:t xml:space="preserve">☐</w:t>
+      </w:r>
+      <w:r>
+        <w:t xml:space="preserve"> </w:t>
+      </w:r>
+      <w:r>
+        <w:rPr>
+          <w:bCs/>
+          <w:b/>
+        </w:rPr>
+        <w:t xml:space="preserve">⚙ Settings:</w:t>
+      </w:r>
+      <w:r>
+        <w:t xml:space="preserve"> </w:t>
+      </w:r>
+      <w:r>
+        <w:t xml:space="preserve">give each an appraisal date. Use a summer date, e.g.</w:t>
+      </w:r>
+      <w:r>
+        <w:t xml:space="preserve"> </w:t>
+      </w:r>
+      <w:r>
+        <w:rPr>
+          <w:rStyle w:val="VerbatimChar"/>
+        </w:rPr>
+        <w:t xml:space="preserve">15-Jul-2027</w:t>
+      </w:r>
+      <w:r>
+        <w:t xml:space="preserve">. Save, reopen, and check it</w:t>
+      </w:r>
+      <w:r>
+        <w:t xml:space="preserve"> </w:t>
+      </w:r>
+      <w:r>
+        <w:rPr>
+          <w:bCs/>
+          <w:b/>
+        </w:rPr>
+        <w:t xml:space="preserve">still shows the same day</w:t>
+      </w:r>
+      <w:r>
+        <w:t xml:space="preserve"> </w:t>
+      </w:r>
+      <w:r>
+        <w:t xml:space="preserve">(tests F27 and R16).</w:t>
+      </w:r>
+    </w:p>
+    <w:p>
+      <w:pPr>
+        <w:numPr>
+          <w:ilvl w:val="0"/>
+          <w:numId w:val="1026"/>
+        </w:numPr>
+        <w:pStyle w:val="Compact"/>
+      </w:pPr>
+      <w:r>
+        <w:t xml:space="preserve">☐</w:t>
+      </w:r>
+      <w:r>
+        <w:t xml:space="preserve"> </w:t>
+      </w:r>
+      <w:r>
+        <w:rPr>
+          <w:bCs/>
+          <w:b/>
+        </w:rPr>
+        <w:t xml:space="preserve">Expectations:</w:t>
+      </w:r>
+      <w:r>
+        <w:t xml:space="preserve"> </w:t>
+      </w:r>
+      <w:r>
+        <w:t xml:space="preserve">add one</w:t>
+      </w:r>
+      <w:r>
+        <w:t xml:space="preserve"> </w:t>
+      </w:r>
+      <w:r>
+        <w:rPr>
+          <w:bCs/>
+          <w:b/>
+        </w:rPr>
+        <w:t xml:space="preserve">Individual</w:t>
+      </w:r>
+      <w:r>
+        <w:t xml:space="preserve"> </w:t>
+      </w:r>
+      <w:r>
+        <w:t xml:space="preserve">expectation for Test A. This proves the Person column works;</w:t>
+      </w:r>
+      <w:r>
+        <w:t xml:space="preserve"> </w:t>
+      </w:r>
+      <w:r>
+        <w:rPr>
+          <w:iCs/>
+          <w:i/>
+        </w:rPr>
+        <w:t xml:space="preserve">Expectations per technician</w:t>
+      </w:r>
+      <w:r>
+        <w:t xml:space="preserve"> </w:t>
+      </w:r>
+      <w:r>
+        <w:t xml:space="preserve">shows Test A with one more than Test B.</w:t>
+      </w:r>
+    </w:p>
+    <w:p>
+      <w:pPr>
+        <w:numPr>
+          <w:ilvl w:val="0"/>
+          <w:numId w:val="1026"/>
+        </w:numPr>
+        <w:pStyle w:val="Compact"/>
+      </w:pPr>
+      <w:r>
+        <w:t xml:space="preserve">☐</w:t>
+      </w:r>
+      <w:r>
+        <w:t xml:space="preserve"> </w:t>
+      </w:r>
+      <w:r>
+        <w:rPr>
+          <w:bCs/>
+          <w:b/>
+        </w:rPr>
+        <w:t xml:space="preserve">Power Automate → Flow 1 → Run.</w:t>
+      </w:r>
+      <w:r>
+        <w:t xml:space="preserve"> </w:t>
+      </w:r>
+      <w:r>
+        <w:t xml:space="preserve">Test A and Test B each get</w:t>
+      </w:r>
+      <w:r>
+        <w:t xml:space="preserve"> </w:t>
+      </w:r>
+      <w:r>
+        <w:rPr>
+          <w:iCs/>
+          <w:i/>
+        </w:rPr>
+        <w:t xml:space="preserve">"Your 1-to-1 for … is ready"</w:t>
+      </w:r>
+      <w:r>
+        <w:t xml:space="preserve">.</w:t>
       </w:r>
     </w:p>
     <w:p>
@@ -5110,35 +5260,29 @@
         <w:pStyle w:val="Compact"/>
       </w:pPr>
       <w:r>
-        <w:t xml:space="preserve">Open the email link. Their form opens, with only</w:t>
-      </w:r>
-      <w:r>
-        <w:t xml:space="preserve"> </w:t>
-      </w:r>
-      <w:r>
-        <w:rPr>
-          <w:iCs/>
-          <w:i/>
-        </w:rPr>
-        <w:t xml:space="preserve">This month · My appraisal · Appraisal report</w:t>
-      </w:r>
-      <w:r>
-        <w:t xml:space="preserve"> </w:t>
-      </w:r>
-      <w:r>
-        <w:t xml:space="preserve">in the top menu bar.</w:t>
+        <w:rPr>
+          <w:bCs/>
+          <w:b/>
+        </w:rPr>
+        <w:t xml:space="preserve">Run it again:</w:t>
+      </w:r>
+      <w:r>
+        <w:t xml:space="preserve"> </w:t>
+      </w:r>
+      <w:r>
+        <w:t xml:space="preserve">no new items, no second email.</w:t>
       </w:r>
     </w:p>
     <w:p>
       <w:pPr>
         <w:numPr>
-          <w:ilvl w:val="1"/>
-          <w:numId w:val="1028"/>
+          <w:ilvl w:val="0"/>
+          <w:numId w:val="1026"/>
         </w:numPr>
         <w:pStyle w:val="Compact"/>
       </w:pPr>
       <w:r>
-        <w:t xml:space="preserve">Fill in a few answers →</w:t>
+        <w:t xml:space="preserve">☐</w:t>
       </w:r>
       <w:r>
         <w:t xml:space="preserve"> </w:t>
@@ -5148,25 +5292,25 @@
           <w:bCs/>
           <w:b/>
         </w:rPr>
-        <w:t xml:space="preserve">Save</w:t>
-      </w:r>
-      <w:r>
-        <w:t xml:space="preserve"> </w:t>
-      </w:r>
-      <w:r>
-        <w:t xml:space="preserve">→ reload. The answers are kept.</w:t>
+        <w:t xml:space="preserve">As you:</w:t>
+      </w:r>
+      <w:r>
+        <w:t xml:space="preserve"> </w:t>
+      </w:r>
+      <w:r>
+        <w:t xml:space="preserve">Team overview lists Test A and Test B.</w:t>
       </w:r>
     </w:p>
     <w:p>
       <w:pPr>
         <w:numPr>
-          <w:ilvl w:val="1"/>
-          <w:numId w:val="1028"/>
+          <w:ilvl w:val="0"/>
+          <w:numId w:val="1026"/>
         </w:numPr>
         <w:pStyle w:val="Compact"/>
       </w:pPr>
       <w:r>
-        <w:t xml:space="preserve">Complete everything →</w:t>
+        <w:t xml:space="preserve">☐</w:t>
       </w:r>
       <w:r>
         <w:t xml:space="preserve"> </w:t>
@@ -5176,48 +5320,13 @@
           <w:bCs/>
           <w:b/>
         </w:rPr>
-        <w:t xml:space="preserve">Submit</w:t>
-      </w:r>
-      <w:r>
-        <w:t xml:space="preserve">. Within about 5 minutes the review becomes read-only.</w:t>
-      </w:r>
-    </w:p>
-    <w:p>
-      <w:pPr>
-        <w:numPr>
-          <w:ilvl w:val="0"/>
-          <w:numId w:val="1025"/>
-        </w:numPr>
-        <w:pStyle w:val="Compact"/>
-      </w:pPr>
-      <w:r>
-        <w:t xml:space="preserve">☐</w:t>
-      </w:r>
-      <w:r>
-        <w:t xml:space="preserve"> </w:t>
-      </w:r>
-      <w:r>
-        <w:rPr>
-          <w:bCs/>
-          <w:b/>
-        </w:rPr>
-        <w:t xml:space="preserve">As you:</w:t>
-      </w:r>
-      <w:r>
-        <w:t xml:space="preserve"> </w:t>
-      </w:r>
-      <w:r>
-        <w:rPr>
-          <w:iCs/>
-          <w:i/>
-        </w:rPr>
-        <w:t xml:space="preserve">"1-to-1 submitted"</w:t>
-      </w:r>
-      <w:r>
-        <w:t xml:space="preserve"> </w:t>
-      </w:r>
-      <w:r>
-        <w:t xml:space="preserve">arrives.</w:t>
+        <w:t xml:space="preserve">As Test A</w:t>
+      </w:r>
+      <w:r>
+        <w:t xml:space="preserve"> </w:t>
+      </w:r>
+      <w:r>
+        <w:t xml:space="preserve">(InPrivate window):</w:t>
       </w:r>
     </w:p>
     <w:p>
@@ -5229,7 +5338,20 @@
         <w:pStyle w:val="Compact"/>
       </w:pPr>
       <w:r>
-        <w:t xml:space="preserve">Open the review. Add feedback per question and a 1–5 rating per expectation.</w:t>
+        <w:t xml:space="preserve">Open the email link. Their form opens. The top menu bar has only</w:t>
+      </w:r>
+      <w:r>
+        <w:t xml:space="preserve"> </w:t>
+      </w:r>
+      <w:r>
+        <w:rPr>
+          <w:iCs/>
+          <w:i/>
+        </w:rPr>
+        <w:t xml:space="preserve">This month · My appraisal · Appraisal report</w:t>
+      </w:r>
+      <w:r>
+        <w:t xml:space="preserve">, with no Team menu or Settings.</w:t>
       </w:r>
     </w:p>
     <w:p>
@@ -5241,7 +5363,7 @@
         <w:pStyle w:val="Compact"/>
       </w:pPr>
       <w:r>
-        <w:t xml:space="preserve">Add</w:t>
+        <w:t xml:space="preserve">Fill in a few answers →</w:t>
       </w:r>
       <w:r>
         <w:t xml:space="preserve"> </w:t>
@@ -5251,10 +5373,13 @@
           <w:bCs/>
           <w:b/>
         </w:rPr>
-        <w:t xml:space="preserve">two actions</w:t>
-      </w:r>
-      <w:r>
-        <w:t xml:space="preserve">, each with owner, close-out criteria and deadline.</w:t>
+        <w:t xml:space="preserve">Save</w:t>
+      </w:r>
+      <w:r>
+        <w:t xml:space="preserve"> </w:t>
+      </w:r>
+      <w:r>
+        <w:t xml:space="preserve">→ reload. The answers are kept.</w:t>
       </w:r>
     </w:p>
     <w:p>
@@ -5266,7 +5391,7 @@
         <w:pStyle w:val="Compact"/>
       </w:pPr>
       <w:r>
-        <w:t xml:space="preserve">Click</w:t>
+        <w:t xml:space="preserve">Complete everything →</w:t>
       </w:r>
       <w:r>
         <w:t xml:space="preserve"> </w:t>
@@ -5276,17 +5401,17 @@
           <w:bCs/>
           <w:b/>
         </w:rPr>
-        <w:t xml:space="preserve">Complete &amp; release</w:t>
-      </w:r>
-      <w:r>
-        <w:t xml:space="preserve">.</w:t>
+        <w:t xml:space="preserve">Submit</w:t>
+      </w:r>
+      <w:r>
+        <w:t xml:space="preserve">. Within about 5 minutes the review becomes read-only.</w:t>
       </w:r>
     </w:p>
     <w:p>
       <w:pPr>
         <w:numPr>
           <w:ilvl w:val="0"/>
-          <w:numId w:val="1025"/>
+          <w:numId w:val="1026"/>
         </w:numPr>
         <w:pStyle w:val="Compact"/>
       </w:pPr>
@@ -5301,7 +5426,7 @@
           <w:bCs/>
           <w:b/>
         </w:rPr>
-        <w:t xml:space="preserve">As Test A:</w:t>
+        <w:t xml:space="preserve">As you:</w:t>
       </w:r>
       <w:r>
         <w:t xml:space="preserve"> </w:t>
@@ -5311,13 +5436,13 @@
           <w:iCs/>
           <w:i/>
         </w:rPr>
-        <w:t xml:space="preserve">"Feedback … is ready"</w:t>
-      </w:r>
-      <w:r>
-        <w:t xml:space="preserve"> </w:t>
-      </w:r>
-      <w:r>
-        <w:t xml:space="preserve">arrives. Feedback, ratings and actions are visible;</w:t>
+        <w:t xml:space="preserve">"1-to-1 submitted"</w:t>
+      </w:r>
+      <w:r>
+        <w:t xml:space="preserve"> </w:t>
+      </w:r>
+      <w:r>
+        <w:t xml:space="preserve">arrives. Monthly reviews shows a badge, and</w:t>
       </w:r>
       <w:r>
         <w:t xml:space="preserve"> </w:t>
@@ -5327,51 +5452,13 @@
           <w:bCs/>
           <w:b/>
         </w:rPr>
-        <w:t xml:space="preserve">My appraisal</w:t>
-      </w:r>
-      <w:r>
-        <w:t xml:space="preserve"> </w:t>
-      </w:r>
-      <w:r>
-        <w:t xml:space="preserve">and</w:t>
-      </w:r>
-      <w:r>
-        <w:t xml:space="preserve"> </w:t>
-      </w:r>
-      <w:r>
-        <w:rPr>
-          <w:bCs/>
-          <w:b/>
-        </w:rPr>
-        <w:t xml:space="preserve">Appraisal report</w:t>
-      </w:r>
-      <w:r>
-        <w:t xml:space="preserve"> </w:t>
-      </w:r>
-      <w:r>
-        <w:t xml:space="preserve">work.</w:t>
-      </w:r>
-    </w:p>
-    <w:p>
-      <w:pPr>
-        <w:numPr>
-          <w:ilvl w:val="0"/>
-          <w:numId w:val="1025"/>
-        </w:numPr>
-        <w:pStyle w:val="Compact"/>
-      </w:pPr>
-      <w:r>
-        <w:t xml:space="preserve">☐</w:t>
-      </w:r>
-      <w:r>
-        <w:t xml:space="preserve"> </w:t>
-      </w:r>
-      <w:r>
-        <w:rPr>
-          <w:bCs/>
-          <w:b/>
-        </w:rPr>
-        <w:t xml:space="preserve">As Test B:</w:t>
+        <w:t xml:space="preserve">Team ▾</w:t>
+      </w:r>
+      <w:r>
+        <w:t xml:space="preserve"> </w:t>
+      </w:r>
+      <w:r>
+        <w:t xml:space="preserve">shows a red dot next to Test A.</w:t>
       </w:r>
     </w:p>
     <w:p>
@@ -5383,7 +5470,7 @@
         <w:pStyle w:val="Compact"/>
       </w:pPr>
       <w:r>
-        <w:t xml:space="preserve">nothing of Test A's is visible anywhere;</w:t>
+        <w:t xml:space="preserve">Open the review. Add feedback per question and a 1–5 rating per expectation.</w:t>
       </w:r>
     </w:p>
     <w:p>
@@ -5395,6 +5482,217 @@
         <w:pStyle w:val="Compact"/>
       </w:pPr>
       <w:r>
+        <w:t xml:space="preserve">Add</w:t>
+      </w:r>
+      <w:r>
+        <w:t xml:space="preserve"> </w:t>
+      </w:r>
+      <w:r>
+        <w:rPr>
+          <w:bCs/>
+          <w:b/>
+        </w:rPr>
+        <w:t xml:space="preserve">two actions</w:t>
+      </w:r>
+      <w:r>
+        <w:t xml:space="preserve">, each with owner, close-out criteria and deadline.</w:t>
+      </w:r>
+    </w:p>
+    <w:p>
+      <w:pPr>
+        <w:numPr>
+          <w:ilvl w:val="1"/>
+          <w:numId w:val="1030"/>
+        </w:numPr>
+        <w:pStyle w:val="Compact"/>
+      </w:pPr>
+      <w:r>
+        <w:t xml:space="preserve">Click</w:t>
+      </w:r>
+      <w:r>
+        <w:t xml:space="preserve"> </w:t>
+      </w:r>
+      <w:r>
+        <w:rPr>
+          <w:bCs/>
+          <w:b/>
+        </w:rPr>
+        <w:t xml:space="preserve">Complete &amp; release</w:t>
+      </w:r>
+      <w:r>
+        <w:t xml:space="preserve">.</w:t>
+      </w:r>
+    </w:p>
+    <w:p>
+      <w:pPr>
+        <w:numPr>
+          <w:ilvl w:val="0"/>
+          <w:numId w:val="1026"/>
+        </w:numPr>
+        <w:pStyle w:val="Compact"/>
+      </w:pPr>
+      <w:r>
+        <w:t xml:space="preserve">☐</w:t>
+      </w:r>
+      <w:r>
+        <w:t xml:space="preserve"> </w:t>
+      </w:r>
+      <w:r>
+        <w:rPr>
+          <w:bCs/>
+          <w:b/>
+        </w:rPr>
+        <w:t xml:space="preserve">As you:</w:t>
+      </w:r>
+      <w:r>
+        <w:t xml:space="preserve"> </w:t>
+      </w:r>
+      <w:r>
+        <w:t xml:space="preserve">Team ▾ → Test A →</w:t>
+      </w:r>
+      <w:r>
+        <w:t xml:space="preserve"> </w:t>
+      </w:r>
+      <w:r>
+        <w:rPr>
+          <w:bCs/>
+          <w:b/>
+        </w:rPr>
+        <w:t xml:space="preserve">Generate appraisal report</w:t>
+      </w:r>
+      <w:r>
+        <w:t xml:space="preserve"> </w:t>
+      </w:r>
+      <w:r>
+        <w:t xml:space="preserve">→</w:t>
+      </w:r>
+      <w:r>
+        <w:t xml:space="preserve"> </w:t>
+      </w:r>
+      <w:r>
+        <w:rPr>
+          <w:bCs/>
+          <w:b/>
+        </w:rPr>
+        <w:t xml:space="preserve">Print / Save as PDF</w:t>
+      </w:r>
+      <w:r>
+        <w:t xml:space="preserve">. A print window opens. If not, allow pop-ups for the SharePoint site.</w:t>
+      </w:r>
+    </w:p>
+    <w:p>
+      <w:pPr>
+        <w:numPr>
+          <w:ilvl w:val="0"/>
+          <w:numId w:val="1026"/>
+        </w:numPr>
+        <w:pStyle w:val="Compact"/>
+      </w:pPr>
+      <w:r>
+        <w:t xml:space="preserve">☐</w:t>
+      </w:r>
+      <w:r>
+        <w:t xml:space="preserve"> </w:t>
+      </w:r>
+      <w:r>
+        <w:rPr>
+          <w:bCs/>
+          <w:b/>
+        </w:rPr>
+        <w:t xml:space="preserve">As Test A:</w:t>
+      </w:r>
+      <w:r>
+        <w:t xml:space="preserve"> </w:t>
+      </w:r>
+      <w:r>
+        <w:rPr>
+          <w:iCs/>
+          <w:i/>
+        </w:rPr>
+        <w:t xml:space="preserve">"Feedback … is ready"</w:t>
+      </w:r>
+      <w:r>
+        <w:t xml:space="preserve"> </w:t>
+      </w:r>
+      <w:r>
+        <w:t xml:space="preserve">arrives. Feedback, ratings and actions are visible;</w:t>
+      </w:r>
+      <w:r>
+        <w:t xml:space="preserve"> </w:t>
+      </w:r>
+      <w:r>
+        <w:rPr>
+          <w:bCs/>
+          <w:b/>
+        </w:rPr>
+        <w:t xml:space="preserve">My appraisal</w:t>
+      </w:r>
+      <w:r>
+        <w:t xml:space="preserve"> </w:t>
+      </w:r>
+      <w:r>
+        <w:t xml:space="preserve">and</w:t>
+      </w:r>
+      <w:r>
+        <w:t xml:space="preserve"> </w:t>
+      </w:r>
+      <w:r>
+        <w:rPr>
+          <w:bCs/>
+          <w:b/>
+        </w:rPr>
+        <w:t xml:space="preserve">Appraisal report</w:t>
+      </w:r>
+      <w:r>
+        <w:t xml:space="preserve"> </w:t>
+      </w:r>
+      <w:r>
+        <w:t xml:space="preserve">work.</w:t>
+      </w:r>
+    </w:p>
+    <w:p>
+      <w:pPr>
+        <w:numPr>
+          <w:ilvl w:val="0"/>
+          <w:numId w:val="1026"/>
+        </w:numPr>
+        <w:pStyle w:val="Compact"/>
+      </w:pPr>
+      <w:r>
+        <w:t xml:space="preserve">☐</w:t>
+      </w:r>
+      <w:r>
+        <w:t xml:space="preserve"> </w:t>
+      </w:r>
+      <w:r>
+        <w:rPr>
+          <w:bCs/>
+          <w:b/>
+        </w:rPr>
+        <w:t xml:space="preserve">As Test B:</w:t>
+      </w:r>
+    </w:p>
+    <w:p>
+      <w:pPr>
+        <w:numPr>
+          <w:ilvl w:val="1"/>
+          <w:numId w:val="1031"/>
+        </w:numPr>
+        <w:pStyle w:val="Compact"/>
+      </w:pPr>
+      <w:r>
+        <w:t xml:space="preserve">nothing of Test A's is visible anywhere;</w:t>
+      </w:r>
+    </w:p>
+    <w:p>
+      <w:pPr>
+        <w:numPr>
+          <w:ilvl w:val="1"/>
+          <w:numId w:val="1031"/>
+        </w:numPr>
+        <w:pStyle w:val="Compact"/>
+      </w:pPr>
+      <w:r>
         <w:t xml:space="preserve">opening Test A's link (</w:t>
       </w:r>
       <w:r>
@@ -5450,80 +5748,6 @@
           <w:b/>
         </w:rPr>
         <w:t xml:space="preserve">Pass mark:</w:t>
-      </w:r>
-    </w:p>
-    <w:p>
-      <w:pPr>
-        <w:numPr>
-          <w:ilvl w:val="0"/>
-          <w:numId w:val="1031"/>
-        </w:numPr>
-        <w:pStyle w:val="Compact"/>
-      </w:pPr>
-      <w:r>
-        <w:t xml:space="preserve">Every</w:t>
-      </w:r>
-      <w:r>
-        <w:t xml:space="preserve"> </w:t>
-      </w:r>
-      <w:r>
-        <w:rPr>
-          <w:bCs/>
-          <w:b/>
-        </w:rPr>
-        <w:t xml:space="preserve">P</w:t>
-      </w:r>
-      <w:r>
-        <w:t xml:space="preserve"> </w:t>
-      </w:r>
-      <w:r>
-        <w:t xml:space="preserve">test is mandatory: any failure</w:t>
-      </w:r>
-      <w:r>
-        <w:t xml:space="preserve"> </w:t>
-      </w:r>
-      <w:r>
-        <w:rPr>
-          <w:bCs/>
-          <w:b/>
-        </w:rPr>
-        <w:t xml:space="preserve">blocks go-live</w:t>
-      </w:r>
-      <w:r>
-        <w:t xml:space="preserve"> </w:t>
-      </w:r>
-      <w:r>
-        <w:t xml:space="preserve">until fixed (§11.3).</w:t>
-      </w:r>
-    </w:p>
-    <w:p>
-      <w:pPr>
-        <w:numPr>
-          <w:ilvl w:val="0"/>
-          <w:numId w:val="1031"/>
-        </w:numPr>
-        <w:pStyle w:val="Compact"/>
-      </w:pPr>
-      <w:r>
-        <w:t xml:space="preserve">F tests must pass too.</w:t>
-      </w:r>
-    </w:p>
-    <w:p>
-      <w:pPr>
-        <w:pStyle w:val="FirstParagraph"/>
-      </w:pPr>
-      <w:r>
-        <w:rPr>
-          <w:bCs/>
-          <w:b/>
-        </w:rPr>
-        <w:t xml:space="preserve">Test date.</w:t>
-      </w:r>
-      <w:r>
-        <w:t xml:space="preserve"> </w:t>
-      </w:r>
-      <w:r>
-        <w:t xml:space="preserve">Tests F13–F20 change the date Flow 1 believes it is:</w:t>
       </w:r>
     </w:p>
     <w:p>
@@ -5535,7 +5759,7 @@
         <w:pStyle w:val="Compact"/>
       </w:pPr>
       <w:r>
-        <w:t xml:space="preserve">Open Flow 1 →</w:t>
+        <w:t xml:space="preserve">Every</w:t>
       </w:r>
       <w:r>
         <w:t xml:space="preserve"> </w:t>
@@ -5545,13 +5769,13 @@
           <w:bCs/>
           <w:b/>
         </w:rPr>
-        <w:t xml:space="preserve">Edit</w:t>
-      </w:r>
-      <w:r>
-        <w:t xml:space="preserve"> </w:t>
-      </w:r>
-      <w:r>
-        <w:t xml:space="preserve">→</w:t>
+        <w:t xml:space="preserve">P</w:t>
+      </w:r>
+      <w:r>
+        <w:t xml:space="preserve"> </w:t>
+      </w:r>
+      <w:r>
+        <w:t xml:space="preserve">test is mandatory: any failure</w:t>
       </w:r>
       <w:r>
         <w:t xml:space="preserve"> </w:t>
@@ -5561,25 +5785,13 @@
           <w:bCs/>
           <w:b/>
         </w:rPr>
-        <w:t xml:space="preserve">Initialize varTestDate</w:t>
-      </w:r>
-      <w:r>
-        <w:t xml:space="preserve"> </w:t>
-      </w:r>
-      <w:r>
-        <w:t xml:space="preserve">→ set the value (e.g.</w:t>
-      </w:r>
-      <w:r>
-        <w:t xml:space="preserve"> </w:t>
-      </w:r>
-      <w:r>
-        <w:rPr>
-          <w:rStyle w:val="VerbatimChar"/>
-        </w:rPr>
-        <w:t xml:space="preserve">2026-11-20T07:00:00</w:t>
-      </w:r>
-      <w:r>
-        <w:t xml:space="preserve">).</w:t>
+        <w:t xml:space="preserve">blocks go-live</w:t>
+      </w:r>
+      <w:r>
+        <w:t xml:space="preserve"> </w:t>
+      </w:r>
+      <w:r>
+        <w:t xml:space="preserve">until fixed (§11.3).</w:t>
       </w:r>
     </w:p>
     <w:p>
@@ -5591,73 +5803,25 @@
         <w:pStyle w:val="Compact"/>
       </w:pPr>
       <w:r>
+        <w:t xml:space="preserve">F tests must pass too.</w:t>
+      </w:r>
+    </w:p>
+    <w:p>
+      <w:pPr>
+        <w:pStyle w:val="FirstParagraph"/>
+      </w:pPr>
+      <w:r>
         <w:rPr>
           <w:bCs/>
           <w:b/>
         </w:rPr>
-        <w:t xml:space="preserve">Save</w:t>
-      </w:r>
-      <w:r>
-        <w:t xml:space="preserve">, then</w:t>
-      </w:r>
-      <w:r>
-        <w:t xml:space="preserve"> </w:t>
-      </w:r>
-      <w:r>
-        <w:rPr>
-          <w:bCs/>
-          <w:b/>
-        </w:rPr>
-        <w:t xml:space="preserve">Run</w:t>
-      </w:r>
-      <w:r>
-        <w:t xml:space="preserve">.</w:t>
-      </w:r>
-    </w:p>
-    <w:p>
-      <w:pPr>
-        <w:numPr>
-          <w:ilvl w:val="0"/>
-          <w:numId w:val="1032"/>
-        </w:numPr>
-        <w:pStyle w:val="Compact"/>
-      </w:pPr>
-      <w:r>
-        <w:rPr>
-          <w:bCs/>
-          <w:b/>
-        </w:rPr>
-        <w:t xml:space="preserve">Clear the value afterwards and save.</w:t>
-      </w:r>
-    </w:p>
-    <w:p>
-      <w:pPr>
-        <w:pStyle w:val="FirstParagraph"/>
-      </w:pPr>
-      <w:r>
-        <w:rPr>
-          <w:bCs/>
-          <w:b/>
-        </w:rPr>
-        <w:t xml:space="preserve">How to record results.</w:t>
-      </w:r>
-      <w:r>
-        <w:t xml:space="preserve"> </w:t>
-      </w:r>
-      <w:r>
-        <w:t xml:space="preserve">For each test, record Pass or Fail, the date, the tester and a screenshot.</w:t>
-      </w:r>
-    </w:p>
-    <w:p>
-      <w:pPr>
-        <w:pStyle w:val="BodyText"/>
-      </w:pPr>
-      <w:r>
-        <w:rPr>
-          <w:bCs/>
-          <w:b/>
-        </w:rPr>
-        <w:t xml:space="preserve">How to run the P (privacy) tests</w:t>
+        <w:t xml:space="preserve">Test date.</w:t>
+      </w:r>
+      <w:r>
+        <w:t xml:space="preserve"> </w:t>
+      </w:r>
+      <w:r>
+        <w:t xml:space="preserve">Tests F13–F20 change the date Flow 1 believes it is:</w:t>
       </w:r>
     </w:p>
     <w:p>
@@ -5669,17 +5833,51 @@
         <w:pStyle w:val="Compact"/>
       </w:pPr>
       <w:r>
+        <w:t xml:space="preserve">Open Flow 1 →</w:t>
+      </w:r>
+      <w:r>
+        <w:t xml:space="preserve"> </w:t>
+      </w:r>
+      <w:r>
         <w:rPr>
           <w:bCs/>
           <w:b/>
         </w:rPr>
-        <w:t xml:space="preserve">Mandatory (release-blocking):</w:t>
-      </w:r>
-      <w:r>
-        <w:t xml:space="preserve"> </w:t>
-      </w:r>
-      <w:r>
-        <w:t xml:space="preserve">every F test, and every P test marked. Any failure stops progression.</w:t>
+        <w:t xml:space="preserve">Edit</w:t>
+      </w:r>
+      <w:r>
+        <w:t xml:space="preserve"> </w:t>
+      </w:r>
+      <w:r>
+        <w:t xml:space="preserve">→</w:t>
+      </w:r>
+      <w:r>
+        <w:t xml:space="preserve"> </w:t>
+      </w:r>
+      <w:r>
+        <w:rPr>
+          <w:bCs/>
+          <w:b/>
+        </w:rPr>
+        <w:t xml:space="preserve">Initialize varTestDate</w:t>
+      </w:r>
+      <w:r>
+        <w:t xml:space="preserve"> </w:t>
+      </w:r>
+      <w:r>
+        <w:t xml:space="preserve">→ set the value (e.g.</w:t>
+      </w:r>
+      <w:r>
+        <w:t xml:space="preserve"> </w:t>
+      </w:r>
+      <w:r>
+        <w:rPr>
+          <w:rStyle w:val="VerbatimChar"/>
+        </w:rPr>
+        <w:t xml:space="preserve">2026-11-20T07:00:00</w:t>
+      </w:r>
+      <w:r>
+        <w:t xml:space="preserve">).</w:t>
       </w:r>
     </w:p>
     <w:p>
@@ -5695,29 +5893,10 @@
           <w:bCs/>
           <w:b/>
         </w:rPr>
-        <w:t xml:space="preserve">Informational:</w:t>
-      </w:r>
-      <w:r>
-        <w:t xml:space="preserve"> </w:t>
-      </w:r>
-      <w:r>
-        <w:t xml:space="preserve">tests that record a fact rather than check a requirement, such as whether</w:t>
-      </w:r>
-      <w:r>
-        <w:t xml:space="preserve"> </w:t>
-      </w:r>
-      <w:r>
-        <w:rPr>
-          <w:iCs/>
-          <w:i/>
-        </w:rPr>
-        <w:t xml:space="preserve">Modified By</w:t>
-      </w:r>
-      <w:r>
-        <w:t xml:space="preserve"> </w:t>
-      </w:r>
-      <w:r>
-        <w:t xml:space="preserve">can be forged (P9, first part).</w:t>
+        <w:t xml:space="preserve">Save</w:t>
+      </w:r>
+      <w:r>
+        <w:t xml:space="preserve">, then</w:t>
       </w:r>
       <w:r>
         <w:t xml:space="preserve"> </w:t>
@@ -5727,13 +5906,10 @@
           <w:bCs/>
           <w:b/>
         </w:rPr>
-        <w:t xml:space="preserve">If an informational result reveals an exploitable weakness, it blocks progression just like a mandatory failure</w:t>
-      </w:r>
-      <w:r>
-        <w:t xml:space="preserve"> </w:t>
-      </w:r>
-      <w:r>
-        <w:t xml:space="preserve">until it's fixed, or formally accepted by the TL and recorded in J.3.</w:t>
+        <w:t xml:space="preserve">Run</w:t>
+      </w:r>
+      <w:r>
+        <w:t xml:space="preserve">.</w:t>
       </w:r>
     </w:p>
     <w:p>
@@ -5749,52 +5925,44 @@
           <w:bCs/>
           <w:b/>
         </w:rPr>
-        <w:t xml:space="preserve">Who runs what:</w:t>
-      </w:r>
-      <w:r>
-        <w:t xml:space="preserve"> </w:t>
-      </w:r>
-      <w:r>
-        <w:t xml:space="preserve">run each P test</w:t>
-      </w:r>
-      <w:r>
-        <w:t xml:space="preserve"> </w:t>
-      </w:r>
+        <w:t xml:space="preserve">Clear the value afterwards and save.</w:t>
+      </w:r>
+    </w:p>
+    <w:p>
+      <w:pPr>
+        <w:pStyle w:val="FirstParagraph"/>
+      </w:pPr>
       <w:r>
         <w:rPr>
           <w:bCs/>
           <w:b/>
         </w:rPr>
-        <w:t xml:space="preserve">first as the TL</w:t>
-      </w:r>
-      <w:r>
-        <w:t xml:space="preserve"> </w:t>
-      </w:r>
-      <w:r>
-        <w:t xml:space="preserve">(it should succeed, which proves the request is valid),</w:t>
-      </w:r>
-      <w:r>
-        <w:t xml:space="preserve"> </w:t>
-      </w:r>
+        <w:t xml:space="preserve">How to record results.</w:t>
+      </w:r>
+      <w:r>
+        <w:t xml:space="preserve"> </w:t>
+      </w:r>
+      <w:r>
+        <w:t xml:space="preserve">For each test, record Pass or Fail, the date, the tester and a screenshot.</w:t>
+      </w:r>
+    </w:p>
+    <w:p>
+      <w:pPr>
+        <w:pStyle w:val="BodyText"/>
+      </w:pPr>
       <w:r>
         <w:rPr>
           <w:bCs/>
           <w:b/>
         </w:rPr>
-        <w:t xml:space="preserve">then as Test A</w:t>
-      </w:r>
-      <w:r>
-        <w:t xml:space="preserve"> </w:t>
-      </w:r>
-      <w:r>
-        <w:t xml:space="preserve">(it must fail).</w:t>
+        <w:t xml:space="preserve">How to run the P (privacy) tests</w:t>
       </w:r>
     </w:p>
     <w:p>
       <w:pPr>
         <w:numPr>
           <w:ilvl w:val="0"/>
-          <w:numId w:val="1033"/>
+          <w:numId w:val="1034"/>
         </w:numPr>
         <w:pStyle w:val="Compact"/>
       </w:pPr>
@@ -5803,13 +5971,35 @@
           <w:bCs/>
           <w:b/>
         </w:rPr>
-        <w:t xml:space="preserve">API attempts:</w:t>
-      </w:r>
-      <w:r>
-        <w:t xml:space="preserve"> </w:t>
-      </w:r>
-      <w:r>
-        <w:t xml:space="preserve">each tester makes their own</w:t>
+        <w:t xml:space="preserve">Mandatory (release-blocking):</w:t>
+      </w:r>
+      <w:r>
+        <w:t xml:space="preserve"> </w:t>
+      </w:r>
+      <w:r>
+        <w:t xml:space="preserve">every F test, and every P test marked. Any failure stops progression.</w:t>
+      </w:r>
+    </w:p>
+    <w:p>
+      <w:pPr>
+        <w:numPr>
+          <w:ilvl w:val="0"/>
+          <w:numId w:val="1034"/>
+        </w:numPr>
+        <w:pStyle w:val="Compact"/>
+      </w:pPr>
+      <w:r>
+        <w:rPr>
+          <w:bCs/>
+          <w:b/>
+        </w:rPr>
+        <w:t xml:space="preserve">Informational:</w:t>
+      </w:r>
+      <w:r>
+        <w:t xml:space="preserve"> </w:t>
+      </w:r>
+      <w:r>
+        <w:t xml:space="preserve">tests that record a fact rather than check a requirement, such as whether</w:t>
       </w:r>
       <w:r>
         <w:t xml:space="preserve"> </w:t>
@@ -5819,28 +6009,13 @@
           <w:iCs/>
           <w:i/>
         </w:rPr>
-        <w:t xml:space="preserve">Instant</w:t>
-      </w:r>
-      <w:r>
-        <w:t xml:space="preserve"> </w:t>
-      </w:r>
-      <w:r>
-        <w:t xml:space="preserve">flow named</w:t>
-      </w:r>
-      <w:r>
-        <w:t xml:space="preserve"> </w:t>
-      </w:r>
-      <w:r>
-        <w:rPr>
-          <w:rStyle w:val="VerbatimChar"/>
-        </w:rPr>
-        <w:t xml:space="preserve">Privacy test</w:t>
-      </w:r>
-      <w:r>
-        <w:t xml:space="preserve"> </w:t>
-      </w:r>
-      <w:r>
-        <w:t xml:space="preserve">with</w:t>
+        <w:t xml:space="preserve">Modified By</w:t>
+      </w:r>
+      <w:r>
+        <w:t xml:space="preserve"> </w:t>
+      </w:r>
+      <w:r>
+        <w:t xml:space="preserve">can be forged (P9, first part).</w:t>
       </w:r>
       <w:r>
         <w:t xml:space="preserve"> </w:t>
@@ -5850,29 +6025,35 @@
           <w:bCs/>
           <w:b/>
         </w:rPr>
-        <w:t xml:space="preserve">Manually trigger a flow</w:t>
-      </w:r>
-      <w:r>
-        <w:t xml:space="preserve"> </w:t>
-      </w:r>
-      <w:r>
-        <w:t xml:space="preserve">and one</w:t>
-      </w:r>
-      <w:r>
-        <w:t xml:space="preserve"> </w:t>
-      </w:r>
+        <w:t xml:space="preserve">If an informational result reveals an exploitable weakness, it blocks progression just like a mandatory failure</w:t>
+      </w:r>
+      <w:r>
+        <w:t xml:space="preserve"> </w:t>
+      </w:r>
+      <w:r>
+        <w:t xml:space="preserve">until it's fixed, or formally accepted by the TL and recorded in J.3.</w:t>
+      </w:r>
+    </w:p>
+    <w:p>
+      <w:pPr>
+        <w:numPr>
+          <w:ilvl w:val="0"/>
+          <w:numId w:val="1034"/>
+        </w:numPr>
+        <w:pStyle w:val="Compact"/>
+      </w:pPr>
       <w:r>
         <w:rPr>
           <w:bCs/>
           <w:b/>
         </w:rPr>
-        <w:t xml:space="preserve">Send an HTTP request to SharePoint</w:t>
-      </w:r>
-      <w:r>
-        <w:t xml:space="preserve"> </w:t>
-      </w:r>
-      <w:r>
-        <w:t xml:space="preserve">action. Under Site Address choose</w:t>
+        <w:t xml:space="preserve">Who runs what:</w:t>
+      </w:r>
+      <w:r>
+        <w:t xml:space="preserve"> </w:t>
+      </w:r>
+      <w:r>
+        <w:t xml:space="preserve">run each P test</w:t>
       </w:r>
       <w:r>
         <w:t xml:space="preserve"> </w:t>
@@ -5882,13 +6063,13 @@
           <w:bCs/>
           <w:b/>
         </w:rPr>
-        <w:t xml:space="preserve">Enter custom value</w:t>
-      </w:r>
-      <w:r>
-        <w:t xml:space="preserve"> </w:t>
-      </w:r>
-      <w:r>
-        <w:t xml:space="preserve">and paste the site URL. Change the Method, Uri and Body for each test and run it with</w:t>
+        <w:t xml:space="preserve">first as the TL</w:t>
+      </w:r>
+      <w:r>
+        <w:t xml:space="preserve"> </w:t>
+      </w:r>
+      <w:r>
+        <w:t xml:space="preserve">(it should succeed, which proves the request is valid),</w:t>
       </w:r>
       <w:r>
         <w:t xml:space="preserve"> </w:t>
@@ -5898,17 +6079,20 @@
           <w:bCs/>
           <w:b/>
         </w:rPr>
-        <w:t xml:space="preserve">Test</w:t>
-      </w:r>
-      <w:r>
-        <w:t xml:space="preserve">.</w:t>
+        <w:t xml:space="preserve">then as Test A</w:t>
+      </w:r>
+      <w:r>
+        <w:t xml:space="preserve"> </w:t>
+      </w:r>
+      <w:r>
+        <w:t xml:space="preserve">(it must fail).</w:t>
       </w:r>
     </w:p>
     <w:p>
       <w:pPr>
         <w:numPr>
           <w:ilvl w:val="0"/>
-          <w:numId w:val="1033"/>
+          <w:numId w:val="1034"/>
         </w:numPr>
         <w:pStyle w:val="Compact"/>
       </w:pPr>
@@ -5917,13 +6101,44 @@
           <w:bCs/>
           <w:b/>
         </w:rPr>
-        <w:t xml:space="preserve">What counts as denied:</w:t>
-      </w:r>
-      <w:r>
-        <w:t xml:space="preserve"> </w:t>
-      </w:r>
-      <w:r>
-        <w:t xml:space="preserve">status 401, 403 or 404, or a response in which each field reports an error.</w:t>
+        <w:t xml:space="preserve">API attempts:</w:t>
+      </w:r>
+      <w:r>
+        <w:t xml:space="preserve"> </w:t>
+      </w:r>
+      <w:r>
+        <w:t xml:space="preserve">each tester makes their own</w:t>
+      </w:r>
+      <w:r>
+        <w:t xml:space="preserve"> </w:t>
+      </w:r>
+      <w:r>
+        <w:rPr>
+          <w:iCs/>
+          <w:i/>
+        </w:rPr>
+        <w:t xml:space="preserve">Instant</w:t>
+      </w:r>
+      <w:r>
+        <w:t xml:space="preserve"> </w:t>
+      </w:r>
+      <w:r>
+        <w:t xml:space="preserve">flow named</w:t>
+      </w:r>
+      <w:r>
+        <w:t xml:space="preserve"> </w:t>
+      </w:r>
+      <w:r>
+        <w:rPr>
+          <w:rStyle w:val="VerbatimChar"/>
+        </w:rPr>
+        <w:t xml:space="preserve">Privacy test</w:t>
+      </w:r>
+      <w:r>
+        <w:t xml:space="preserve"> </w:t>
+      </w:r>
+      <w:r>
+        <w:t xml:space="preserve">with</w:t>
       </w:r>
       <w:r>
         <w:t xml:space="preserve"> </w:t>
@@ -5933,14 +6148,97 @@
           <w:bCs/>
           <w:b/>
         </w:rPr>
-        <w:t xml:space="preserve">Always confirm in the list that nothing changed.</w:t>
+        <w:t xml:space="preserve">Manually trigger a flow</w:t>
+      </w:r>
+      <w:r>
+        <w:t xml:space="preserve"> </w:t>
+      </w:r>
+      <w:r>
+        <w:t xml:space="preserve">and one</w:t>
+      </w:r>
+      <w:r>
+        <w:t xml:space="preserve"> </w:t>
+      </w:r>
+      <w:r>
+        <w:rPr>
+          <w:bCs/>
+          <w:b/>
+        </w:rPr>
+        <w:t xml:space="preserve">Send an HTTP request to SharePoint</w:t>
+      </w:r>
+      <w:r>
+        <w:t xml:space="preserve"> </w:t>
+      </w:r>
+      <w:r>
+        <w:t xml:space="preserve">action. Under Site Address choose</w:t>
+      </w:r>
+      <w:r>
+        <w:t xml:space="preserve"> </w:t>
+      </w:r>
+      <w:r>
+        <w:rPr>
+          <w:bCs/>
+          <w:b/>
+        </w:rPr>
+        <w:t xml:space="preserve">Enter custom value</w:t>
+      </w:r>
+      <w:r>
+        <w:t xml:space="preserve"> </w:t>
+      </w:r>
+      <w:r>
+        <w:t xml:space="preserve">and paste the site URL. Change the Method, Uri and Body for each test and run it with</w:t>
+      </w:r>
+      <w:r>
+        <w:t xml:space="preserve"> </w:t>
+      </w:r>
+      <w:r>
+        <w:rPr>
+          <w:bCs/>
+          <w:b/>
+        </w:rPr>
+        <w:t xml:space="preserve">Test</w:t>
+      </w:r>
+      <w:r>
+        <w:t xml:space="preserve">.</w:t>
       </w:r>
     </w:p>
     <w:p>
       <w:pPr>
         <w:numPr>
           <w:ilvl w:val="0"/>
-          <w:numId w:val="1033"/>
+          <w:numId w:val="1034"/>
+        </w:numPr>
+        <w:pStyle w:val="Compact"/>
+      </w:pPr>
+      <w:r>
+        <w:rPr>
+          <w:bCs/>
+          <w:b/>
+        </w:rPr>
+        <w:t xml:space="preserve">What counts as denied:</w:t>
+      </w:r>
+      <w:r>
+        <w:t xml:space="preserve"> </w:t>
+      </w:r>
+      <w:r>
+        <w:t xml:space="preserve">status 401, 403 or 404, or a response in which each field reports an error.</w:t>
+      </w:r>
+      <w:r>
+        <w:t xml:space="preserve"> </w:t>
+      </w:r>
+      <w:r>
+        <w:rPr>
+          <w:bCs/>
+          <w:b/>
+        </w:rPr>
+        <w:t xml:space="preserve">Always confirm in the list that nothing changed.</w:t>
+      </w:r>
+    </w:p>
+    <w:p>
+      <w:pPr>
+        <w:numPr>
+          <w:ilvl w:val="0"/>
+          <w:numId w:val="1034"/>
         </w:numPr>
         <w:pStyle w:val="Compact"/>
       </w:pPr>
@@ -8047,7 +8345,33 @@
               <w:rPr>
                 <w:sz w:val="18"/>
               </w:rPr>
-              <w:t xml:space="preserve">. The Team overview tile counts it and the team list flags A. A TL override replaces it.</w:t>
+              <w:t xml:space="preserve">. The Team overview tile counts it and the</w:t>
+            </w:r>
+            <w:r>
+              <w:rPr>
+                <w:sz w:val="18"/>
+              </w:rPr>
+              <w:t xml:space="preserve"> </w:t>
+            </w:r>
+            <w:r>
+              <w:rPr>
+                <w:bCs/>
+                <w:b/>
+                <w:sz w:val="18"/>
+              </w:rPr>
+              <w:t xml:space="preserve">Team ▾</w:t>
+            </w:r>
+            <w:r>
+              <w:rPr>
+                <w:sz w:val="18"/>
+              </w:rPr>
+              <w:t xml:space="preserve"> </w:t>
+            </w:r>
+            <w:r>
+              <w:rPr>
+                <w:sz w:val="18"/>
+              </w:rPr>
+              <w:t xml:space="preserve">menu flags A with a red dot. A TL override replaces it.</w:t>
             </w:r>
           </w:p>
         </w:tc>
@@ -13514,7 +13838,7 @@
       <w:pPr>
         <w:numPr>
           <w:ilvl w:val="0"/>
-          <w:numId w:val="1034"/>
+          <w:numId w:val="1035"/>
         </w:numPr>
         <w:pStyle w:val="Compact"/>
       </w:pPr>
@@ -13536,159 +13860,6 @@
       </w:r>
       <w:r>
         <w:t xml:space="preserve">in Monthly Reviews and Manager Reviews, and the test expectations.</w:t>
-      </w:r>
-    </w:p>
-    <w:p>
-      <w:pPr>
-        <w:numPr>
-          <w:ilvl w:val="0"/>
-          <w:numId w:val="1034"/>
-        </w:numPr>
-        <w:pStyle w:val="Compact"/>
-      </w:pPr>
-      <w:r>
-        <w:t xml:space="preserve">☐ Empty the</w:t>
-      </w:r>
-      <w:r>
-        <w:t xml:space="preserve"> </w:t>
-      </w:r>
-      <w:r>
-        <w:rPr>
-          <w:bCs/>
-          <w:b/>
-        </w:rPr>
-        <w:t xml:space="preserve">site recycle bin</w:t>
-      </w:r>
-      <w:r>
-        <w:t xml:space="preserve">, then the</w:t>
-      </w:r>
-      <w:r>
-        <w:t xml:space="preserve"> </w:t>
-      </w:r>
-      <w:r>
-        <w:rPr>
-          <w:bCs/>
-          <w:b/>
-        </w:rPr>
-        <w:t xml:space="preserve">second-stage recycle bin</w:t>
-      </w:r>
-      <w:r>
-        <w:t xml:space="preserve">.</w:t>
-      </w:r>
-    </w:p>
-    <w:p>
-      <w:pPr>
-        <w:numPr>
-          <w:ilvl w:val="0"/>
-          <w:numId w:val="1034"/>
-        </w:numPr>
-        <w:pStyle w:val="Compact"/>
-      </w:pPr>
-      <w:r>
-        <w:t xml:space="preserve">☐ Remove Test A and Test B from the</w:t>
-      </w:r>
-      <w:r>
-        <w:t xml:space="preserve"> </w:t>
-      </w:r>
-      <w:r>
-        <w:rPr>
-          <w:bCs/>
-          <w:b/>
-        </w:rPr>
-        <w:t xml:space="preserve">Technicians</w:t>
-      </w:r>
-      <w:r>
-        <w:t xml:space="preserve"> </w:t>
-      </w:r>
-      <w:r>
-        <w:t xml:space="preserve">list</w:t>
-      </w:r>
-      <w:r>
-        <w:t xml:space="preserve"> </w:t>
-      </w:r>
-      <w:r>
-        <w:rPr>
-          <w:bCs/>
-          <w:b/>
-        </w:rPr>
-        <w:t xml:space="preserve">and</w:t>
-      </w:r>
-      <w:r>
-        <w:t xml:space="preserve"> </w:t>
-      </w:r>
-      <w:r>
-        <w:t xml:space="preserve">from the</w:t>
-      </w:r>
-      <w:r>
-        <w:t xml:space="preserve"> </w:t>
-      </w:r>
-      <w:r>
-        <w:rPr>
-          <w:rStyle w:val="VerbatimChar"/>
-          <w:bCs/>
-          <w:b/>
-        </w:rPr>
-        <w:t xml:space="preserve">1-to-1 Technicians</w:t>
-      </w:r>
-      <w:r>
-        <w:t xml:space="preserve"> </w:t>
-      </w:r>
-      <w:r>
-        <w:t xml:space="preserve">group.</w:t>
-      </w:r>
-    </w:p>
-    <w:p>
-      <w:pPr>
-        <w:numPr>
-          <w:ilvl w:val="0"/>
-          <w:numId w:val="1034"/>
-        </w:numPr>
-        <w:pStyle w:val="Compact"/>
-      </w:pPr>
-      <w:r>
-        <w:t xml:space="preserve">☐ Flow 1:</w:t>
-      </w:r>
-      <w:r>
-        <w:t xml:space="preserve"> </w:t>
-      </w:r>
-      <w:r>
-        <w:rPr>
-          <w:bCs/>
-          <w:b/>
-        </w:rPr>
-        <w:t xml:space="preserve">Initialize varTestDate</w:t>
-      </w:r>
-      <w:r>
-        <w:t xml:space="preserve"> </w:t>
-      </w:r>
-      <w:r>
-        <w:t xml:space="preserve">is</w:t>
-      </w:r>
-      <w:r>
-        <w:t xml:space="preserve"> </w:t>
-      </w:r>
-      <w:r>
-        <w:rPr>
-          <w:bCs/>
-          <w:b/>
-        </w:rPr>
-        <w:t xml:space="preserve">empty</w:t>
-      </w:r>
-      <w:r>
-        <w:t xml:space="preserve"> </w:t>
-      </w:r>
-      <w:r>
-        <w:t xml:space="preserve">(Save).</w:t>
-      </w:r>
-    </w:p>
-    <w:bookmarkEnd w:id="37"/>
-    <w:bookmarkStart w:id="39" w:name="X886e617d0f01d1676fba46472ee6c599f97ff50"/>
-    <w:p>
-      <w:pPr>
-        <w:pStyle w:val="Heading2"/>
-      </w:pPr>
-      <w:r>
-        <w:t xml:space="preserve">8. Phase E — Prepare and invite the real team (1–2 h)</w:t>
       </w:r>
     </w:p>
     <w:p>
@@ -13700,7 +13871,7 @@
         <w:pStyle w:val="Compact"/>
       </w:pPr>
       <w:r>
-        <w:t xml:space="preserve">☐</w:t>
+        <w:t xml:space="preserve">☐ Empty the</w:t>
       </w:r>
       <w:r>
         <w:t xml:space="preserve"> </w:t>
@@ -13710,13 +13881,10 @@
           <w:bCs/>
           <w:b/>
         </w:rPr>
-        <w:t xml:space="preserve">Expectations page:</w:t>
-      </w:r>
-      <w:r>
-        <w:t xml:space="preserve"> </w:t>
-      </w:r>
-      <w:r>
-        <w:t xml:space="preserve">enter the real</w:t>
+        <w:t xml:space="preserve">site recycle bin</w:t>
+      </w:r>
+      <w:r>
+        <w:t xml:space="preserve">, then the</w:t>
       </w:r>
       <w:r>
         <w:t xml:space="preserve"> </w:t>
@@ -13726,73 +13894,10 @@
           <w:bCs/>
           <w:b/>
         </w:rPr>
-        <w:t xml:space="preserve">Shared</w:t>
-      </w:r>
-      <w:r>
-        <w:t xml:space="preserve"> </w:t>
-      </w:r>
-      <w:r>
-        <w:t xml:space="preserve">expectations and each person's</w:t>
-      </w:r>
-      <w:r>
-        <w:t xml:space="preserve"> </w:t>
-      </w:r>
-      <w:r>
-        <w:rPr>
-          <w:bCs/>
-          <w:b/>
-        </w:rPr>
-        <w:t xml:space="preserve">Individual</w:t>
-      </w:r>
-      <w:r>
-        <w:t xml:space="preserve"> </w:t>
-      </w:r>
-      <w:r>
-        <w:t xml:space="preserve">ones for</w:t>
-      </w:r>
-      <w:r>
-        <w:t xml:space="preserve"> </w:t>
-      </w:r>
-      <w:r>
-        <w:rPr>
-          <w:bCs/>
-          <w:b/>
-        </w:rPr>
-        <w:t xml:space="preserve">2026/27</w:t>
+        <w:t xml:space="preserve">second-stage recycle bin</w:t>
       </w:r>
       <w:r>
         <w:t xml:space="preserve">.</w:t>
-      </w:r>
-    </w:p>
-    <w:p>
-      <w:pPr>
-        <w:numPr>
-          <w:ilvl w:val="1"/>
-          <w:numId w:val="1036"/>
-        </w:numPr>
-        <w:pStyle w:val="Compact"/>
-      </w:pPr>
-      <w:r>
-        <w:rPr>
-          <w:bCs/>
-          <w:b/>
-        </w:rPr>
-        <w:t xml:space="preserve">Maximum 10 per person</w:t>
-      </w:r>
-      <w:r>
-        <w:t xml:space="preserve">; the page shows the count.</w:t>
-      </w:r>
-    </w:p>
-    <w:p>
-      <w:pPr>
-        <w:numPr>
-          <w:ilvl w:val="1"/>
-          <w:numId w:val="1036"/>
-        </w:numPr>
-        <w:pStyle w:val="Compact"/>
-      </w:pPr>
-      <w:r>
-        <w:t xml:space="preserve">Expectations entered early for next year are ignored until that appraisal year starts (1 April).</w:t>
       </w:r>
     </w:p>
     <w:p>
@@ -13804,6 +13909,121 @@
         <w:pStyle w:val="Compact"/>
       </w:pPr>
       <w:r>
+        <w:t xml:space="preserve">☐ Remove Test A and Test B from the</w:t>
+      </w:r>
+      <w:r>
+        <w:t xml:space="preserve"> </w:t>
+      </w:r>
+      <w:r>
+        <w:rPr>
+          <w:bCs/>
+          <w:b/>
+        </w:rPr>
+        <w:t xml:space="preserve">Technicians</w:t>
+      </w:r>
+      <w:r>
+        <w:t xml:space="preserve"> </w:t>
+      </w:r>
+      <w:r>
+        <w:t xml:space="preserve">list</w:t>
+      </w:r>
+      <w:r>
+        <w:t xml:space="preserve"> </w:t>
+      </w:r>
+      <w:r>
+        <w:rPr>
+          <w:bCs/>
+          <w:b/>
+        </w:rPr>
+        <w:t xml:space="preserve">and</w:t>
+      </w:r>
+      <w:r>
+        <w:t xml:space="preserve"> </w:t>
+      </w:r>
+      <w:r>
+        <w:t xml:space="preserve">from the</w:t>
+      </w:r>
+      <w:r>
+        <w:t xml:space="preserve"> </w:t>
+      </w:r>
+      <w:r>
+        <w:rPr>
+          <w:rStyle w:val="VerbatimChar"/>
+          <w:bCs/>
+          <w:b/>
+        </w:rPr>
+        <w:t xml:space="preserve">1-to-1 Technicians</w:t>
+      </w:r>
+      <w:r>
+        <w:t xml:space="preserve"> </w:t>
+      </w:r>
+      <w:r>
+        <w:t xml:space="preserve">group. Team ▾ goes back to Team (0).</w:t>
+      </w:r>
+    </w:p>
+    <w:p>
+      <w:pPr>
+        <w:numPr>
+          <w:ilvl w:val="0"/>
+          <w:numId w:val="1035"/>
+        </w:numPr>
+        <w:pStyle w:val="Compact"/>
+      </w:pPr>
+      <w:r>
+        <w:t xml:space="preserve">☐ Flow 1:</w:t>
+      </w:r>
+      <w:r>
+        <w:t xml:space="preserve"> </w:t>
+      </w:r>
+      <w:r>
+        <w:rPr>
+          <w:bCs/>
+          <w:b/>
+        </w:rPr>
+        <w:t xml:space="preserve">Initialize varTestDate</w:t>
+      </w:r>
+      <w:r>
+        <w:t xml:space="preserve"> </w:t>
+      </w:r>
+      <w:r>
+        <w:t xml:space="preserve">is</w:t>
+      </w:r>
+      <w:r>
+        <w:t xml:space="preserve"> </w:t>
+      </w:r>
+      <w:r>
+        <w:rPr>
+          <w:bCs/>
+          <w:b/>
+        </w:rPr>
+        <w:t xml:space="preserve">empty</w:t>
+      </w:r>
+      <w:r>
+        <w:t xml:space="preserve"> </w:t>
+      </w:r>
+      <w:r>
+        <w:t xml:space="preserve">(Save).</w:t>
+      </w:r>
+    </w:p>
+    <w:bookmarkEnd w:id="37"/>
+    <w:bookmarkStart w:id="39" w:name="X886e617d0f01d1676fba46472ee6c599f97ff50"/>
+    <w:p>
+      <w:pPr>
+        <w:pStyle w:val="Heading2"/>
+      </w:pPr>
+      <w:r>
+        <w:t xml:space="preserve">8. Phase E — Prepare and invite the real team (1–2 h)</w:t>
+      </w:r>
+    </w:p>
+    <w:p>
+      <w:pPr>
+        <w:numPr>
+          <w:ilvl w:val="0"/>
+          <w:numId w:val="1036"/>
+        </w:numPr>
+        <w:pStyle w:val="Compact"/>
+      </w:pPr>
+      <w:r>
         <w:t xml:space="preserve">☐</w:t>
       </w:r>
       <w:r>
@@ -13863,7 +14083,7 @@
       <w:pPr>
         <w:numPr>
           <w:ilvl w:val="0"/>
-          <w:numId w:val="1035"/>
+          <w:numId w:val="1036"/>
         </w:numPr>
         <w:pStyle w:val="Compact"/>
       </w:pPr>
@@ -13919,7 +14139,7 @@
       <w:pPr>
         <w:numPr>
           <w:ilvl w:val="0"/>
-          <w:numId w:val="1035"/>
+          <w:numId w:val="1036"/>
         </w:numPr>
         <w:pStyle w:val="Compact"/>
       </w:pPr>
@@ -13963,7 +14183,7 @@
       <w:pPr>
         <w:numPr>
           <w:ilvl w:val="0"/>
-          <w:numId w:val="1035"/>
+          <w:numId w:val="1036"/>
         </w:numPr>
         <w:pStyle w:val="Compact"/>
       </w:pPr>
@@ -13978,13 +14198,58 @@
           <w:bCs/>
           <w:b/>
         </w:rPr>
-        <w:t xml:space="preserve">Invite.</w:t>
-      </w:r>
-      <w:r>
-        <w:t xml:space="preserve"> </w:t>
-      </w:r>
-      <w:r>
-        <w:t xml:space="preserve">Send the welcome email below from your own mailbox, or brief the team in person.</w:t>
+        <w:t xml:space="preserve">Expectations page:</w:t>
+      </w:r>
+      <w:r>
+        <w:t xml:space="preserve"> </w:t>
+      </w:r>
+      <w:r>
+        <w:t xml:space="preserve">enter the real</w:t>
+      </w:r>
+      <w:r>
+        <w:t xml:space="preserve"> </w:t>
+      </w:r>
+      <w:r>
+        <w:rPr>
+          <w:bCs/>
+          <w:b/>
+        </w:rPr>
+        <w:t xml:space="preserve">Shared</w:t>
+      </w:r>
+      <w:r>
+        <w:t xml:space="preserve"> </w:t>
+      </w:r>
+      <w:r>
+        <w:t xml:space="preserve">expectations and each person's</w:t>
+      </w:r>
+      <w:r>
+        <w:t xml:space="preserve"> </w:t>
+      </w:r>
+      <w:r>
+        <w:rPr>
+          <w:bCs/>
+          <w:b/>
+        </w:rPr>
+        <w:t xml:space="preserve">Individual</w:t>
+      </w:r>
+      <w:r>
+        <w:t xml:space="preserve"> </w:t>
+      </w:r>
+      <w:r>
+        <w:t xml:space="preserve">ones for</w:t>
+      </w:r>
+      <w:r>
+        <w:t xml:space="preserve"> </w:t>
+      </w:r>
+      <w:r>
+        <w:rPr>
+          <w:bCs/>
+          <w:b/>
+        </w:rPr>
+        <w:t xml:space="preserve">2026/27</w:t>
+      </w:r>
+      <w:r>
+        <w:t xml:space="preserve">. Do this after the Technicians list, so people appear in the Technician dropdown.</w:t>
       </w:r>
     </w:p>
     <w:p>
@@ -13996,7 +14261,14 @@
         <w:pStyle w:val="Compact"/>
       </w:pPr>
       <w:r>
-        <w:t xml:space="preserve">It only tells them what's coming.</w:t>
+        <w:rPr>
+          <w:bCs/>
+          <w:b/>
+        </w:rPr>
+        <w:t xml:space="preserve">Maximum 10 per person</w:t>
+      </w:r>
+      <w:r>
+        <w:t xml:space="preserve">; the page shows the count.</w:t>
       </w:r>
     </w:p>
     <w:p>
@@ -14008,6 +14280,58 @@
         <w:pStyle w:val="Compact"/>
       </w:pPr>
       <w:r>
+        <w:t xml:space="preserve">Expectations entered early for next year are ignored until that appraisal year starts (1 April).</w:t>
+      </w:r>
+    </w:p>
+    <w:p>
+      <w:pPr>
+        <w:numPr>
+          <w:ilvl w:val="0"/>
+          <w:numId w:val="1036"/>
+        </w:numPr>
+        <w:pStyle w:val="Compact"/>
+      </w:pPr>
+      <w:r>
+        <w:t xml:space="preserve">☐</w:t>
+      </w:r>
+      <w:r>
+        <w:t xml:space="preserve"> </w:t>
+      </w:r>
+      <w:r>
+        <w:rPr>
+          <w:bCs/>
+          <w:b/>
+        </w:rPr>
+        <w:t xml:space="preserve">Invite.</w:t>
+      </w:r>
+      <w:r>
+        <w:t xml:space="preserve"> </w:t>
+      </w:r>
+      <w:r>
+        <w:t xml:space="preserve">Send the welcome email below from your own mailbox, or brief the team in person.</w:t>
+      </w:r>
+    </w:p>
+    <w:p>
+      <w:pPr>
+        <w:numPr>
+          <w:ilvl w:val="1"/>
+          <w:numId w:val="1039"/>
+        </w:numPr>
+        <w:pStyle w:val="Compact"/>
+      </w:pPr>
+      <w:r>
+        <w:t xml:space="preserve">It only tells them what's coming.</w:t>
+      </w:r>
+    </w:p>
+    <w:p>
+      <w:pPr>
+        <w:numPr>
+          <w:ilvl w:val="1"/>
+          <w:numId w:val="1039"/>
+        </w:numPr>
+        <w:pStyle w:val="Compact"/>
+      </w:pPr>
+      <w:r>
         <w:t xml:space="preserve">Access comes solely through each person's own monthly link, which works only for them.</w:t>
       </w:r>
     </w:p>
@@ -14077,146 +14401,6 @@
           <w:b/>
         </w:rPr>
         <w:t xml:space="preserve">How it works</w:t>
-      </w:r>
-    </w:p>
-    <w:p>
-      <w:pPr>
-        <w:numPr>
-          <w:ilvl w:val="0"/>
-          <w:numId w:val="1039"/>
-        </w:numPr>
-        <w:pStyle w:val="Compact"/>
-      </w:pPr>
-      <w:r>
-        <w:t xml:space="preserve">On the 1st of each month you'll get an email from me:</w:t>
-      </w:r>
-      <w:r>
-        <w:t xml:space="preserve"> </w:t>
-      </w:r>
-      <w:r>
-        <w:rPr>
-          <w:iCs/>
-          <w:i/>
-        </w:rPr>
-        <w:t xml:space="preserve">"Your 1-to-1 for [month] is ready"</w:t>
-      </w:r>
-      <w:r>
-        <w:t xml:space="preserve">. The link in it opens</w:t>
-      </w:r>
-      <w:r>
-        <w:t xml:space="preserve"> </w:t>
-      </w:r>
-      <w:r>
-        <w:rPr>
-          <w:bCs/>
-          <w:b/>
-        </w:rPr>
-        <w:t xml:space="preserve">your</w:t>
-      </w:r>
-      <w:r>
-        <w:t xml:space="preserve"> </w:t>
-      </w:r>
-      <w:r>
-        <w:t xml:space="preserve">form.</w:t>
-      </w:r>
-    </w:p>
-    <w:p>
-      <w:pPr>
-        <w:numPr>
-          <w:ilvl w:val="0"/>
-          <w:numId w:val="1039"/>
-        </w:numPr>
-        <w:pStyle w:val="Compact"/>
-      </w:pPr>
-      <w:r>
-        <w:t xml:space="preserve">It takes about 10–15 minutes. You can save and come back as often as you like.</w:t>
-      </w:r>
-    </w:p>
-    <w:p>
-      <w:pPr>
-        <w:numPr>
-          <w:ilvl w:val="0"/>
-          <w:numId w:val="1039"/>
-        </w:numPr>
-        <w:pStyle w:val="Compact"/>
-      </w:pPr>
-      <w:r>
-        <w:t xml:space="preserve">The deadline is the</w:t>
-      </w:r>
-      <w:r>
-        <w:t xml:space="preserve"> </w:t>
-      </w:r>
-      <w:r>
-        <w:rPr>
-          <w:bCs/>
-          <w:b/>
-        </w:rPr>
-        <w:t xml:space="preserve">last day of the month at 23:59</w:t>
-      </w:r>
-      <w:r>
-        <w:t xml:space="preserve">. If you haven't submitted, you'll get reminders on the 20th and 27th.</w:t>
-      </w:r>
-    </w:p>
-    <w:p>
-      <w:pPr>
-        <w:numPr>
-          <w:ilvl w:val="0"/>
-          <w:numId w:val="1039"/>
-        </w:numPr>
-        <w:pStyle w:val="Compact"/>
-      </w:pPr>
-      <w:r>
-        <w:t xml:space="preserve">Once you submit, the form is locked. I'll read it, add my feedback and any agreed actions, and you'll get an email when the feedback is ready to view.</w:t>
-      </w:r>
-    </w:p>
-    <w:p>
-      <w:pPr>
-        <w:numPr>
-          <w:ilvl w:val="0"/>
-          <w:numId w:val="1039"/>
-        </w:numPr>
-        <w:pStyle w:val="Compact"/>
-      </w:pPr>
-      <w:r>
-        <w:rPr>
-          <w:bCs/>
-          <w:b/>
-        </w:rPr>
-        <w:t xml:space="preserve">My appraisal</w:t>
-      </w:r>
-      <w:r>
-        <w:t xml:space="preserve"> </w:t>
-      </w:r>
-      <w:r>
-        <w:t xml:space="preserve">shows how you're tracking against your appraisal expectations.</w:t>
-      </w:r>
-      <w:r>
-        <w:t xml:space="preserve"> </w:t>
-      </w:r>
-      <w:r>
-        <w:rPr>
-          <w:bCs/>
-          <w:b/>
-        </w:rPr>
-        <w:t xml:space="preserve">Appraisal report</w:t>
-      </w:r>
-      <w:r>
-        <w:t xml:space="preserve"> </w:t>
-      </w:r>
-      <w:r>
-        <w:t xml:space="preserve">pulls the year together to help with your appraisal.</w:t>
-      </w:r>
-    </w:p>
-    <w:p>
-      <w:pPr>
-        <w:pStyle w:val="FirstParagraph"/>
-      </w:pPr>
-      <w:r>
-        <w:rPr>
-          <w:bCs/>
-          <w:b/>
-        </w:rPr>
-        <w:t xml:space="preserve">Who can see it</w:t>
       </w:r>
     </w:p>
     <w:p>
@@ -14228,7 +14412,20 @@
         <w:pStyle w:val="Compact"/>
       </w:pPr>
       <w:r>
-        <w:t xml:space="preserve">Your answers are visible only to</w:t>
+        <w:t xml:space="preserve">On the 1st of each month you'll get an email from me:</w:t>
+      </w:r>
+      <w:r>
+        <w:t xml:space="preserve"> </w:t>
+      </w:r>
+      <w:r>
+        <w:rPr>
+          <w:iCs/>
+          <w:i/>
+        </w:rPr>
+        <w:t xml:space="preserve">"Your 1-to-1 for [month] is ready"</w:t>
+      </w:r>
+      <w:r>
+        <w:t xml:space="preserve">. The link in it opens</w:t>
       </w:r>
       <w:r>
         <w:t xml:space="preserve"> </w:t>
@@ -14238,10 +14435,13 @@
           <w:bCs/>
           <w:b/>
         </w:rPr>
-        <w:t xml:space="preserve">you and me</w:t>
-      </w:r>
-      <w:r>
-        <w:t xml:space="preserve">.</w:t>
+        <w:t xml:space="preserve">your</w:t>
+      </w:r>
+      <w:r>
+        <w:t xml:space="preserve"> </w:t>
+      </w:r>
+      <w:r>
+        <w:t xml:space="preserve">form.</w:t>
       </w:r>
     </w:p>
     <w:p>
@@ -14253,7 +14453,7 @@
         <w:pStyle w:val="Compact"/>
       </w:pPr>
       <w:r>
-        <w:t xml:space="preserve">Other technicians can't see your form, your answers or your feedback, and you can't see theirs.</w:t>
+        <w:t xml:space="preserve">It takes about 10–15 minutes. You can save and come back as often as you like.</w:t>
       </w:r>
     </w:p>
     <w:p>
@@ -14265,19 +14465,82 @@
         <w:pStyle w:val="Compact"/>
       </w:pPr>
       <w:r>
-        <w:t xml:space="preserve">Like any company system, IT administrators could technically access it.</w:t>
+        <w:t xml:space="preserve">The deadline is the</w:t>
+      </w:r>
+      <w:r>
+        <w:t xml:space="preserve"> </w:t>
+      </w:r>
+      <w:r>
+        <w:rPr>
+          <w:bCs/>
+          <w:b/>
+        </w:rPr>
+        <w:t xml:space="preserve">last day of the month at 23:59</w:t>
+      </w:r>
+      <w:r>
+        <w:t xml:space="preserve">. If you haven't submitted, you'll get reminders on the 20th and 27th.</w:t>
       </w:r>
     </w:p>
     <w:p>
       <w:pPr>
-        <w:pStyle w:val="FirstParagraph"/>
+        <w:numPr>
+          <w:ilvl w:val="0"/>
+          <w:numId w:val="1040"/>
+        </w:numPr>
+        <w:pStyle w:val="Compact"/>
+      </w:pPr>
+      <w:r>
+        <w:t xml:space="preserve">Once you submit, the form is locked. I'll read it, add my feedback and any agreed actions, and you'll get an email when the feedback is ready to view.</w:t>
+      </w:r>
+    </w:p>
+    <w:p>
+      <w:pPr>
+        <w:numPr>
+          <w:ilvl w:val="0"/>
+          <w:numId w:val="1040"/>
+        </w:numPr>
+        <w:pStyle w:val="Compact"/>
       </w:pPr>
       <w:r>
         <w:rPr>
           <w:bCs/>
           <w:b/>
         </w:rPr>
-        <w:t xml:space="preserve">Things to know</w:t>
+        <w:t xml:space="preserve">My appraisal</w:t>
+      </w:r>
+      <w:r>
+        <w:t xml:space="preserve"> </w:t>
+      </w:r>
+      <w:r>
+        <w:t xml:space="preserve">shows how you're tracking against your appraisal expectations.</w:t>
+      </w:r>
+      <w:r>
+        <w:t xml:space="preserve"> </w:t>
+      </w:r>
+      <w:r>
+        <w:rPr>
+          <w:bCs/>
+          <w:b/>
+        </w:rPr>
+        <w:t xml:space="preserve">Appraisal report</w:t>
+      </w:r>
+      <w:r>
+        <w:t xml:space="preserve"> </w:t>
+      </w:r>
+      <w:r>
+        <w:t xml:space="preserve">pulls the year together to help with your appraisal.</w:t>
+      </w:r>
+    </w:p>
+    <w:p>
+      <w:pPr>
+        <w:pStyle w:val="FirstParagraph"/>
+      </w:pPr>
+      <w:r>
+        <w:rPr>
+          <w:bCs/>
+          <w:b/>
+        </w:rPr>
+        <w:t xml:space="preserve">Who can see it</w:t>
       </w:r>
     </w:p>
     <w:p>
@@ -14289,7 +14552,20 @@
         <w:pStyle w:val="Compact"/>
       </w:pPr>
       <w:r>
-        <w:t xml:space="preserve">Open the link while signed in with your own company account.</w:t>
+        <w:t xml:space="preserve">Your answers are visible only to</w:t>
+      </w:r>
+      <w:r>
+        <w:t xml:space="preserve"> </w:t>
+      </w:r>
+      <w:r>
+        <w:rPr>
+          <w:bCs/>
+          <w:b/>
+        </w:rPr>
+        <w:t xml:space="preserve">you and me</w:t>
+      </w:r>
+      <w:r>
+        <w:t xml:space="preserve">.</w:t>
       </w:r>
     </w:p>
     <w:p>
@@ -14301,7 +14577,7 @@
         <w:pStyle w:val="Compact"/>
       </w:pPr>
       <w:r>
-        <w:t xml:space="preserve">Raise anything urgent with me directly. You don't need to wait for the form.</w:t>
+        <w:t xml:space="preserve">Other technicians can't see your form, your answers or your feedback, and you can't see theirs.</w:t>
       </w:r>
     </w:p>
     <w:p>
@@ -14313,6 +14589,54 @@
         <w:pStyle w:val="Compact"/>
       </w:pPr>
       <w:r>
+        <w:t xml:space="preserve">Like any company system, IT administrators could technically access it.</w:t>
+      </w:r>
+    </w:p>
+    <w:p>
+      <w:pPr>
+        <w:pStyle w:val="FirstParagraph"/>
+      </w:pPr>
+      <w:r>
+        <w:rPr>
+          <w:bCs/>
+          <w:b/>
+        </w:rPr>
+        <w:t xml:space="preserve">Things to know</w:t>
+      </w:r>
+    </w:p>
+    <w:p>
+      <w:pPr>
+        <w:numPr>
+          <w:ilvl w:val="0"/>
+          <w:numId w:val="1042"/>
+        </w:numPr>
+        <w:pStyle w:val="Compact"/>
+      </w:pPr>
+      <w:r>
+        <w:t xml:space="preserve">Open the link while signed in with your own company account.</w:t>
+      </w:r>
+    </w:p>
+    <w:p>
+      <w:pPr>
+        <w:numPr>
+          <w:ilvl w:val="0"/>
+          <w:numId w:val="1042"/>
+        </w:numPr>
+        <w:pStyle w:val="Compact"/>
+      </w:pPr>
+      <w:r>
+        <w:t xml:space="preserve">Raise anything urgent with me directly. You don't need to wait for the form.</w:t>
+      </w:r>
+    </w:p>
+    <w:p>
+      <w:pPr>
+        <w:numPr>
+          <w:ilvl w:val="0"/>
+          <w:numId w:val="1042"/>
+        </w:numPr>
+        <w:pStyle w:val="Compact"/>
+      </w:pPr>
+      <w:r>
         <w:t xml:space="preserve">If something doesn't work, tell me what you saw (a screenshot helps).</w:t>
       </w:r>
     </w:p>
@@ -14345,7 +14669,7 @@
       <w:pPr>
         <w:numPr>
           <w:ilvl w:val="0"/>
-          <w:numId w:val="1042"/>
+          <w:numId w:val="1043"/>
         </w:numPr>
         <w:pStyle w:val="Compact"/>
       </w:pPr>
@@ -14386,7 +14710,7 @@
       <w:pPr>
         <w:numPr>
           <w:ilvl w:val="0"/>
-          <w:numId w:val="1042"/>
+          <w:numId w:val="1043"/>
         </w:numPr>
         <w:pStyle w:val="Compact"/>
       </w:pPr>
@@ -14430,7 +14754,7 @@
       <w:pPr>
         <w:numPr>
           <w:ilvl w:val="0"/>
-          <w:numId w:val="1042"/>
+          <w:numId w:val="1043"/>
         </w:numPr>
         <w:pStyle w:val="Compact"/>
       </w:pPr>
@@ -16601,6 +16925,85 @@
               <w:rPr>
                 <w:sz w:val="18"/>
               </w:rPr>
+              <w:t xml:space="preserve">Page still shows the old look, or the wrong version in the top menu bar</w:t>
+            </w:r>
+          </w:p>
+        </w:tc>
+        <w:tc>
+          <w:tcPr>
+            <w:tcW w:type="dxa" w:w="3288"/>
+          </w:tcPr>
+          <w:p>
+            <w:pPr>
+              <w:pStyle w:val="Compact"/>
+              <w:jc w:val="left"/>
+            </w:pPr>
+            <w:r>
+              <w:rPr>
+                <w:sz w:val="18"/>
+              </w:rPr>
+              <w:t xml:space="preserve">Welcome is serving its cached copy of the layout</w:t>
+            </w:r>
+          </w:p>
+        </w:tc>
+        <w:tc>
+          <w:tcPr>
+            <w:tcW w:type="dxa" w:w="3288"/>
+          </w:tcPr>
+          <w:p>
+            <w:pPr>
+              <w:pStyle w:val="Compact"/>
+              <w:jc w:val="left"/>
+            </w:pPr>
+            <w:r>
+              <w:rPr>
+                <w:sz w:val="18"/>
+              </w:rPr>
+              <w:t xml:space="preserve">Edit the page → web part settings →</w:t>
+            </w:r>
+            <w:r>
+              <w:rPr>
+                <w:sz w:val="18"/>
+              </w:rPr>
+              <w:t xml:space="preserve"> </w:t>
+            </w:r>
+            <w:r>
+              <w:rPr>
+                <w:bCs/>
+                <w:b/>
+                <w:sz w:val="18"/>
+              </w:rPr>
+              <w:t xml:space="preserve">Reset layout cache</w:t>
+            </w:r>
+            <w:r>
+              <w:rPr>
+                <w:sz w:val="18"/>
+              </w:rPr>
+              <w:t xml:space="preserve"> </w:t>
+            </w:r>
+            <w:r>
+              <w:rPr>
+                <w:sz w:val="18"/>
+              </w:rPr>
+              <w:t xml:space="preserve">→ Republish, then Ctrl+F5</w:t>
+            </w:r>
+          </w:p>
+        </w:tc>
+      </w:tr>
+      <w:tr>
+        <w:tc>
+          <w:tcPr>
+            <w:tcW w:type="dxa" w:w="3288"/>
+          </w:tcPr>
+          <w:p>
+            <w:pPr>
+              <w:pStyle w:val="Compact"/>
+              <w:jc w:val="left"/>
+            </w:pPr>
+            <w:r>
+              <w:rPr>
+                <w:sz w:val="18"/>
+              </w:rPr>
               <w:t xml:space="preserve">Technician sees a blank page or an "access request"</w:t>
             </w:r>
           </w:p>
@@ -19059,7 +19462,7 @@
               <w:rPr>
                 <w:sz w:val="18"/>
               </w:rPr>
-              <w:t xml:space="preserve">About 1,750 lines of custom code, owned by the TL</w:t>
+              <w:t xml:space="preserve">About 1,800 lines of custom code, owned by the TL</w:t>
             </w:r>
           </w:p>
         </w:tc>
@@ -19998,34 +20401,7 @@
     <w:abstractNumId w:val="991"/>
   </w:num>
   <w:num w:numId="1022">
-    <w:abstractNumId w:val="99411"/>
-    <w:lvlOverride w:ilvl="0">
-      <w:startOverride w:val="1"/>
-    </w:lvlOverride>
-    <w:lvlOverride w:ilvl="1">
-      <w:startOverride w:val="1"/>
-    </w:lvlOverride>
-    <w:lvlOverride w:ilvl="2">
-      <w:startOverride w:val="1"/>
-    </w:lvlOverride>
-    <w:lvlOverride w:ilvl="3">
-      <w:startOverride w:val="1"/>
-    </w:lvlOverride>
-    <w:lvlOverride w:ilvl="4">
-      <w:startOverride w:val="1"/>
-    </w:lvlOverride>
-    <w:lvlOverride w:ilvl="5">
-      <w:startOverride w:val="1"/>
-    </w:lvlOverride>
-    <w:lvlOverride w:ilvl="6">
-      <w:startOverride w:val="1"/>
-    </w:lvlOverride>
-    <w:lvlOverride w:ilvl="7">
-      <w:startOverride w:val="1"/>
-    </w:lvlOverride>
-    <w:lvlOverride w:ilvl="8">
-      <w:startOverride w:val="1"/>
-    </w:lvlOverride>
+    <w:abstractNumId w:val="991"/>
   </w:num>
   <w:num w:numId="1023">
     <w:abstractNumId w:val="99411"/>
@@ -20058,30 +20434,6 @@
     </w:lvlOverride>
   </w:num>
   <w:num w:numId="1024">
-    <w:abstractNumId w:val="991"/>
-  </w:num>
-  <w:num w:numId="1025">
-    <w:abstractNumId w:val="991"/>
-  </w:num>
-  <w:num w:numId="1026">
-    <w:abstractNumId w:val="991"/>
-  </w:num>
-  <w:num w:numId="1027">
-    <w:abstractNumId w:val="991"/>
-  </w:num>
-  <w:num w:numId="1028">
-    <w:abstractNumId w:val="991"/>
-  </w:num>
-  <w:num w:numId="1029">
-    <w:abstractNumId w:val="991"/>
-  </w:num>
-  <w:num w:numId="1030">
-    <w:abstractNumId w:val="991"/>
-  </w:num>
-  <w:num w:numId="1031">
-    <w:abstractNumId w:val="991"/>
-  </w:num>
-  <w:num w:numId="1032">
     <w:abstractNumId w:val="99411"/>
     <w:lvlOverride w:ilvl="0">
       <w:startOverride w:val="1"/>
@@ -20111,8 +20463,59 @@
       <w:startOverride w:val="1"/>
     </w:lvlOverride>
   </w:num>
+  <w:num w:numId="1025">
+    <w:abstractNumId w:val="991"/>
+  </w:num>
+  <w:num w:numId="1026">
+    <w:abstractNumId w:val="991"/>
+  </w:num>
+  <w:num w:numId="1027">
+    <w:abstractNumId w:val="991"/>
+  </w:num>
+  <w:num w:numId="1028">
+    <w:abstractNumId w:val="991"/>
+  </w:num>
+  <w:num w:numId="1029">
+    <w:abstractNumId w:val="991"/>
+  </w:num>
+  <w:num w:numId="1030">
+    <w:abstractNumId w:val="991"/>
+  </w:num>
+  <w:num w:numId="1031">
+    <w:abstractNumId w:val="991"/>
+  </w:num>
+  <w:num w:numId="1032">
+    <w:abstractNumId w:val="991"/>
+  </w:num>
   <w:num w:numId="1033">
-    <w:abstractNumId w:val="991"/>
+    <w:abstractNumId w:val="99411"/>
+    <w:lvlOverride w:ilvl="0">
+      <w:startOverride w:val="1"/>
+    </w:lvlOverride>
+    <w:lvlOverride w:ilvl="1">
+      <w:startOverride w:val="1"/>
+    </w:lvlOverride>
+    <w:lvlOverride w:ilvl="2">
+      <w:startOverride w:val="1"/>
+    </w:lvlOverride>
+    <w:lvlOverride w:ilvl="3">
+      <w:startOverride w:val="1"/>
+    </w:lvlOverride>
+    <w:lvlOverride w:ilvl="4">
+      <w:startOverride w:val="1"/>
+    </w:lvlOverride>
+    <w:lvlOverride w:ilvl="5">
+      <w:startOverride w:val="1"/>
+    </w:lvlOverride>
+    <w:lvlOverride w:ilvl="6">
+      <w:startOverride w:val="1"/>
+    </w:lvlOverride>
+    <w:lvlOverride w:ilvl="7">
+      <w:startOverride w:val="1"/>
+    </w:lvlOverride>
+    <w:lvlOverride w:ilvl="8">
+      <w:startOverride w:val="1"/>
+    </w:lvlOverride>
   </w:num>
   <w:num w:numId="1034">
     <w:abstractNumId w:val="991"/>
@@ -20139,6 +20542,9 @@
     <w:abstractNumId w:val="991"/>
   </w:num>
   <w:num w:numId="1042">
+    <w:abstractNumId w:val="991"/>
+  </w:num>
+  <w:num w:numId="1043">
     <w:abstractNumId w:val="991"/>
   </w:num>
 </w:numbering>

</xml_diff>

<commit_message>
v4.2.1 / solution 1.1.1.0: Overdue appraisals, aim-for-the-month-before prompts, upgrade-safe Flow 1
- Appraisal dates that have passed read 'Overdue by N days' (team table, Settings,
  profile tile, 'Appraisals overdue' tile); Needs your attention says to set the next date
- Subtle 'aim: in <month>' prompts for completing appraisals the calendar month before
- Flow 1 reads Wellbeing Assessments by REST via the list ID, so it can be turned on
  after upgrading from 1.0 before Setup has created the list (GetTable: List not found)
- Validator rule + mutation: flows 1-4 never name a post-1.0 list in a connector step
- Fake SharePoint REST items support $select/$expand/$filter; tests and docs updated

Co-Authored-By: Claude Opus 5.5 <noreply@anthropic.com>
Claude-Session: https://claude.ai/code/session_014y1MJU3GKp2dkeyoic78UT
</commit_message>
<xml_diff>
--- a/one-to-one/ESG-1to1-Finalisation-Guide.docx
+++ b/one-to-one/ESG-1to1-Finalisation-Guide.docx
@@ -34,7 +34,7 @@
         <w:pStyle w:val="BodyText"/>
       </w:pPr>
       <w:r>
-        <w:t xml:space="preserve">Version: system v4.1.0 (frontend) · solution 1.1.0.0 · guide dated 15-Oct-2026</w:t>
+        <w:t xml:space="preserve">Version: system v4.2.1 (frontend) · solution 1.1.1.0 · guide dated 15-Oct-2026</w:t>
       </w:r>
     </w:p>
     <w:p>
@@ -208,7 +208,7 @@
         <w:pStyle w:val="Compact"/>
       </w:pPr>
       <w:r>
-        <w:t xml:space="preserve">frontend: 148 automated checks;</w:t>
+        <w:t xml:space="preserve">frontend: 156 automated checks;</w:t>
       </w:r>
     </w:p>
     <w:p>
@@ -1042,7 +1042,7 @@
                 <w:rStyle w:val="VerbatimChar"/>
                 <w:sz w:val="18"/>
               </w:rPr>
-              <w:t xml:space="preserve">ESGOneToOne_1_1_0_0_unmanaged.zip</w:t>
+              <w:t xml:space="preserve">ESGOneToOne_1_1_1_0_unmanaged.zip</w:t>
             </w:r>
           </w:p>
         </w:tc>
@@ -1430,7 +1430,7 @@
         <w:t xml:space="preserve"> </w:t>
       </w:r>
       <w:r>
-        <w:t xml:space="preserve">(v4.2.0). After installing, the top menu bar must show</w:t>
+        <w:t xml:space="preserve">(v4.2.1). After installing, the top menu bar must show</w:t>
       </w:r>
       <w:r>
         <w:t xml:space="preserve"> </w:t>
@@ -1440,7 +1440,7 @@
           <w:bCs/>
           <w:b/>
         </w:rPr>
-        <w:t xml:space="preserve">v4.2.0</w:t>
+        <w:t xml:space="preserve">v4.2.1</w:t>
       </w:r>
       <w:r>
         <w:t xml:space="preserve"> </w:t>
@@ -1884,7 +1884,7 @@
         <w:rPr>
           <w:rStyle w:val="VerbatimChar"/>
         </w:rPr>
-        <w:t xml:space="preserve">ESGOneToOne_1_1_0_0_unmanaged.zip</w:t>
+        <w:t xml:space="preserve">ESGOneToOne_1_1_1_0_unmanaged.zip</w:t>
       </w:r>
       <w:r>
         <w:t xml:space="preserve"> </w:t>
@@ -4049,7 +4049,7 @@
           <w:bCs/>
           <w:b/>
         </w:rPr>
-        <w:t xml:space="preserve">v4.2.0</w:t>
+        <w:t xml:space="preserve">v4.2.1</w:t>
       </w:r>
       <w:r>
         <w:t xml:space="preserve"> </w:t>
@@ -4506,7 +4506,7 @@
         <w:rPr>
           <w:rStyle w:val="VerbatimChar"/>
         </w:rPr>
-        <w:t xml:space="preserve">ESGOneToOne_1_1_0_0_unmanaged.zip</w:t>
+        <w:t xml:space="preserve">ESGOneToOne_1_1_1_0_unmanaged.zip</w:t>
       </w:r>
       <w:r>
         <w:t xml:space="preserve"> </w:t>
@@ -4525,7 +4525,7 @@
         <w:t xml:space="preserve">0 Setup</w:t>
       </w:r>
       <w:r>
-        <w:t xml:space="preserve">, turn on flows 4 and 5, upload the v4.2.0 files and</w:t>
+        <w:t xml:space="preserve">, turn on flows 4 and 5, upload the v4.2.1 files and</w:t>
       </w:r>
       <w:r>
         <w:t xml:space="preserve"> </w:t>
@@ -18775,6 +18775,76 @@
                 <w:sz w:val="18"/>
               </w:rPr>
               <w:t xml:space="preserve">. Check its run history; the person needs a mailbox.</w:t>
+            </w:r>
+          </w:p>
+        </w:tc>
+      </w:tr>
+      <w:tr>
+        <w:tc>
+          <w:tcPr>
+            <w:tcW w:type="dxa" w:w="4932"/>
+          </w:tcPr>
+          <w:p>
+            <w:pPr>
+              <w:pStyle w:val="Compact"/>
+              <w:jc w:val="left"/>
+            </w:pPr>
+            <w:r>
+              <w:rPr>
+                <w:sz w:val="18"/>
+              </w:rPr>
+              <w:t xml:space="preserve">Import:</w:t>
+            </w:r>
+            <w:r>
+              <w:rPr>
+                <w:sz w:val="18"/>
+              </w:rPr>
+              <w:t xml:space="preserve"> </w:t>
+            </w:r>
+            <w:r>
+              <w:rPr>
+                <w:iCs/>
+                <w:i/>
+                <w:sz w:val="18"/>
+              </w:rPr>
+              <w:t xml:space="preserve">"flows may not have turned on … List not found"</w:t>
+            </w:r>
+          </w:p>
+        </w:tc>
+        <w:tc>
+          <w:tcPr>
+            <w:tcW w:type="dxa" w:w="4932"/>
+          </w:tcPr>
+          <w:p>
+            <w:pPr>
+              <w:pStyle w:val="Compact"/>
+              <w:jc w:val="left"/>
+            </w:pPr>
+            <w:r>
+              <w:rPr>
+                <w:sz w:val="18"/>
+              </w:rPr>
+              <w:t xml:space="preserve">Expected only when upgrading before Setup has created a new list. Run</w:t>
+            </w:r>
+            <w:r>
+              <w:rPr>
+                <w:sz w:val="18"/>
+              </w:rPr>
+              <w:t xml:space="preserve"> </w:t>
+            </w:r>
+            <w:r>
+              <w:rPr>
+                <w:bCs/>
+                <w:b/>
+                <w:sz w:val="18"/>
+              </w:rPr>
+              <w:t xml:space="preserve">0 Setup</w:t>
+            </w:r>
+            <w:r>
+              <w:rPr>
+                <w:sz w:val="18"/>
+              </w:rPr>
+              <w:t xml:space="preserve">, then turn the flows on (§0 step 3).</w:t>
             </w:r>
           </w:p>
         </w:tc>

</xml_diff>

<commit_message>
v4.3.0 / solution 1.2.0.0: feedback bubble and Flow 6
- Feedback bubble (bottom-right, everyone): Fault / Improvement / Suggestion and
  a message, saved to the new 1-to-1 Feedback list; on-screen thanks
- New list: group Contribute with item-level security (own items only)
- Flow 6 locks each item to Owners, emails the line manager (E13, HTML-escaped);
  on an email failure it marks the item Failed, tries a short notice and ends
  Failed; undelivered feedback shows in Needs your attention with Mark as read
- Simulations 167 (both modes), legacy builder makes seven packages; docs, guide

Co-Authored-By: Claude Opus 5.5 <noreply@anthropic.com>
Claude-Session: https://claude.ai/code/session_014y1MJU3GKp2dkeyoic78UT
</commit_message>
<xml_diff>
--- a/one-to-one/ESG-1to1-Finalisation-Guide.docx
+++ b/one-to-one/ESG-1to1-Finalisation-Guide.docx
@@ -34,7 +34,7 @@
         <w:pStyle w:val="BodyText"/>
       </w:pPr>
       <w:r>
-        <w:t xml:space="preserve">Version: system v4.2.2 (frontend) · solution 1.1.2.0 · guide dated 15-Oct-2026</w:t>
+        <w:t xml:space="preserve">Version: system v4.3.0 (frontend) · solution 1.2.0.0 · guide dated 15-Oct-2026</w:t>
       </w:r>
     </w:p>
     <w:p>
@@ -220,7 +220,7 @@
         <w:pStyle w:val="Compact"/>
       </w:pPr>
       <w:r>
-        <w:t xml:space="preserve">flows: simulated end to end, 149 checks, and 23 deliberately broken copies all caught by the validator;</w:t>
+        <w:t xml:space="preserve">flows: simulated end to end, 167 checks, and 23 deliberately broken copies all caught by the validator;</w:t>
       </w:r>
     </w:p>
     <w:p>
@@ -262,7 +262,7 @@
           <w:bCs/>
           <w:b/>
         </w:rPr>
-        <w:t xml:space="preserve">The system is fully implemented when Phase F (go-live) is done and every privacy test (P1–P24) in Phase C has passed.</w:t>
+        <w:t xml:space="preserve">The system is fully implemented when Phase F (go-live) is done and every privacy test (P1–P25) in Phase C has passed.</w:t>
       </w:r>
     </w:p>
     <w:tbl>
@@ -1042,7 +1042,7 @@
                 <w:rStyle w:val="VerbatimChar"/>
                 <w:sz w:val="18"/>
               </w:rPr>
-              <w:t xml:space="preserve">ESGOneToOne_1_1_2_0_unmanaged.zip</w:t>
+              <w:t xml:space="preserve">ESGOneToOne_1_2_0_0_unmanaged.zip</w:t>
             </w:r>
           </w:p>
         </w:tc>
@@ -1079,7 +1079,7 @@
               <w:rPr>
                 <w:sz w:val="18"/>
               </w:rPr>
-              <w:t xml:space="preserve">. Contains the six flows; the setup flow creates the lists.</w:t>
+              <w:t xml:space="preserve">. Contains the seven flows; the setup flow creates the lists.</w:t>
             </w:r>
           </w:p>
         </w:tc>
@@ -1430,7 +1430,7 @@
         <w:t xml:space="preserve"> </w:t>
       </w:r>
       <w:r>
-        <w:t xml:space="preserve">(v4.2.2). After installing, the top menu bar must show</w:t>
+        <w:t xml:space="preserve">(v4.3.0). After installing, the top menu bar must show</w:t>
       </w:r>
       <w:r>
         <w:t xml:space="preserve"> </w:t>
@@ -1440,7 +1440,7 @@
           <w:bCs/>
           <w:b/>
         </w:rPr>
-        <w:t xml:space="preserve">v4.2.2</w:t>
+        <w:t xml:space="preserve">v4.3.0</w:t>
       </w:r>
       <w:r>
         <w:t xml:space="preserve"> </w:t>
@@ -1801,7 +1801,7 @@
         <w:t xml:space="preserve"> </w:t>
       </w:r>
       <w:r>
-        <w:t xml:space="preserve">unticked and keep your connections and values. Coming from</w:t>
+        <w:t xml:space="preserve">unticked and keep your connections and values. Then run</w:t>
       </w:r>
       <w:r>
         <w:t xml:space="preserve"> </w:t>
@@ -1811,26 +1811,13 @@
           <w:bCs/>
           <w:b/>
         </w:rPr>
-        <w:t xml:space="preserve">1.0</w:t>
-      </w:r>
-      <w:r>
-        <w:t xml:space="preserve">, run</w:t>
-      </w:r>
-      <w:r>
-        <w:t xml:space="preserve"> </w:t>
-      </w:r>
-      <w:r>
-        <w:rPr>
-          <w:bCs/>
-          <w:b/>
-        </w:rPr>
         <w:t xml:space="preserve">0 Setup</w:t>
       </w:r>
       <w:r>
         <w:t xml:space="preserve"> </w:t>
       </w:r>
       <w:r>
-        <w:t xml:space="preserve">again afterwards (4.3: it adds the Wellbeing list and Reminders setting). Then check every flow is On (4.7), upload the new frontend files with</w:t>
+        <w:t xml:space="preserve">again (4.3): it adds what's missing, such as the 1-to-1 Feedback list (new in 1.2) and, from 1.0, the Wellbeing list and Reminders setting. Then check every flow is On (4.7), upload the new frontend files with</w:t>
       </w:r>
       <w:r>
         <w:t xml:space="preserve"> </w:t>
@@ -1992,7 +1979,7 @@
         <w:rPr>
           <w:rStyle w:val="VerbatimChar"/>
         </w:rPr>
-        <w:t xml:space="preserve">ESGOneToOne_1_1_2_0_unmanaged.zip</w:t>
+        <w:t xml:space="preserve">ESGOneToOne_1_2_0_0_unmanaged.zip</w:t>
       </w:r>
       <w:r>
         <w:t xml:space="preserve"> </w:t>
@@ -2947,6 +2934,26 @@
               <w:rPr>
                 <w:sz w:val="18"/>
               </w:rPr>
+              <w:t xml:space="preserve">,</w:t>
+            </w:r>
+            <w:r>
+              <w:rPr>
+                <w:sz w:val="18"/>
+              </w:rPr>
+              <w:t xml:space="preserve"> </w:t>
+            </w:r>
+            <w:r>
+              <w:rPr>
+                <w:bCs/>
+                <w:b/>
+                <w:sz w:val="18"/>
+              </w:rPr>
+              <w:t xml:space="preserve">1-to-1 Feedback</w:t>
+            </w:r>
+            <w:r>
+              <w:rPr>
+                <w:sz w:val="18"/>
+              </w:rPr>
               <w:t xml:space="preserve">, matching the agreed list specification exactly: every column type, choice, default, min/max and index,</w:t>
             </w:r>
             <w:r>
@@ -3342,6 +3349,93 @@
                 <w:sz w:val="18"/>
               </w:rPr>
               <w:t xml:space="preserve">The default band thresholds, and reminder days 20th and 27th</w:t>
+            </w:r>
+          </w:p>
+        </w:tc>
+      </w:tr>
+      <w:tr>
+        <w:tc>
+          <w:tcPr>
+            <w:tcW w:type="dxa" w:w="3139"/>
+          </w:tcPr>
+          <w:p>
+            <w:pPr>
+              <w:pStyle w:val="Compact"/>
+              <w:jc w:val="left"/>
+            </w:pPr>
+            <w:r>
+              <w:rPr>
+                <w:sz w:val="18"/>
+              </w:rPr>
+              <w:t xml:space="preserve">1-to-1 Feedback (1.2)</w:t>
+            </w:r>
+          </w:p>
+        </w:tc>
+        <w:tc>
+          <w:tcPr>
+            <w:tcW w:type="dxa" w:w="6726"/>
+          </w:tcPr>
+          <w:p>
+            <w:pPr>
+              <w:pStyle w:val="Compact"/>
+              <w:jc w:val="left"/>
+            </w:pPr>
+            <w:r>
+              <w:rPr>
+                <w:sz w:val="18"/>
+              </w:rPr>
+              <w:t xml:space="preserve">Item-level permissions: each person reads and edits only their own items;</w:t>
+            </w:r>
+            <w:r>
+              <w:rPr>
+                <w:sz w:val="18"/>
+              </w:rPr>
+              <w:t xml:space="preserve"> </w:t>
+            </w:r>
+            <w:r>
+              <w:rPr>
+                <w:rStyle w:val="VerbatimChar"/>
+                <w:sz w:val="18"/>
+              </w:rPr>
+              <w:t xml:space="preserve">1-to-1 Technicians</w:t>
+            </w:r>
+            <w:r>
+              <w:rPr>
+                <w:sz w:val="18"/>
+              </w:rPr>
+              <w:t xml:space="preserve"> </w:t>
+            </w:r>
+            <w:r>
+              <w:rPr>
+                <w:sz w:val="18"/>
+              </w:rPr>
+              <w:t xml:space="preserve">–</w:t>
+            </w:r>
+            <w:r>
+              <w:rPr>
+                <w:sz w:val="18"/>
+              </w:rPr>
+              <w:t xml:space="preserve"> </w:t>
+            </w:r>
+            <w:r>
+              <w:rPr>
+                <w:bCs/>
+                <w:b/>
+                <w:sz w:val="18"/>
+              </w:rPr>
+              <w:t xml:space="preserve">Contribute</w:t>
+            </w:r>
+            <w:r>
+              <w:rPr>
+                <w:sz w:val="18"/>
+              </w:rPr>
+              <w:t xml:space="preserve"> </w:t>
+            </w:r>
+            <w:r>
+              <w:rPr>
+                <w:sz w:val="18"/>
+              </w:rPr>
+              <w:t xml:space="preserve">on this list only</w:t>
             </w:r>
           </w:p>
         </w:tc>
@@ -3418,7 +3512,7 @@
         <w:t xml:space="preserve"> </w:t>
       </w:r>
       <w:r>
-        <w:t xml:space="preserve">shows the six lists: Technicians, Appraisal Expectations, Monthly Reviews, Manager Reviews,</w:t>
+        <w:t xml:space="preserve">shows the seven lists: Technicians, Appraisal Expectations, Monthly Reviews, Manager Reviews,</w:t>
       </w:r>
       <w:r>
         <w:t xml:space="preserve"> </w:t>
@@ -3431,7 +3525,20 @@
         <w:t xml:space="preserve">Wellbeing Assessments</w:t>
       </w:r>
       <w:r>
-        <w:t xml:space="preserve">, 1-to-1 Settings.</w:t>
+        <w:t xml:space="preserve">, 1-to-1 Settings,</w:t>
+      </w:r>
+      <w:r>
+        <w:t xml:space="preserve"> </w:t>
+      </w:r>
+      <w:r>
+        <w:rPr>
+          <w:bCs/>
+          <w:b/>
+        </w:rPr>
+        <w:t xml:space="preserve">1-to-1 Feedback</w:t>
+      </w:r>
+      <w:r>
+        <w:t xml:space="preserve">.</w:t>
       </w:r>
     </w:p>
     <w:p>
@@ -3554,7 +3661,83 @@
         <w:t xml:space="preserve"> </w:t>
       </w:r>
       <w:r>
-        <w:t xml:space="preserve">– Read.</w:t>
+        <w:t xml:space="preserve">– Read;</w:t>
+      </w:r>
+    </w:p>
+    <w:p>
+      <w:pPr>
+        <w:numPr>
+          <w:ilvl w:val="1"/>
+          <w:numId w:val="1013"/>
+        </w:numPr>
+        <w:pStyle w:val="Compact"/>
+      </w:pPr>
+      <w:r>
+        <w:rPr>
+          <w:bCs/>
+          <w:b/>
+        </w:rPr>
+        <w:t xml:space="preserve">1-to-1 Feedback</w:t>
+      </w:r>
+      <w:r>
+        <w:t xml:space="preserve"> </w:t>
+      </w:r>
+      <w:r>
+        <w:t xml:space="preserve">shows Owners</w:t>
+      </w:r>
+      <w:r>
+        <w:t xml:space="preserve"> </w:t>
+      </w:r>
+      <w:r>
+        <w:rPr>
+          <w:bCs/>
+          <w:b/>
+        </w:rPr>
+        <w:t xml:space="preserve">and</w:t>
+      </w:r>
+      <w:r>
+        <w:t xml:space="preserve"> </w:t>
+      </w:r>
+      <w:r>
+        <w:rPr>
+          <w:rStyle w:val="VerbatimChar"/>
+        </w:rPr>
+        <w:t xml:space="preserve">1-to-1 Technicians</w:t>
+      </w:r>
+      <w:r>
+        <w:t xml:space="preserve"> </w:t>
+      </w:r>
+      <w:r>
+        <w:t xml:space="preserve">–</w:t>
+      </w:r>
+      <w:r>
+        <w:t xml:space="preserve"> </w:t>
+      </w:r>
+      <w:r>
+        <w:rPr>
+          <w:bCs/>
+          <w:b/>
+        </w:rPr>
+        <w:t xml:space="preserve">Contribute</w:t>
+      </w:r>
+      <w:r>
+        <w:t xml:space="preserve">; its Advanced settings →</w:t>
+      </w:r>
+      <w:r>
+        <w:t xml:space="preserve"> </w:t>
+      </w:r>
+      <w:r>
+        <w:rPr>
+          <w:iCs/>
+          <w:i/>
+        </w:rPr>
+        <w:t xml:space="preserve">Item-level permissions</w:t>
+      </w:r>
+      <w:r>
+        <w:t xml:space="preserve"> </w:t>
+      </w:r>
+      <w:r>
+        <w:t xml:space="preserve">are "Read items that were created by the user" and "Create items and edit items that were created by the user".</w:t>
       </w:r>
     </w:p>
     <w:p>
@@ -4279,7 +4462,7 @@
           <w:bCs/>
           <w:b/>
         </w:rPr>
-        <w:t xml:space="preserve">v4.2.2</w:t>
+        <w:t xml:space="preserve">v4.3.0</w:t>
       </w:r>
       <w:r>
         <w:t xml:space="preserve"> </w:t>
@@ -4297,6 +4480,34 @@
         <w:pStyle w:val="Compact"/>
       </w:pPr>
       <w:r>
+        <w:t xml:space="preserve">a round 💬</w:t>
+      </w:r>
+      <w:r>
+        <w:t xml:space="preserve"> </w:t>
+      </w:r>
+      <w:r>
+        <w:rPr>
+          <w:bCs/>
+          <w:b/>
+        </w:rPr>
+        <w:t xml:space="preserve">Feedback</w:t>
+      </w:r>
+      <w:r>
+        <w:t xml:space="preserve"> </w:t>
+      </w:r>
+      <w:r>
+        <w:t xml:space="preserve">button at the bottom-right;</w:t>
+      </w:r>
+    </w:p>
+    <w:p>
+      <w:pPr>
+        <w:numPr>
+          <w:ilvl w:val="1"/>
+          <w:numId w:val="1018"/>
+        </w:numPr>
+        <w:pStyle w:val="Compact"/>
+      </w:pPr>
+      <w:r>
         <w:rPr>
           <w:bCs/>
           <w:b/>
@@ -4583,13 +4794,13 @@
       </w:r>
     </w:p>
     <w:bookmarkEnd w:id="28"/>
-    <w:bookmarkStart w:id="29" w:name="X8016190215d0f461a77af40f991fdb9d4705529"/>
+    <w:bookmarkStart w:id="29" w:name="Xcf92c77853bdb9b0d7322c9414b1489ecbf7edf"/>
     <w:p>
       <w:pPr>
         <w:pStyle w:val="Heading3"/>
       </w:pPr>
       <w:r>
-        <w:t xml:space="preserve">4.7 Turn on flows 1 to 5</w:t>
+        <w:t xml:space="preserve">4.7 Turn on flows 1 to 6</w:t>
       </w:r>
     </w:p>
     <w:p>
@@ -4722,6 +4933,28 @@
           <w:bCs/>
           <w:b/>
         </w:rPr>
+        <w:t xml:space="preserve">6 Feedback</w:t>
+      </w:r>
+      <w:r>
+        <w:t xml:space="preserve"> </w:t>
+      </w:r>
+      <w:r>
+        <w:t xml:space="preserve">– emails you what people send with the 💬 Feedback bubble</w:t>
+      </w:r>
+    </w:p>
+    <w:p>
+      <w:pPr>
+        <w:numPr>
+          <w:ilvl w:val="1"/>
+          <w:numId w:val="1022"/>
+        </w:numPr>
+        <w:pStyle w:val="Compact"/>
+      </w:pPr>
+      <w:r>
+        <w:rPr>
+          <w:bCs/>
+          <w:b/>
+        </w:rPr>
         <w:t xml:space="preserve">1 Daily scheduler</w:t>
       </w:r>
       <w:r>
@@ -5136,7 +5369,7 @@
         <w:t xml:space="preserve">On</w:t>
       </w:r>
       <w:r>
-        <w:t xml:space="preserve">. Make sure flows 1–5 are</w:t>
+        <w:t xml:space="preserve">. Make sure flows 1–6 are</w:t>
       </w:r>
       <w:r>
         <w:t xml:space="preserve"> </w:t>
@@ -6119,7 +6352,7 @@
           <w:bCs/>
           <w:b/>
         </w:rPr>
-        <w:t xml:space="preserve">As Test B:</w:t>
+        <w:t xml:space="preserve">Feedback (tests F41, P25):</w:t>
       </w:r>
     </w:p>
     <w:p>
@@ -6131,7 +6364,72 @@
         <w:pStyle w:val="Compact"/>
       </w:pPr>
       <w:r>
-        <w:t xml:space="preserve">nothing of Test A's is visible anywhere, including Wellbeing;</w:t>
+        <w:rPr>
+          <w:bCs/>
+          <w:b/>
+        </w:rPr>
+        <w:t xml:space="preserve">As Test A:</w:t>
+      </w:r>
+      <w:r>
+        <w:t xml:space="preserve"> </w:t>
+      </w:r>
+      <w:r>
+        <w:t xml:space="preserve">click 💬</w:t>
+      </w:r>
+      <w:r>
+        <w:t xml:space="preserve"> </w:t>
+      </w:r>
+      <w:r>
+        <w:rPr>
+          <w:bCs/>
+          <w:b/>
+        </w:rPr>
+        <w:t xml:space="preserve">Feedback</w:t>
+      </w:r>
+      <w:r>
+        <w:t xml:space="preserve"> </w:t>
+      </w:r>
+      <w:r>
+        <w:t xml:space="preserve">(bottom-right) →</w:t>
+      </w:r>
+      <w:r>
+        <w:t xml:space="preserve"> </w:t>
+      </w:r>
+      <w:r>
+        <w:rPr>
+          <w:bCs/>
+          <w:b/>
+        </w:rPr>
+        <w:t xml:space="preserve">Fault</w:t>
+      </w:r>
+      <w:r>
+        <w:t xml:space="preserve"> </w:t>
+      </w:r>
+      <w:r>
+        <w:t xml:space="preserve">→ type a short message →</w:t>
+      </w:r>
+      <w:r>
+        <w:t xml:space="preserve"> </w:t>
+      </w:r>
+      <w:r>
+        <w:rPr>
+          <w:bCs/>
+          <w:b/>
+        </w:rPr>
+        <w:t xml:space="preserve">Send</w:t>
+      </w:r>
+      <w:r>
+        <w:t xml:space="preserve">. It says</w:t>
+      </w:r>
+      <w:r>
+        <w:t xml:space="preserve"> </w:t>
+      </w:r>
+      <w:r>
+        <w:rPr>
+          <w:iCs/>
+          <w:i/>
+        </w:rPr>
+        <w:t xml:space="preserve">"Thank you. Your feedback has been submitted to your Team Leader."</w:t>
       </w:r>
     </w:p>
     <w:p>
@@ -6143,6 +6441,78 @@
         <w:pStyle w:val="Compact"/>
       </w:pPr>
       <w:r>
+        <w:rPr>
+          <w:bCs/>
+          <w:b/>
+        </w:rPr>
+        <w:t xml:space="preserve">As you:</w:t>
+      </w:r>
+      <w:r>
+        <w:t xml:space="preserve"> </w:t>
+      </w:r>
+      <w:r>
+        <w:t xml:space="preserve">within about 5 minutes</w:t>
+      </w:r>
+      <w:r>
+        <w:t xml:space="preserve"> </w:t>
+      </w:r>
+      <w:r>
+        <w:rPr>
+          <w:iCs/>
+          <w:i/>
+        </w:rPr>
+        <w:t xml:space="preserve">"1-to-1 feedback (Fault): …"</w:t>
+      </w:r>
+      <w:r>
+        <w:t xml:space="preserve"> </w:t>
+      </w:r>
+      <w:r>
+        <w:t xml:space="preserve">arrives, naming Test A, the page and the version.</w:t>
+      </w:r>
+    </w:p>
+    <w:p>
+      <w:pPr>
+        <w:numPr>
+          <w:ilvl w:val="0"/>
+          <w:numId w:val="1026"/>
+        </w:numPr>
+        <w:pStyle w:val="Compact"/>
+      </w:pPr>
+      <w:r>
+        <w:t xml:space="preserve">☐</w:t>
+      </w:r>
+      <w:r>
+        <w:t xml:space="preserve"> </w:t>
+      </w:r>
+      <w:r>
+        <w:rPr>
+          <w:bCs/>
+          <w:b/>
+        </w:rPr>
+        <w:t xml:space="preserve">As Test B:</w:t>
+      </w:r>
+    </w:p>
+    <w:p>
+      <w:pPr>
+        <w:numPr>
+          <w:ilvl w:val="1"/>
+          <w:numId w:val="1033"/>
+        </w:numPr>
+        <w:pStyle w:val="Compact"/>
+      </w:pPr>
+      <w:r>
+        <w:t xml:space="preserve">nothing of Test A's is visible anywhere, including Wellbeing and Test A's feedback;</w:t>
+      </w:r>
+    </w:p>
+    <w:p>
+      <w:pPr>
+        <w:numPr>
+          <w:ilvl w:val="1"/>
+          <w:numId w:val="1033"/>
+        </w:numPr>
+        <w:pStyle w:val="Compact"/>
+      </w:pPr>
+      <w:r>
         <w:t xml:space="preserve">opening Test A's link (</w:t>
       </w:r>
       <w:r>
@@ -6226,80 +6596,6 @@
           <w:b/>
         </w:rPr>
         <w:t xml:space="preserve">Pass mark:</w:t>
-      </w:r>
-    </w:p>
-    <w:p>
-      <w:pPr>
-        <w:numPr>
-          <w:ilvl w:val="0"/>
-          <w:numId w:val="1033"/>
-        </w:numPr>
-        <w:pStyle w:val="Compact"/>
-      </w:pPr>
-      <w:r>
-        <w:t xml:space="preserve">Every</w:t>
-      </w:r>
-      <w:r>
-        <w:t xml:space="preserve"> </w:t>
-      </w:r>
-      <w:r>
-        <w:rPr>
-          <w:bCs/>
-          <w:b/>
-        </w:rPr>
-        <w:t xml:space="preserve">P</w:t>
-      </w:r>
-      <w:r>
-        <w:t xml:space="preserve"> </w:t>
-      </w:r>
-      <w:r>
-        <w:t xml:space="preserve">test is mandatory: any failure</w:t>
-      </w:r>
-      <w:r>
-        <w:t xml:space="preserve"> </w:t>
-      </w:r>
-      <w:r>
-        <w:rPr>
-          <w:bCs/>
-          <w:b/>
-        </w:rPr>
-        <w:t xml:space="preserve">blocks go-live</w:t>
-      </w:r>
-      <w:r>
-        <w:t xml:space="preserve"> </w:t>
-      </w:r>
-      <w:r>
-        <w:t xml:space="preserve">until fixed (§11.3).</w:t>
-      </w:r>
-    </w:p>
-    <w:p>
-      <w:pPr>
-        <w:numPr>
-          <w:ilvl w:val="0"/>
-          <w:numId w:val="1033"/>
-        </w:numPr>
-        <w:pStyle w:val="Compact"/>
-      </w:pPr>
-      <w:r>
-        <w:t xml:space="preserve">F tests must pass too.</w:t>
-      </w:r>
-    </w:p>
-    <w:p>
-      <w:pPr>
-        <w:pStyle w:val="FirstParagraph"/>
-      </w:pPr>
-      <w:r>
-        <w:rPr>
-          <w:bCs/>
-          <w:b/>
-        </w:rPr>
-        <w:t xml:space="preserve">Test date.</w:t>
-      </w:r>
-      <w:r>
-        <w:t xml:space="preserve"> </w:t>
-      </w:r>
-      <w:r>
-        <w:t xml:space="preserve">Tests F13–F20 change the date Flow 1 believes it is:</w:t>
       </w:r>
     </w:p>
     <w:p>
@@ -6311,7 +6607,7 @@
         <w:pStyle w:val="Compact"/>
       </w:pPr>
       <w:r>
-        <w:t xml:space="preserve">Open Flow 1 →</w:t>
+        <w:t xml:space="preserve">Every</w:t>
       </w:r>
       <w:r>
         <w:t xml:space="preserve"> </w:t>
@@ -6321,13 +6617,13 @@
           <w:bCs/>
           <w:b/>
         </w:rPr>
-        <w:t xml:space="preserve">Edit</w:t>
-      </w:r>
-      <w:r>
-        <w:t xml:space="preserve"> </w:t>
-      </w:r>
-      <w:r>
-        <w:t xml:space="preserve">→</w:t>
+        <w:t xml:space="preserve">P</w:t>
+      </w:r>
+      <w:r>
+        <w:t xml:space="preserve"> </w:t>
+      </w:r>
+      <w:r>
+        <w:t xml:space="preserve">test is mandatory: any failure</w:t>
       </w:r>
       <w:r>
         <w:t xml:space="preserve"> </w:t>
@@ -6337,25 +6633,13 @@
           <w:bCs/>
           <w:b/>
         </w:rPr>
-        <w:t xml:space="preserve">Initialize varTestDate</w:t>
-      </w:r>
-      <w:r>
-        <w:t xml:space="preserve"> </w:t>
-      </w:r>
-      <w:r>
-        <w:t xml:space="preserve">→ set the value (e.g.</w:t>
-      </w:r>
-      <w:r>
-        <w:t xml:space="preserve"> </w:t>
-      </w:r>
-      <w:r>
-        <w:rPr>
-          <w:rStyle w:val="VerbatimChar"/>
-        </w:rPr>
-        <w:t xml:space="preserve">2026-11-20T07:00:00</w:t>
-      </w:r>
-      <w:r>
-        <w:t xml:space="preserve">).</w:t>
+        <w:t xml:space="preserve">blocks go-live</w:t>
+      </w:r>
+      <w:r>
+        <w:t xml:space="preserve"> </w:t>
+      </w:r>
+      <w:r>
+        <w:t xml:space="preserve">until fixed (§11.3).</w:t>
       </w:r>
     </w:p>
     <w:p>
@@ -6367,43 +6651,7 @@
         <w:pStyle w:val="Compact"/>
       </w:pPr>
       <w:r>
-        <w:rPr>
-          <w:bCs/>
-          <w:b/>
-        </w:rPr>
-        <w:t xml:space="preserve">Save</w:t>
-      </w:r>
-      <w:r>
-        <w:t xml:space="preserve">, then</w:t>
-      </w:r>
-      <w:r>
-        <w:t xml:space="preserve"> </w:t>
-      </w:r>
-      <w:r>
-        <w:rPr>
-          <w:bCs/>
-          <w:b/>
-        </w:rPr>
-        <w:t xml:space="preserve">Run</w:t>
-      </w:r>
-      <w:r>
-        <w:t xml:space="preserve">.</w:t>
-      </w:r>
-    </w:p>
-    <w:p>
-      <w:pPr>
-        <w:numPr>
-          <w:ilvl w:val="0"/>
-          <w:numId w:val="1034"/>
-        </w:numPr>
-        <w:pStyle w:val="Compact"/>
-      </w:pPr>
-      <w:r>
-        <w:rPr>
-          <w:bCs/>
-          <w:b/>
-        </w:rPr>
-        <w:t xml:space="preserve">Clear the value afterwards and save.</w:t>
+        <w:t xml:space="preserve">F tests must pass too.</w:t>
       </w:r>
     </w:p>
     <w:p>
@@ -6415,25 +6663,13 @@
           <w:bCs/>
           <w:b/>
         </w:rPr>
-        <w:t xml:space="preserve">How to record results.</w:t>
-      </w:r>
-      <w:r>
-        <w:t xml:space="preserve"> </w:t>
-      </w:r>
-      <w:r>
-        <w:t xml:space="preserve">For each test, record Pass or Fail, the date, the tester and a screenshot.</w:t>
-      </w:r>
-    </w:p>
-    <w:p>
-      <w:pPr>
-        <w:pStyle w:val="BodyText"/>
-      </w:pPr>
-      <w:r>
-        <w:rPr>
-          <w:bCs/>
-          <w:b/>
-        </w:rPr>
-        <w:t xml:space="preserve">How to run the P (privacy) tests</w:t>
+        <w:t xml:space="preserve">Test date.</w:t>
+      </w:r>
+      <w:r>
+        <w:t xml:space="preserve"> </w:t>
+      </w:r>
+      <w:r>
+        <w:t xml:space="preserve">Tests F13–F20 change the date Flow 1 believes it is:</w:t>
       </w:r>
     </w:p>
     <w:p>
@@ -6445,17 +6681,51 @@
         <w:pStyle w:val="Compact"/>
       </w:pPr>
       <w:r>
+        <w:t xml:space="preserve">Open Flow 1 →</w:t>
+      </w:r>
+      <w:r>
+        <w:t xml:space="preserve"> </w:t>
+      </w:r>
+      <w:r>
         <w:rPr>
           <w:bCs/>
           <w:b/>
         </w:rPr>
-        <w:t xml:space="preserve">Mandatory (release-blocking):</w:t>
-      </w:r>
-      <w:r>
-        <w:t xml:space="preserve"> </w:t>
-      </w:r>
-      <w:r>
-        <w:t xml:space="preserve">every F test, and every P test marked. Any failure stops progression.</w:t>
+        <w:t xml:space="preserve">Edit</w:t>
+      </w:r>
+      <w:r>
+        <w:t xml:space="preserve"> </w:t>
+      </w:r>
+      <w:r>
+        <w:t xml:space="preserve">→</w:t>
+      </w:r>
+      <w:r>
+        <w:t xml:space="preserve"> </w:t>
+      </w:r>
+      <w:r>
+        <w:rPr>
+          <w:bCs/>
+          <w:b/>
+        </w:rPr>
+        <w:t xml:space="preserve">Initialize varTestDate</w:t>
+      </w:r>
+      <w:r>
+        <w:t xml:space="preserve"> </w:t>
+      </w:r>
+      <w:r>
+        <w:t xml:space="preserve">→ set the value (e.g.</w:t>
+      </w:r>
+      <w:r>
+        <w:t xml:space="preserve"> </w:t>
+      </w:r>
+      <w:r>
+        <w:rPr>
+          <w:rStyle w:val="VerbatimChar"/>
+        </w:rPr>
+        <w:t xml:space="preserve">2026-11-20T07:00:00</w:t>
+      </w:r>
+      <w:r>
+        <w:t xml:space="preserve">).</w:t>
       </w:r>
     </w:p>
     <w:p>
@@ -6471,29 +6741,10 @@
           <w:bCs/>
           <w:b/>
         </w:rPr>
-        <w:t xml:space="preserve">Informational:</w:t>
-      </w:r>
-      <w:r>
-        <w:t xml:space="preserve"> </w:t>
-      </w:r>
-      <w:r>
-        <w:t xml:space="preserve">tests that record a fact rather than check a requirement, such as whether</w:t>
-      </w:r>
-      <w:r>
-        <w:t xml:space="preserve"> </w:t>
-      </w:r>
-      <w:r>
-        <w:rPr>
-          <w:iCs/>
-          <w:i/>
-        </w:rPr>
-        <w:t xml:space="preserve">Modified By</w:t>
-      </w:r>
-      <w:r>
-        <w:t xml:space="preserve"> </w:t>
-      </w:r>
-      <w:r>
-        <w:t xml:space="preserve">can be forged (P9, first part).</w:t>
+        <w:t xml:space="preserve">Save</w:t>
+      </w:r>
+      <w:r>
+        <w:t xml:space="preserve">, then</w:t>
       </w:r>
       <w:r>
         <w:t xml:space="preserve"> </w:t>
@@ -6503,13 +6754,10 @@
           <w:bCs/>
           <w:b/>
         </w:rPr>
-        <w:t xml:space="preserve">If an informational result reveals an exploitable weakness, it blocks progression just like a mandatory failure</w:t>
-      </w:r>
-      <w:r>
-        <w:t xml:space="preserve"> </w:t>
-      </w:r>
-      <w:r>
-        <w:t xml:space="preserve">until it's fixed, or formally accepted by the TL and recorded in J.3.</w:t>
+        <w:t xml:space="preserve">Run</w:t>
+      </w:r>
+      <w:r>
+        <w:t xml:space="preserve">.</w:t>
       </w:r>
     </w:p>
     <w:p>
@@ -6525,52 +6773,44 @@
           <w:bCs/>
           <w:b/>
         </w:rPr>
-        <w:t xml:space="preserve">Who runs what:</w:t>
-      </w:r>
-      <w:r>
-        <w:t xml:space="preserve"> </w:t>
-      </w:r>
-      <w:r>
-        <w:t xml:space="preserve">run each P test</w:t>
-      </w:r>
-      <w:r>
-        <w:t xml:space="preserve"> </w:t>
-      </w:r>
+        <w:t xml:space="preserve">Clear the value afterwards and save.</w:t>
+      </w:r>
+    </w:p>
+    <w:p>
+      <w:pPr>
+        <w:pStyle w:val="FirstParagraph"/>
+      </w:pPr>
       <w:r>
         <w:rPr>
           <w:bCs/>
           <w:b/>
         </w:rPr>
-        <w:t xml:space="preserve">first as the TL</w:t>
-      </w:r>
-      <w:r>
-        <w:t xml:space="preserve"> </w:t>
-      </w:r>
-      <w:r>
-        <w:t xml:space="preserve">(it should succeed, which proves the request is valid),</w:t>
-      </w:r>
-      <w:r>
-        <w:t xml:space="preserve"> </w:t>
-      </w:r>
+        <w:t xml:space="preserve">How to record results.</w:t>
+      </w:r>
+      <w:r>
+        <w:t xml:space="preserve"> </w:t>
+      </w:r>
+      <w:r>
+        <w:t xml:space="preserve">For each test, record Pass or Fail, the date, the tester and a screenshot.</w:t>
+      </w:r>
+    </w:p>
+    <w:p>
+      <w:pPr>
+        <w:pStyle w:val="BodyText"/>
+      </w:pPr>
       <w:r>
         <w:rPr>
           <w:bCs/>
           <w:b/>
         </w:rPr>
-        <w:t xml:space="preserve">then as Test A</w:t>
-      </w:r>
-      <w:r>
-        <w:t xml:space="preserve"> </w:t>
-      </w:r>
-      <w:r>
-        <w:t xml:space="preserve">(it must fail).</w:t>
+        <w:t xml:space="preserve">How to run the P (privacy) tests</w:t>
       </w:r>
     </w:p>
     <w:p>
       <w:pPr>
         <w:numPr>
           <w:ilvl w:val="0"/>
-          <w:numId w:val="1035"/>
+          <w:numId w:val="1036"/>
         </w:numPr>
         <w:pStyle w:val="Compact"/>
       </w:pPr>
@@ -6579,112 +6819,20 @@
           <w:bCs/>
           <w:b/>
         </w:rPr>
-        <w:t xml:space="preserve">API attempts:</w:t>
-      </w:r>
-      <w:r>
-        <w:t xml:space="preserve"> </w:t>
-      </w:r>
-      <w:r>
-        <w:t xml:space="preserve">each tester makes their own</w:t>
-      </w:r>
-      <w:r>
-        <w:t xml:space="preserve"> </w:t>
-      </w:r>
-      <w:r>
-        <w:rPr>
-          <w:iCs/>
-          <w:i/>
-        </w:rPr>
-        <w:t xml:space="preserve">Instant</w:t>
-      </w:r>
-      <w:r>
-        <w:t xml:space="preserve"> </w:t>
-      </w:r>
-      <w:r>
-        <w:t xml:space="preserve">flow named</w:t>
-      </w:r>
-      <w:r>
-        <w:t xml:space="preserve"> </w:t>
-      </w:r>
-      <w:r>
-        <w:rPr>
-          <w:rStyle w:val="VerbatimChar"/>
-        </w:rPr>
-        <w:t xml:space="preserve">Privacy test</w:t>
-      </w:r>
-      <w:r>
-        <w:t xml:space="preserve"> </w:t>
-      </w:r>
-      <w:r>
-        <w:t xml:space="preserve">with</w:t>
-      </w:r>
-      <w:r>
-        <w:t xml:space="preserve"> </w:t>
-      </w:r>
-      <w:r>
-        <w:rPr>
-          <w:bCs/>
-          <w:b/>
-        </w:rPr>
-        <w:t xml:space="preserve">Manually trigger a flow</w:t>
-      </w:r>
-      <w:r>
-        <w:t xml:space="preserve"> </w:t>
-      </w:r>
-      <w:r>
-        <w:t xml:space="preserve">and one</w:t>
-      </w:r>
-      <w:r>
-        <w:t xml:space="preserve"> </w:t>
-      </w:r>
-      <w:r>
-        <w:rPr>
-          <w:bCs/>
-          <w:b/>
-        </w:rPr>
-        <w:t xml:space="preserve">Send an HTTP request to SharePoint</w:t>
-      </w:r>
-      <w:r>
-        <w:t xml:space="preserve"> </w:t>
-      </w:r>
-      <w:r>
-        <w:t xml:space="preserve">action. Under Site Address choose</w:t>
-      </w:r>
-      <w:r>
-        <w:t xml:space="preserve"> </w:t>
-      </w:r>
-      <w:r>
-        <w:rPr>
-          <w:bCs/>
-          <w:b/>
-        </w:rPr>
-        <w:t xml:space="preserve">Enter custom value</w:t>
-      </w:r>
-      <w:r>
-        <w:t xml:space="preserve"> </w:t>
-      </w:r>
-      <w:r>
-        <w:t xml:space="preserve">and paste the site URL. Change the Method, Uri and Body for each test and run it with</w:t>
-      </w:r>
-      <w:r>
-        <w:t xml:space="preserve"> </w:t>
-      </w:r>
-      <w:r>
-        <w:rPr>
-          <w:bCs/>
-          <w:b/>
-        </w:rPr>
-        <w:t xml:space="preserve">Test</w:t>
-      </w:r>
-      <w:r>
-        <w:t xml:space="preserve">.</w:t>
+        <w:t xml:space="preserve">Mandatory (release-blocking):</w:t>
+      </w:r>
+      <w:r>
+        <w:t xml:space="preserve"> </w:t>
+      </w:r>
+      <w:r>
+        <w:t xml:space="preserve">every F test, and every P test marked. Any failure stops progression.</w:t>
       </w:r>
     </w:p>
     <w:p>
       <w:pPr>
         <w:numPr>
           <w:ilvl w:val="0"/>
-          <w:numId w:val="1035"/>
+          <w:numId w:val="1036"/>
         </w:numPr>
         <w:pStyle w:val="Compact"/>
       </w:pPr>
@@ -6693,13 +6841,29 @@
           <w:bCs/>
           <w:b/>
         </w:rPr>
-        <w:t xml:space="preserve">What counts as denied:</w:t>
-      </w:r>
-      <w:r>
-        <w:t xml:space="preserve"> </w:t>
-      </w:r>
-      <w:r>
-        <w:t xml:space="preserve">status 401, 403 or 404, or a response in which each field reports an error.</w:t>
+        <w:t xml:space="preserve">Informational:</w:t>
+      </w:r>
+      <w:r>
+        <w:t xml:space="preserve"> </w:t>
+      </w:r>
+      <w:r>
+        <w:t xml:space="preserve">tests that record a fact rather than check a requirement, such as whether</w:t>
+      </w:r>
+      <w:r>
+        <w:t xml:space="preserve"> </w:t>
+      </w:r>
+      <w:r>
+        <w:rPr>
+          <w:iCs/>
+          <w:i/>
+        </w:rPr>
+        <w:t xml:space="preserve">Modified By</w:t>
+      </w:r>
+      <w:r>
+        <w:t xml:space="preserve"> </w:t>
+      </w:r>
+      <w:r>
+        <w:t xml:space="preserve">can be forged (P9, first part).</w:t>
       </w:r>
       <w:r>
         <w:t xml:space="preserve"> </w:t>
@@ -6709,14 +6873,220 @@
           <w:bCs/>
           <w:b/>
         </w:rPr>
-        <w:t xml:space="preserve">Always confirm in the list that nothing changed.</w:t>
+        <w:t xml:space="preserve">If an informational result reveals an exploitable weakness, it blocks progression just like a mandatory failure</w:t>
+      </w:r>
+      <w:r>
+        <w:t xml:space="preserve"> </w:t>
+      </w:r>
+      <w:r>
+        <w:t xml:space="preserve">until it's fixed, or formally accepted by the TL and recorded in J.3.</w:t>
       </w:r>
     </w:p>
     <w:p>
       <w:pPr>
         <w:numPr>
           <w:ilvl w:val="0"/>
-          <w:numId w:val="1035"/>
+          <w:numId w:val="1036"/>
+        </w:numPr>
+        <w:pStyle w:val="Compact"/>
+      </w:pPr>
+      <w:r>
+        <w:rPr>
+          <w:bCs/>
+          <w:b/>
+        </w:rPr>
+        <w:t xml:space="preserve">Who runs what:</w:t>
+      </w:r>
+      <w:r>
+        <w:t xml:space="preserve"> </w:t>
+      </w:r>
+      <w:r>
+        <w:t xml:space="preserve">run each P test</w:t>
+      </w:r>
+      <w:r>
+        <w:t xml:space="preserve"> </w:t>
+      </w:r>
+      <w:r>
+        <w:rPr>
+          <w:bCs/>
+          <w:b/>
+        </w:rPr>
+        <w:t xml:space="preserve">first as the TL</w:t>
+      </w:r>
+      <w:r>
+        <w:t xml:space="preserve"> </w:t>
+      </w:r>
+      <w:r>
+        <w:t xml:space="preserve">(it should succeed, which proves the request is valid),</w:t>
+      </w:r>
+      <w:r>
+        <w:t xml:space="preserve"> </w:t>
+      </w:r>
+      <w:r>
+        <w:rPr>
+          <w:bCs/>
+          <w:b/>
+        </w:rPr>
+        <w:t xml:space="preserve">then as Test A</w:t>
+      </w:r>
+      <w:r>
+        <w:t xml:space="preserve"> </w:t>
+      </w:r>
+      <w:r>
+        <w:t xml:space="preserve">(it must fail).</w:t>
+      </w:r>
+    </w:p>
+    <w:p>
+      <w:pPr>
+        <w:numPr>
+          <w:ilvl w:val="0"/>
+          <w:numId w:val="1036"/>
+        </w:numPr>
+        <w:pStyle w:val="Compact"/>
+      </w:pPr>
+      <w:r>
+        <w:rPr>
+          <w:bCs/>
+          <w:b/>
+        </w:rPr>
+        <w:t xml:space="preserve">API attempts:</w:t>
+      </w:r>
+      <w:r>
+        <w:t xml:space="preserve"> </w:t>
+      </w:r>
+      <w:r>
+        <w:t xml:space="preserve">each tester makes their own</w:t>
+      </w:r>
+      <w:r>
+        <w:t xml:space="preserve"> </w:t>
+      </w:r>
+      <w:r>
+        <w:rPr>
+          <w:iCs/>
+          <w:i/>
+        </w:rPr>
+        <w:t xml:space="preserve">Instant</w:t>
+      </w:r>
+      <w:r>
+        <w:t xml:space="preserve"> </w:t>
+      </w:r>
+      <w:r>
+        <w:t xml:space="preserve">flow named</w:t>
+      </w:r>
+      <w:r>
+        <w:t xml:space="preserve"> </w:t>
+      </w:r>
+      <w:r>
+        <w:rPr>
+          <w:rStyle w:val="VerbatimChar"/>
+        </w:rPr>
+        <w:t xml:space="preserve">Privacy test</w:t>
+      </w:r>
+      <w:r>
+        <w:t xml:space="preserve"> </w:t>
+      </w:r>
+      <w:r>
+        <w:t xml:space="preserve">with</w:t>
+      </w:r>
+      <w:r>
+        <w:t xml:space="preserve"> </w:t>
+      </w:r>
+      <w:r>
+        <w:rPr>
+          <w:bCs/>
+          <w:b/>
+        </w:rPr>
+        <w:t xml:space="preserve">Manually trigger a flow</w:t>
+      </w:r>
+      <w:r>
+        <w:t xml:space="preserve"> </w:t>
+      </w:r>
+      <w:r>
+        <w:t xml:space="preserve">and one</w:t>
+      </w:r>
+      <w:r>
+        <w:t xml:space="preserve"> </w:t>
+      </w:r>
+      <w:r>
+        <w:rPr>
+          <w:bCs/>
+          <w:b/>
+        </w:rPr>
+        <w:t xml:space="preserve">Send an HTTP request to SharePoint</w:t>
+      </w:r>
+      <w:r>
+        <w:t xml:space="preserve"> </w:t>
+      </w:r>
+      <w:r>
+        <w:t xml:space="preserve">action. Under Site Address choose</w:t>
+      </w:r>
+      <w:r>
+        <w:t xml:space="preserve"> </w:t>
+      </w:r>
+      <w:r>
+        <w:rPr>
+          <w:bCs/>
+          <w:b/>
+        </w:rPr>
+        <w:t xml:space="preserve">Enter custom value</w:t>
+      </w:r>
+      <w:r>
+        <w:t xml:space="preserve"> </w:t>
+      </w:r>
+      <w:r>
+        <w:t xml:space="preserve">and paste the site URL. Change the Method, Uri and Body for each test and run it with</w:t>
+      </w:r>
+      <w:r>
+        <w:t xml:space="preserve"> </w:t>
+      </w:r>
+      <w:r>
+        <w:rPr>
+          <w:bCs/>
+          <w:b/>
+        </w:rPr>
+        <w:t xml:space="preserve">Test</w:t>
+      </w:r>
+      <w:r>
+        <w:t xml:space="preserve">.</w:t>
+      </w:r>
+    </w:p>
+    <w:p>
+      <w:pPr>
+        <w:numPr>
+          <w:ilvl w:val="0"/>
+          <w:numId w:val="1036"/>
+        </w:numPr>
+        <w:pStyle w:val="Compact"/>
+      </w:pPr>
+      <w:r>
+        <w:rPr>
+          <w:bCs/>
+          <w:b/>
+        </w:rPr>
+        <w:t xml:space="preserve">What counts as denied:</w:t>
+      </w:r>
+      <w:r>
+        <w:t xml:space="preserve"> </w:t>
+      </w:r>
+      <w:r>
+        <w:t xml:space="preserve">status 401, 403 or 404, or a response in which each field reports an error.</w:t>
+      </w:r>
+      <w:r>
+        <w:t xml:space="preserve"> </w:t>
+      </w:r>
+      <w:r>
+        <w:rPr>
+          <w:bCs/>
+          <w:b/>
+        </w:rPr>
+        <w:t xml:space="preserve">Always confirm in the list that nothing changed.</w:t>
+      </w:r>
+    </w:p>
+    <w:p>
+      <w:pPr>
+        <w:numPr>
+          <w:ilvl w:val="0"/>
+          <w:numId w:val="1036"/>
         </w:numPr>
         <w:pStyle w:val="Compact"/>
       </w:pPr>
@@ -7073,13 +7443,13 @@
         </w:tc>
       </w:tr>
     </w:tbl>
-    <w:bookmarkStart w:id="33" w:name="Xc586228bed49990e5096e069717f53e75a93fe6"/>
+    <w:bookmarkStart w:id="33" w:name="X29f1185c5b7a44551d9087d21e6bf3fb17d63d6"/>
     <w:p>
       <w:pPr>
         <w:pStyle w:val="Heading3"/>
       </w:pPr>
       <w:r>
-        <w:t xml:space="preserve">6.1 Functional tests (F1–F40)</w:t>
+        <w:t xml:space="preserve">6.1 Functional tests (F1–F42)</w:t>
       </w:r>
     </w:p>
     <w:tbl>
@@ -11551,15 +11921,327 @@
           </w:p>
         </w:tc>
       </w:tr>
+      <w:tr>
+        <w:tc>
+          <w:tcPr>
+            <w:tcW w:type="dxa" w:w="737"/>
+          </w:tcPr>
+          <w:p>
+            <w:pPr>
+              <w:pStyle w:val="Compact"/>
+              <w:jc w:val="left"/>
+            </w:pPr>
+            <w:r>
+              <w:rPr>
+                <w:sz w:val="18"/>
+              </w:rPr>
+              <w:t xml:space="preserve">F41 (v4.3)</w:t>
+            </w:r>
+          </w:p>
+        </w:tc>
+        <w:tc>
+          <w:tcPr>
+            <w:tcW w:type="dxa" w:w="3118"/>
+          </w:tcPr>
+          <w:p>
+            <w:pPr>
+              <w:pStyle w:val="Compact"/>
+              <w:jc w:val="left"/>
+            </w:pPr>
+            <w:r>
+              <w:rPr>
+                <w:sz w:val="18"/>
+              </w:rPr>
+              <w:t xml:space="preserve">As A: 💬</w:t>
+            </w:r>
+            <w:r>
+              <w:rPr>
+                <w:sz w:val="18"/>
+              </w:rPr>
+              <w:t xml:space="preserve"> </w:t>
+            </w:r>
+            <w:r>
+              <w:rPr>
+                <w:bCs/>
+                <w:b/>
+                <w:sz w:val="18"/>
+              </w:rPr>
+              <w:t xml:space="preserve">Feedback</w:t>
+            </w:r>
+            <w:r>
+              <w:rPr>
+                <w:sz w:val="18"/>
+              </w:rPr>
+              <w:t xml:space="preserve"> </w:t>
+            </w:r>
+            <w:r>
+              <w:rPr>
+                <w:sz w:val="18"/>
+              </w:rPr>
+              <w:t xml:space="preserve">→ Fault → type a message →</w:t>
+            </w:r>
+            <w:r>
+              <w:rPr>
+                <w:sz w:val="18"/>
+              </w:rPr>
+              <w:t xml:space="preserve"> </w:t>
+            </w:r>
+            <w:r>
+              <w:rPr>
+                <w:bCs/>
+                <w:b/>
+                <w:sz w:val="18"/>
+              </w:rPr>
+              <w:t xml:space="preserve">Send</w:t>
+            </w:r>
+          </w:p>
+        </w:tc>
+        <w:tc>
+          <w:tcPr>
+            <w:tcW w:type="dxa" w:w="3061"/>
+          </w:tcPr>
+          <w:p>
+            <w:pPr>
+              <w:pStyle w:val="Compact"/>
+              <w:jc w:val="left"/>
+            </w:pPr>
+            <w:r>
+              <w:rPr>
+                <w:sz w:val="18"/>
+              </w:rPr>
+              <w:t xml:space="preserve">"Thank you. Your feedback has been submitted to your Team Leader." Within about 5 minutes the TL gets E13 naming A, the page and the version; the item in</w:t>
+            </w:r>
+            <w:r>
+              <w:rPr>
+                <w:sz w:val="18"/>
+              </w:rPr>
+              <w:t xml:space="preserve"> </w:t>
+            </w:r>
+            <w:r>
+              <w:rPr>
+                <w:iCs/>
+                <w:i/>
+                <w:sz w:val="18"/>
+              </w:rPr>
+              <w:t xml:space="preserve">1-to-1 Feedback</w:t>
+            </w:r>
+            <w:r>
+              <w:rPr>
+                <w:sz w:val="18"/>
+              </w:rPr>
+              <w:t xml:space="preserve"> </w:t>
+            </w:r>
+            <w:r>
+              <w:rPr>
+                <w:sz w:val="18"/>
+              </w:rPr>
+              <w:t xml:space="preserve">is Owners-only and</w:t>
+            </w:r>
+            <w:r>
+              <w:rPr>
+                <w:sz w:val="18"/>
+              </w:rPr>
+              <w:t xml:space="preserve"> </w:t>
+            </w:r>
+            <w:r>
+              <w:rPr>
+                <w:iCs/>
+                <w:i/>
+                <w:sz w:val="18"/>
+              </w:rPr>
+              <w:t xml:space="preserve">Sent</w:t>
+            </w:r>
+            <w:r>
+              <w:rPr>
+                <w:sz w:val="18"/>
+              </w:rPr>
+              <w:t xml:space="preserve">.</w:t>
+            </w:r>
+          </w:p>
+        </w:tc>
+        <w:tc>
+          <w:tcPr>
+            <w:tcW w:type="dxa" w:w="907"/>
+          </w:tcPr>
+          <w:p>
+            <w:pPr>
+              <w:pStyle w:val="Compact"/>
+            </w:pPr>
+          </w:p>
+        </w:tc>
+        <w:tc>
+          <w:tcPr>
+            <w:tcW w:type="dxa" w:w="850"/>
+          </w:tcPr>
+          <w:p>
+            <w:pPr>
+              <w:pStyle w:val="Compact"/>
+            </w:pPr>
+          </w:p>
+        </w:tc>
+        <w:tc>
+          <w:tcPr>
+            <w:tcW w:type="dxa" w:w="1191"/>
+          </w:tcPr>
+          <w:p>
+            <w:pPr>
+              <w:pStyle w:val="Compact"/>
+            </w:pPr>
+          </w:p>
+        </w:tc>
+      </w:tr>
+      <w:tr>
+        <w:tc>
+          <w:tcPr>
+            <w:tcW w:type="dxa" w:w="737"/>
+          </w:tcPr>
+          <w:p>
+            <w:pPr>
+              <w:pStyle w:val="Compact"/>
+              <w:jc w:val="left"/>
+            </w:pPr>
+            <w:r>
+              <w:rPr>
+                <w:sz w:val="18"/>
+              </w:rPr>
+              <w:t xml:space="preserve">F42 (v4.3)</w:t>
+            </w:r>
+          </w:p>
+        </w:tc>
+        <w:tc>
+          <w:tcPr>
+            <w:tcW w:type="dxa" w:w="3118"/>
+          </w:tcPr>
+          <w:p>
+            <w:pPr>
+              <w:pStyle w:val="Compact"/>
+              <w:jc w:val="left"/>
+            </w:pPr>
+            <w:r>
+              <w:rPr>
+                <w:sz w:val="18"/>
+              </w:rPr>
+              <w:t xml:space="preserve">Turn Flow 6</w:t>
+            </w:r>
+            <w:r>
+              <w:rPr>
+                <w:sz w:val="18"/>
+              </w:rPr>
+              <w:t xml:space="preserve"> </w:t>
+            </w:r>
+            <w:r>
+              <w:rPr>
+                <w:bCs/>
+                <w:b/>
+                <w:sz w:val="18"/>
+              </w:rPr>
+              <w:t xml:space="preserve">off</w:t>
+            </w:r>
+            <w:r>
+              <w:rPr>
+                <w:sz w:val="18"/>
+              </w:rPr>
+              <w:t xml:space="preserve">, send feedback as A, wait an hour (or turn Flow 6 on with the email connection broken)</w:t>
+            </w:r>
+          </w:p>
+        </w:tc>
+        <w:tc>
+          <w:tcPr>
+            <w:tcW w:type="dxa" w:w="3061"/>
+          </w:tcPr>
+          <w:p>
+            <w:pPr>
+              <w:pStyle w:val="Compact"/>
+              <w:jc w:val="left"/>
+            </w:pPr>
+            <w:r>
+              <w:rPr>
+                <w:sz w:val="18"/>
+              </w:rPr>
+              <w:t xml:space="preserve">The TL sees "Feedback from A … – read it here" in</w:t>
+            </w:r>
+            <w:r>
+              <w:rPr>
+                <w:sz w:val="18"/>
+              </w:rPr>
+              <w:t xml:space="preserve"> </w:t>
+            </w:r>
+            <w:r>
+              <w:rPr>
+                <w:iCs/>
+                <w:i/>
+                <w:sz w:val="18"/>
+              </w:rPr>
+              <w:t xml:space="preserve">Needs your attention</w:t>
+            </w:r>
+            <w:r>
+              <w:rPr>
+                <w:sz w:val="18"/>
+              </w:rPr>
+              <w:t xml:space="preserve">, can read it and</w:t>
+            </w:r>
+            <w:r>
+              <w:rPr>
+                <w:sz w:val="18"/>
+              </w:rPr>
+              <w:t xml:space="preserve"> </w:t>
+            </w:r>
+            <w:r>
+              <w:rPr>
+                <w:bCs/>
+                <w:b/>
+                <w:sz w:val="18"/>
+              </w:rPr>
+              <w:t xml:space="preserve">Mark as read</w:t>
+            </w:r>
+            <w:r>
+              <w:rPr>
+                <w:sz w:val="18"/>
+              </w:rPr>
+              <w:t xml:space="preserve">.</w:t>
+            </w:r>
+          </w:p>
+        </w:tc>
+        <w:tc>
+          <w:tcPr>
+            <w:tcW w:type="dxa" w:w="907"/>
+          </w:tcPr>
+          <w:p>
+            <w:pPr>
+              <w:pStyle w:val="Compact"/>
+            </w:pPr>
+          </w:p>
+        </w:tc>
+        <w:tc>
+          <w:tcPr>
+            <w:tcW w:type="dxa" w:w="850"/>
+          </w:tcPr>
+          <w:p>
+            <w:pPr>
+              <w:pStyle w:val="Compact"/>
+            </w:pPr>
+          </w:p>
+        </w:tc>
+        <w:tc>
+          <w:tcPr>
+            <w:tcW w:type="dxa" w:w="1191"/>
+          </w:tcPr>
+          <w:p>
+            <w:pPr>
+              <w:pStyle w:val="Compact"/>
+            </w:pPr>
+          </w:p>
+        </w:tc>
+      </w:tr>
     </w:tbl>
     <w:bookmarkEnd w:id="33"/>
-    <w:bookmarkStart w:id="34" w:name="X073ef0fbca43203f47699460830ce5a759dba95"/>
+    <w:bookmarkStart w:id="34" w:name="X10f91ce9176fff7ec5cf8d524d1d2ceb5e26f44"/>
     <w:p>
       <w:pPr>
         <w:pStyle w:val="Heading3"/>
       </w:pPr>
       <w:r>
-        <w:t xml:space="preserve">6.2 Privacy and bypass tests (P1–P24) — all mandatory</w:t>
+        <w:t xml:space="preserve">6.2 Privacy and bypass tests (P1–P25) — all mandatory</w:t>
       </w:r>
     </w:p>
     <w:tbl>
@@ -15448,6 +16130,133 @@
               <w:rPr>
                 <w:sz w:val="18"/>
               </w:rPr>
+              <w:t xml:space="preserve">P25 (v4.3)</w:t>
+            </w:r>
+          </w:p>
+        </w:tc>
+        <w:tc>
+          <w:tcPr>
+            <w:tcW w:type="dxa" w:w="1474"/>
+          </w:tcPr>
+          <w:p>
+            <w:pPr>
+              <w:pStyle w:val="Compact"/>
+              <w:jc w:val="left"/>
+            </w:pPr>
+            <w:r>
+              <w:rPr>
+                <w:bCs/>
+                <w:b/>
+                <w:sz w:val="18"/>
+              </w:rPr>
+              <w:t xml:space="preserve">Read someone else's feedback, or your own after sending</w:t>
+            </w:r>
+          </w:p>
+        </w:tc>
+        <w:tc>
+          <w:tcPr>
+            <w:tcW w:type="dxa" w:w="2891"/>
+          </w:tcPr>
+          <w:p>
+            <w:pPr>
+              <w:pStyle w:val="Compact"/>
+              <w:jc w:val="left"/>
+            </w:pPr>
+            <w:r>
+              <w:rPr>
+                <w:sz w:val="18"/>
+              </w:rPr>
+              <w:t xml:space="preserve">B: GET</w:t>
+            </w:r>
+            <w:r>
+              <w:rPr>
+                <w:sz w:val="18"/>
+              </w:rPr>
+              <w:t xml:space="preserve"> </w:t>
+            </w:r>
+            <w:r>
+              <w:rPr>
+                <w:rStyle w:val="VerbatimChar"/>
+                <w:sz w:val="18"/>
+              </w:rPr>
+              <w:t xml:space="preserve">…getbytitle('1-to-1 Feedback')/items</w:t>
+            </w:r>
+            <w:r>
+              <w:rPr>
+                <w:sz w:val="18"/>
+              </w:rPr>
+              <w:t xml:space="preserve"> </w:t>
+            </w:r>
+            <w:r>
+              <w:rPr>
+                <w:sz w:val="18"/>
+              </w:rPr>
+              <w:t xml:space="preserve">after A sent one; A: the same once Flow 6 has run</w:t>
+            </w:r>
+          </w:p>
+        </w:tc>
+        <w:tc>
+          <w:tcPr>
+            <w:tcW w:type="dxa" w:w="2324"/>
+          </w:tcPr>
+          <w:p>
+            <w:pPr>
+              <w:pStyle w:val="Compact"/>
+              <w:jc w:val="left"/>
+            </w:pPr>
+            <w:r>
+              <w:rPr>
+                <w:sz w:val="18"/>
+              </w:rPr>
+              <w:t xml:space="preserve">B gets none of A's items; A gets nothing back once it's locked.</w:t>
+            </w:r>
+          </w:p>
+        </w:tc>
+        <w:tc>
+          <w:tcPr>
+            <w:tcW w:type="dxa" w:w="850"/>
+          </w:tcPr>
+          <w:p>
+            <w:pPr>
+              <w:pStyle w:val="Compact"/>
+            </w:pPr>
+          </w:p>
+        </w:tc>
+        <w:tc>
+          <w:tcPr>
+            <w:tcW w:type="dxa" w:w="794"/>
+          </w:tcPr>
+          <w:p>
+            <w:pPr>
+              <w:pStyle w:val="Compact"/>
+            </w:pPr>
+          </w:p>
+        </w:tc>
+        <w:tc>
+          <w:tcPr>
+            <w:tcW w:type="dxa" w:w="850"/>
+          </w:tcPr>
+          <w:p>
+            <w:pPr>
+              <w:pStyle w:val="Compact"/>
+            </w:pPr>
+          </w:p>
+        </w:tc>
+      </w:tr>
+      <w:tr>
+        <w:tc>
+          <w:tcPr>
+            <w:tcW w:type="dxa" w:w="680"/>
+          </w:tcPr>
+          <w:p>
+            <w:pPr>
+              <w:pStyle w:val="Compact"/>
+              <w:jc w:val="left"/>
+            </w:pPr>
+            <w:r>
+              <w:rPr>
+                <w:sz w:val="18"/>
+              </w:rPr>
               <w:t xml:space="preserve">P17</w:t>
             </w:r>
           </w:p>
@@ -15870,7 +16679,7 @@
       <w:pPr>
         <w:numPr>
           <w:ilvl w:val="0"/>
-          <w:numId w:val="1036"/>
+          <w:numId w:val="1037"/>
         </w:numPr>
         <w:pStyle w:val="Compact"/>
       </w:pPr>
@@ -15892,142 +16701,6 @@
       </w:r>
       <w:r>
         <w:t xml:space="preserve">in Monthly Reviews, Manager Reviews and Wellbeing Assessments, and the test expectations.</w:t>
-      </w:r>
-    </w:p>
-    <w:p>
-      <w:pPr>
-        <w:numPr>
-          <w:ilvl w:val="0"/>
-          <w:numId w:val="1036"/>
-        </w:numPr>
-        <w:pStyle w:val="Compact"/>
-      </w:pPr>
-      <w:r>
-        <w:t xml:space="preserve">☐ Empty the</w:t>
-      </w:r>
-      <w:r>
-        <w:t xml:space="preserve"> </w:t>
-      </w:r>
-      <w:r>
-        <w:rPr>
-          <w:bCs/>
-          <w:b/>
-        </w:rPr>
-        <w:t xml:space="preserve">site recycle bin</w:t>
-      </w:r>
-      <w:r>
-        <w:t xml:space="preserve">, then the</w:t>
-      </w:r>
-      <w:r>
-        <w:t xml:space="preserve"> </w:t>
-      </w:r>
-      <w:r>
-        <w:rPr>
-          <w:bCs/>
-          <w:b/>
-        </w:rPr>
-        <w:t xml:space="preserve">second-stage recycle bin</w:t>
-      </w:r>
-      <w:r>
-        <w:t xml:space="preserve">.</w:t>
-      </w:r>
-    </w:p>
-    <w:p>
-      <w:pPr>
-        <w:numPr>
-          <w:ilvl w:val="0"/>
-          <w:numId w:val="1036"/>
-        </w:numPr>
-        <w:pStyle w:val="Compact"/>
-      </w:pPr>
-      <w:r>
-        <w:t xml:space="preserve">☐</w:t>
-      </w:r>
-      <w:r>
-        <w:t xml:space="preserve"> </w:t>
-      </w:r>
-      <w:r>
-        <w:rPr>
-          <w:bCs/>
-          <w:b/>
-        </w:rPr>
-        <w:t xml:space="preserve">⚙ Settings → Team → Deactivate</w:t>
-      </w:r>
-      <w:r>
-        <w:t xml:space="preserve"> </w:t>
-      </w:r>
-      <w:r>
-        <w:t xml:space="preserve">Test A and Test B (Flow 4 removes them from the group), then delete their two items from the</w:t>
-      </w:r>
-      <w:r>
-        <w:t xml:space="preserve"> </w:t>
-      </w:r>
-      <w:r>
-        <w:rPr>
-          <w:bCs/>
-          <w:b/>
-        </w:rPr>
-        <w:t xml:space="preserve">Technicians</w:t>
-      </w:r>
-      <w:r>
-        <w:t xml:space="preserve"> </w:t>
-      </w:r>
-      <w:r>
-        <w:t xml:space="preserve">list. Team ▾ goes back to Team (0).</w:t>
-      </w:r>
-    </w:p>
-    <w:p>
-      <w:pPr>
-        <w:numPr>
-          <w:ilvl w:val="0"/>
-          <w:numId w:val="1036"/>
-        </w:numPr>
-        <w:pStyle w:val="Compact"/>
-      </w:pPr>
-      <w:r>
-        <w:t xml:space="preserve">☐ Flow 1:</w:t>
-      </w:r>
-      <w:r>
-        <w:t xml:space="preserve"> </w:t>
-      </w:r>
-      <w:r>
-        <w:rPr>
-          <w:bCs/>
-          <w:b/>
-        </w:rPr>
-        <w:t xml:space="preserve">Initialize varTestDate</w:t>
-      </w:r>
-      <w:r>
-        <w:t xml:space="preserve"> </w:t>
-      </w:r>
-      <w:r>
-        <w:t xml:space="preserve">is</w:t>
-      </w:r>
-      <w:r>
-        <w:t xml:space="preserve"> </w:t>
-      </w:r>
-      <w:r>
-        <w:rPr>
-          <w:bCs/>
-          <w:b/>
-        </w:rPr>
-        <w:t xml:space="preserve">empty</w:t>
-      </w:r>
-      <w:r>
-        <w:t xml:space="preserve"> </w:t>
-      </w:r>
-      <w:r>
-        <w:t xml:space="preserve">(Save).</w:t>
-      </w:r>
-    </w:p>
-    <w:bookmarkEnd w:id="37"/>
-    <w:bookmarkStart w:id="39" w:name="X886e617d0f01d1676fba46472ee6c599f97ff50"/>
-    <w:p>
-      <w:pPr>
-        <w:pStyle w:val="Heading2"/>
-      </w:pPr>
-      <w:r>
-        <w:t xml:space="preserve">8. Phase E — Prepare and invite the real team (1–2 h)</w:t>
       </w:r>
     </w:p>
     <w:p>
@@ -16039,7 +16712,7 @@
         <w:pStyle w:val="Compact"/>
       </w:pPr>
       <w:r>
-        <w:t xml:space="preserve">☐</w:t>
+        <w:t xml:space="preserve">☐ Empty the</w:t>
       </w:r>
       <w:r>
         <w:t xml:space="preserve"> </w:t>
@@ -16049,13 +16722,23 @@
           <w:bCs/>
           <w:b/>
         </w:rPr>
-        <w:t xml:space="preserve">⚙ Settings → Team → + Add a person</w:t>
-      </w:r>
-      <w:r>
-        <w:t xml:space="preserve"> </w:t>
-      </w:r>
-      <w:r>
-        <w:t xml:space="preserve">for each technician (Flow 4 gives them access; no invitation email is sent by SharePoint).</w:t>
+        <w:t xml:space="preserve">site recycle bin</w:t>
+      </w:r>
+      <w:r>
+        <w:t xml:space="preserve">, then the</w:t>
+      </w:r>
+      <w:r>
+        <w:t xml:space="preserve"> </w:t>
+      </w:r>
+      <w:r>
+        <w:rPr>
+          <w:bCs/>
+          <w:b/>
+        </w:rPr>
+        <w:t xml:space="preserve">second-stage recycle bin</w:t>
+      </w:r>
+      <w:r>
+        <w:t xml:space="preserve">.</w:t>
       </w:r>
     </w:p>
     <w:p>
@@ -16077,13 +16760,13 @@
           <w:bCs/>
           <w:b/>
         </w:rPr>
-        <w:t xml:space="preserve">⚙ Settings → Team:</w:t>
-      </w:r>
-      <w:r>
-        <w:t xml:space="preserve"> </w:t>
-      </w:r>
-      <w:r>
-        <w:t xml:space="preserve">enter each</w:t>
+        <w:t xml:space="preserve">⚙ Settings → Team → Deactivate</w:t>
+      </w:r>
+      <w:r>
+        <w:t xml:space="preserve"> </w:t>
+      </w:r>
+      <w:r>
+        <w:t xml:space="preserve">Test A and Test B (Flow 4 removes them from the group), then delete their two items from the</w:t>
       </w:r>
       <w:r>
         <w:t xml:space="preserve"> </w:t>
@@ -16093,29 +16776,13 @@
           <w:bCs/>
           <w:b/>
         </w:rPr>
-        <w:t xml:space="preserve">appraisal date</w:t>
-      </w:r>
-      <w:r>
-        <w:t xml:space="preserve"> </w:t>
-      </w:r>
-      <w:r>
-        <w:t xml:space="preserve">→ Save. Optionally</w:t>
-      </w:r>
-      <w:r>
-        <w:t xml:space="preserve"> </w:t>
-      </w:r>
-      <w:r>
-        <w:rPr>
-          <w:bCs/>
-          <w:b/>
-        </w:rPr>
-        <w:t xml:space="preserve">⚙ Settings → Reminders / Names</w:t>
-      </w:r>
-      <w:r>
-        <w:t xml:space="preserve"> </w:t>
-      </w:r>
-      <w:r>
-        <w:t xml:space="preserve">to change the reminder days or the on-screen role words.</w:t>
+        <w:t xml:space="preserve">Technicians</w:t>
+      </w:r>
+      <w:r>
+        <w:t xml:space="preserve"> </w:t>
+      </w:r>
+      <w:r>
+        <w:t xml:space="preserve">list. Team ▾ goes back to Team (0).</w:t>
       </w:r>
     </w:p>
     <w:p>
@@ -16127,7 +16794,7 @@
         <w:pStyle w:val="Compact"/>
       </w:pPr>
       <w:r>
-        <w:t xml:space="preserve">☐</w:t>
+        <w:t xml:space="preserve">☐ Flow 1:</w:t>
       </w:r>
       <w:r>
         <w:t xml:space="preserve"> </w:t>
@@ -16137,13 +16804,13 @@
           <w:bCs/>
           <w:b/>
         </w:rPr>
-        <w:t xml:space="preserve">Expectations page:</w:t>
-      </w:r>
-      <w:r>
-        <w:t xml:space="preserve"> </w:t>
-      </w:r>
-      <w:r>
-        <w:t xml:space="preserve">enter the real</w:t>
+        <w:t xml:space="preserve">Initialize varTestDate</w:t>
+      </w:r>
+      <w:r>
+        <w:t xml:space="preserve"> </w:t>
+      </w:r>
+      <w:r>
+        <w:t xml:space="preserve">is</w:t>
       </w:r>
       <w:r>
         <w:t xml:space="preserve"> </w:t>
@@ -16153,80 +16820,30 @@
           <w:bCs/>
           <w:b/>
         </w:rPr>
-        <w:t xml:space="preserve">Shared</w:t>
-      </w:r>
-      <w:r>
-        <w:t xml:space="preserve"> </w:t>
-      </w:r>
-      <w:r>
-        <w:t xml:space="preserve">expectations and each person's</w:t>
-      </w:r>
-      <w:r>
-        <w:t xml:space="preserve"> </w:t>
-      </w:r>
-      <w:r>
-        <w:rPr>
-          <w:bCs/>
-          <w:b/>
-        </w:rPr>
-        <w:t xml:space="preserve">Individual</w:t>
-      </w:r>
-      <w:r>
-        <w:t xml:space="preserve"> </w:t>
-      </w:r>
-      <w:r>
-        <w:t xml:space="preserve">ones for</w:t>
-      </w:r>
-      <w:r>
-        <w:t xml:space="preserve"> </w:t>
-      </w:r>
-      <w:r>
-        <w:rPr>
-          <w:bCs/>
-          <w:b/>
-        </w:rPr>
-        <w:t xml:space="preserve">2026/27</w:t>
-      </w:r>
-      <w:r>
-        <w:t xml:space="preserve">. Do this after the Technicians list, so people appear in the Technician dropdown.</w:t>
+        <w:t xml:space="preserve">empty</w:t>
+      </w:r>
+      <w:r>
+        <w:t xml:space="preserve"> </w:t>
+      </w:r>
+      <w:r>
+        <w:t xml:space="preserve">(Save).</w:t>
       </w:r>
     </w:p>
+    <w:bookmarkEnd w:id="37"/>
+    <w:bookmarkStart w:id="39" w:name="X886e617d0f01d1676fba46472ee6c599f97ff50"/>
     <w:p>
       <w:pPr>
-        <w:numPr>
-          <w:ilvl w:val="1"/>
-          <w:numId w:val="1038"/>
-        </w:numPr>
-        <w:pStyle w:val="Compact"/>
+        <w:pStyle w:val="Heading2"/>
       </w:pPr>
       <w:r>
-        <w:rPr>
-          <w:bCs/>
-          <w:b/>
-        </w:rPr>
-        <w:t xml:space="preserve">Maximum 10 per person</w:t>
-      </w:r>
-      <w:r>
-        <w:t xml:space="preserve">; the page shows the count.</w:t>
-      </w:r>
-    </w:p>
-    <w:p>
-      <w:pPr>
-        <w:numPr>
-          <w:ilvl w:val="1"/>
-          <w:numId w:val="1038"/>
-        </w:numPr>
-        <w:pStyle w:val="Compact"/>
-      </w:pPr>
-      <w:r>
-        <w:t xml:space="preserve">Expectations entered early for next year are ignored until that appraisal year starts (1 April).</w:t>
+        <w:t xml:space="preserve">8. Phase E — Prepare and invite the real team (1–2 h)</w:t>
       </w:r>
     </w:p>
     <w:p>
       <w:pPr>
         <w:numPr>
           <w:ilvl w:val="0"/>
-          <w:numId w:val="1037"/>
+          <w:numId w:val="1038"/>
         </w:numPr>
         <w:pStyle w:val="Compact"/>
       </w:pPr>
@@ -16241,13 +16858,146 @@
           <w:bCs/>
           <w:b/>
         </w:rPr>
-        <w:t xml:space="preserve">Invite.</w:t>
-      </w:r>
-      <w:r>
-        <w:t xml:space="preserve"> </w:t>
-      </w:r>
-      <w:r>
-        <w:t xml:space="preserve">Send the welcome email below from your own mailbox, or brief the team in person.</w:t>
+        <w:t xml:space="preserve">⚙ Settings → Team → + Add a person</w:t>
+      </w:r>
+      <w:r>
+        <w:t xml:space="preserve"> </w:t>
+      </w:r>
+      <w:r>
+        <w:t xml:space="preserve">for each technician (Flow 4 gives them access; no invitation email is sent by SharePoint).</w:t>
+      </w:r>
+    </w:p>
+    <w:p>
+      <w:pPr>
+        <w:numPr>
+          <w:ilvl w:val="0"/>
+          <w:numId w:val="1038"/>
+        </w:numPr>
+        <w:pStyle w:val="Compact"/>
+      </w:pPr>
+      <w:r>
+        <w:t xml:space="preserve">☐</w:t>
+      </w:r>
+      <w:r>
+        <w:t xml:space="preserve"> </w:t>
+      </w:r>
+      <w:r>
+        <w:rPr>
+          <w:bCs/>
+          <w:b/>
+        </w:rPr>
+        <w:t xml:space="preserve">⚙ Settings → Team:</w:t>
+      </w:r>
+      <w:r>
+        <w:t xml:space="preserve"> </w:t>
+      </w:r>
+      <w:r>
+        <w:t xml:space="preserve">enter each</w:t>
+      </w:r>
+      <w:r>
+        <w:t xml:space="preserve"> </w:t>
+      </w:r>
+      <w:r>
+        <w:rPr>
+          <w:bCs/>
+          <w:b/>
+        </w:rPr>
+        <w:t xml:space="preserve">appraisal date</w:t>
+      </w:r>
+      <w:r>
+        <w:t xml:space="preserve"> </w:t>
+      </w:r>
+      <w:r>
+        <w:t xml:space="preserve">→ Save. Optionally</w:t>
+      </w:r>
+      <w:r>
+        <w:t xml:space="preserve"> </w:t>
+      </w:r>
+      <w:r>
+        <w:rPr>
+          <w:bCs/>
+          <w:b/>
+        </w:rPr>
+        <w:t xml:space="preserve">⚙ Settings → Reminders / Names</w:t>
+      </w:r>
+      <w:r>
+        <w:t xml:space="preserve"> </w:t>
+      </w:r>
+      <w:r>
+        <w:t xml:space="preserve">to change the reminder days or the on-screen role words.</w:t>
+      </w:r>
+    </w:p>
+    <w:p>
+      <w:pPr>
+        <w:numPr>
+          <w:ilvl w:val="0"/>
+          <w:numId w:val="1038"/>
+        </w:numPr>
+        <w:pStyle w:val="Compact"/>
+      </w:pPr>
+      <w:r>
+        <w:t xml:space="preserve">☐</w:t>
+      </w:r>
+      <w:r>
+        <w:t xml:space="preserve"> </w:t>
+      </w:r>
+      <w:r>
+        <w:rPr>
+          <w:bCs/>
+          <w:b/>
+        </w:rPr>
+        <w:t xml:space="preserve">Expectations page:</w:t>
+      </w:r>
+      <w:r>
+        <w:t xml:space="preserve"> </w:t>
+      </w:r>
+      <w:r>
+        <w:t xml:space="preserve">enter the real</w:t>
+      </w:r>
+      <w:r>
+        <w:t xml:space="preserve"> </w:t>
+      </w:r>
+      <w:r>
+        <w:rPr>
+          <w:bCs/>
+          <w:b/>
+        </w:rPr>
+        <w:t xml:space="preserve">Shared</w:t>
+      </w:r>
+      <w:r>
+        <w:t xml:space="preserve"> </w:t>
+      </w:r>
+      <w:r>
+        <w:t xml:space="preserve">expectations and each person's</w:t>
+      </w:r>
+      <w:r>
+        <w:t xml:space="preserve"> </w:t>
+      </w:r>
+      <w:r>
+        <w:rPr>
+          <w:bCs/>
+          <w:b/>
+        </w:rPr>
+        <w:t xml:space="preserve">Individual</w:t>
+      </w:r>
+      <w:r>
+        <w:t xml:space="preserve"> </w:t>
+      </w:r>
+      <w:r>
+        <w:t xml:space="preserve">ones for</w:t>
+      </w:r>
+      <w:r>
+        <w:t xml:space="preserve"> </w:t>
+      </w:r>
+      <w:r>
+        <w:rPr>
+          <w:bCs/>
+          <w:b/>
+        </w:rPr>
+        <w:t xml:space="preserve">2026/27</w:t>
+      </w:r>
+      <w:r>
+        <w:t xml:space="preserve">. Do this after the Technicians list, so people appear in the Technician dropdown.</w:t>
       </w:r>
     </w:p>
     <w:p>
@@ -16259,7 +17009,14 @@
         <w:pStyle w:val="Compact"/>
       </w:pPr>
       <w:r>
-        <w:t xml:space="preserve">It only tells them what's coming.</w:t>
+        <w:rPr>
+          <w:bCs/>
+          <w:b/>
+        </w:rPr>
+        <w:t xml:space="preserve">Maximum 10 per person</w:t>
+      </w:r>
+      <w:r>
+        <w:t xml:space="preserve">; the page shows the count.</w:t>
       </w:r>
     </w:p>
     <w:p>
@@ -16271,6 +17028,58 @@
         <w:pStyle w:val="Compact"/>
       </w:pPr>
       <w:r>
+        <w:t xml:space="preserve">Expectations entered early for next year are ignored until that appraisal year starts (1 April).</w:t>
+      </w:r>
+    </w:p>
+    <w:p>
+      <w:pPr>
+        <w:numPr>
+          <w:ilvl w:val="0"/>
+          <w:numId w:val="1038"/>
+        </w:numPr>
+        <w:pStyle w:val="Compact"/>
+      </w:pPr>
+      <w:r>
+        <w:t xml:space="preserve">☐</w:t>
+      </w:r>
+      <w:r>
+        <w:t xml:space="preserve"> </w:t>
+      </w:r>
+      <w:r>
+        <w:rPr>
+          <w:bCs/>
+          <w:b/>
+        </w:rPr>
+        <w:t xml:space="preserve">Invite.</w:t>
+      </w:r>
+      <w:r>
+        <w:t xml:space="preserve"> </w:t>
+      </w:r>
+      <w:r>
+        <w:t xml:space="preserve">Send the welcome email below from your own mailbox, or brief the team in person.</w:t>
+      </w:r>
+    </w:p>
+    <w:p>
+      <w:pPr>
+        <w:numPr>
+          <w:ilvl w:val="1"/>
+          <w:numId w:val="1040"/>
+        </w:numPr>
+        <w:pStyle w:val="Compact"/>
+      </w:pPr>
+      <w:r>
+        <w:t xml:space="preserve">It only tells them what's coming.</w:t>
+      </w:r>
+    </w:p>
+    <w:p>
+      <w:pPr>
+        <w:numPr>
+          <w:ilvl w:val="1"/>
+          <w:numId w:val="1040"/>
+        </w:numPr>
+        <w:pStyle w:val="Compact"/>
+      </w:pPr>
+      <w:r>
         <w:t xml:space="preserve">Access comes solely through each person's own monthly link, which works only for them.</w:t>
       </w:r>
     </w:p>
@@ -16340,146 +17149,6 @@
           <w:b/>
         </w:rPr>
         <w:t xml:space="preserve">How it works</w:t>
-      </w:r>
-    </w:p>
-    <w:p>
-      <w:pPr>
-        <w:numPr>
-          <w:ilvl w:val="0"/>
-          <w:numId w:val="1040"/>
-        </w:numPr>
-        <w:pStyle w:val="Compact"/>
-      </w:pPr>
-      <w:r>
-        <w:t xml:space="preserve">On the 1st of each month you'll get an email from me:</w:t>
-      </w:r>
-      <w:r>
-        <w:t xml:space="preserve"> </w:t>
-      </w:r>
-      <w:r>
-        <w:rPr>
-          <w:iCs/>
-          <w:i/>
-        </w:rPr>
-        <w:t xml:space="preserve">"Your 1-to-1 for [month] is ready"</w:t>
-      </w:r>
-      <w:r>
-        <w:t xml:space="preserve">. The link in it opens</w:t>
-      </w:r>
-      <w:r>
-        <w:t xml:space="preserve"> </w:t>
-      </w:r>
-      <w:r>
-        <w:rPr>
-          <w:bCs/>
-          <w:b/>
-        </w:rPr>
-        <w:t xml:space="preserve">your</w:t>
-      </w:r>
-      <w:r>
-        <w:t xml:space="preserve"> </w:t>
-      </w:r>
-      <w:r>
-        <w:t xml:space="preserve">form.</w:t>
-      </w:r>
-    </w:p>
-    <w:p>
-      <w:pPr>
-        <w:numPr>
-          <w:ilvl w:val="0"/>
-          <w:numId w:val="1040"/>
-        </w:numPr>
-        <w:pStyle w:val="Compact"/>
-      </w:pPr>
-      <w:r>
-        <w:t xml:space="preserve">It takes about 10–15 minutes. You can save and come back as often as you like.</w:t>
-      </w:r>
-    </w:p>
-    <w:p>
-      <w:pPr>
-        <w:numPr>
-          <w:ilvl w:val="0"/>
-          <w:numId w:val="1040"/>
-        </w:numPr>
-        <w:pStyle w:val="Compact"/>
-      </w:pPr>
-      <w:r>
-        <w:t xml:space="preserve">The deadline is the</w:t>
-      </w:r>
-      <w:r>
-        <w:t xml:space="preserve"> </w:t>
-      </w:r>
-      <w:r>
-        <w:rPr>
-          <w:bCs/>
-          <w:b/>
-        </w:rPr>
-        <w:t xml:space="preserve">last day of the month at 23:59</w:t>
-      </w:r>
-      <w:r>
-        <w:t xml:space="preserve">. If you haven't submitted, you'll get reminders on the 20th and 27th.</w:t>
-      </w:r>
-    </w:p>
-    <w:p>
-      <w:pPr>
-        <w:numPr>
-          <w:ilvl w:val="0"/>
-          <w:numId w:val="1040"/>
-        </w:numPr>
-        <w:pStyle w:val="Compact"/>
-      </w:pPr>
-      <w:r>
-        <w:t xml:space="preserve">Once you submit, the form is locked. I'll read it, add my feedback and any agreed actions, and you'll get an email when the feedback is ready to view.</w:t>
-      </w:r>
-    </w:p>
-    <w:p>
-      <w:pPr>
-        <w:numPr>
-          <w:ilvl w:val="0"/>
-          <w:numId w:val="1040"/>
-        </w:numPr>
-        <w:pStyle w:val="Compact"/>
-      </w:pPr>
-      <w:r>
-        <w:rPr>
-          <w:bCs/>
-          <w:b/>
-        </w:rPr>
-        <w:t xml:space="preserve">My appraisal</w:t>
-      </w:r>
-      <w:r>
-        <w:t xml:space="preserve"> </w:t>
-      </w:r>
-      <w:r>
-        <w:t xml:space="preserve">shows how you're tracking against your appraisal expectations.</w:t>
-      </w:r>
-      <w:r>
-        <w:t xml:space="preserve"> </w:t>
-      </w:r>
-      <w:r>
-        <w:rPr>
-          <w:bCs/>
-          <w:b/>
-        </w:rPr>
-        <w:t xml:space="preserve">Appraisal report</w:t>
-      </w:r>
-      <w:r>
-        <w:t xml:space="preserve"> </w:t>
-      </w:r>
-      <w:r>
-        <w:t xml:space="preserve">pulls the year together to help with your appraisal.</w:t>
-      </w:r>
-    </w:p>
-    <w:p>
-      <w:pPr>
-        <w:pStyle w:val="FirstParagraph"/>
-      </w:pPr>
-      <w:r>
-        <w:rPr>
-          <w:bCs/>
-          <w:b/>
-        </w:rPr>
-        <w:t xml:space="preserve">Who can see it</w:t>
       </w:r>
     </w:p>
     <w:p>
@@ -16491,7 +17160,20 @@
         <w:pStyle w:val="Compact"/>
       </w:pPr>
       <w:r>
-        <w:t xml:space="preserve">Your answers are visible only to</w:t>
+        <w:t xml:space="preserve">On the 1st of each month you'll get an email from me:</w:t>
+      </w:r>
+      <w:r>
+        <w:t xml:space="preserve"> </w:t>
+      </w:r>
+      <w:r>
+        <w:rPr>
+          <w:iCs/>
+          <w:i/>
+        </w:rPr>
+        <w:t xml:space="preserve">"Your 1-to-1 for [month] is ready"</w:t>
+      </w:r>
+      <w:r>
+        <w:t xml:space="preserve">. The link in it opens</w:t>
       </w:r>
       <w:r>
         <w:t xml:space="preserve"> </w:t>
@@ -16501,10 +17183,13 @@
           <w:bCs/>
           <w:b/>
         </w:rPr>
-        <w:t xml:space="preserve">you and me</w:t>
-      </w:r>
-      <w:r>
-        <w:t xml:space="preserve">.</w:t>
+        <w:t xml:space="preserve">your</w:t>
+      </w:r>
+      <w:r>
+        <w:t xml:space="preserve"> </w:t>
+      </w:r>
+      <w:r>
+        <w:t xml:space="preserve">form.</w:t>
       </w:r>
     </w:p>
     <w:p>
@@ -16516,7 +17201,7 @@
         <w:pStyle w:val="Compact"/>
       </w:pPr>
       <w:r>
-        <w:t xml:space="preserve">Other technicians can't see your form, your answers or your feedback, and you can't see theirs.</w:t>
+        <w:t xml:space="preserve">It takes about 10–15 minutes. You can save and come back as often as you like.</w:t>
       </w:r>
     </w:p>
     <w:p>
@@ -16528,7 +17213,70 @@
         <w:pStyle w:val="Compact"/>
       </w:pPr>
       <w:r>
-        <w:t xml:space="preserve">Like any company system, IT administrators could technically access it.</w:t>
+        <w:t xml:space="preserve">The deadline is the</w:t>
+      </w:r>
+      <w:r>
+        <w:t xml:space="preserve"> </w:t>
+      </w:r>
+      <w:r>
+        <w:rPr>
+          <w:bCs/>
+          <w:b/>
+        </w:rPr>
+        <w:t xml:space="preserve">last day of the month at 23:59</w:t>
+      </w:r>
+      <w:r>
+        <w:t xml:space="preserve">. If you haven't submitted, you'll get reminders on the reminder days (normally the 20th and 27th).</w:t>
+      </w:r>
+    </w:p>
+    <w:p>
+      <w:pPr>
+        <w:numPr>
+          <w:ilvl w:val="0"/>
+          <w:numId w:val="1041"/>
+        </w:numPr>
+        <w:pStyle w:val="Compact"/>
+      </w:pPr>
+      <w:r>
+        <w:t xml:space="preserve">Once you submit, the form is locked. I'll read it, add my feedback and any agreed actions, and you'll get an email when the feedback is ready to view.</w:t>
+      </w:r>
+    </w:p>
+    <w:p>
+      <w:pPr>
+        <w:numPr>
+          <w:ilvl w:val="0"/>
+          <w:numId w:val="1041"/>
+        </w:numPr>
+        <w:pStyle w:val="Compact"/>
+      </w:pPr>
+      <w:r>
+        <w:rPr>
+          <w:bCs/>
+          <w:b/>
+        </w:rPr>
+        <w:t xml:space="preserve">My appraisal</w:t>
+      </w:r>
+      <w:r>
+        <w:t xml:space="preserve"> </w:t>
+      </w:r>
+      <w:r>
+        <w:t xml:space="preserve">shows how you're tracking against your appraisal expectations.</w:t>
+      </w:r>
+      <w:r>
+        <w:t xml:space="preserve"> </w:t>
+      </w:r>
+      <w:r>
+        <w:rPr>
+          <w:bCs/>
+          <w:b/>
+        </w:rPr>
+        <w:t xml:space="preserve">Appraisal report</w:t>
+      </w:r>
+      <w:r>
+        <w:t xml:space="preserve"> </w:t>
+      </w:r>
+      <w:r>
+        <w:t xml:space="preserve">pulls the year together to help with your appraisal.</w:t>
       </w:r>
     </w:p>
     <w:p>
@@ -16540,7 +17288,7 @@
           <w:bCs/>
           <w:b/>
         </w:rPr>
-        <w:t xml:space="preserve">Things to know</w:t>
+        <w:t xml:space="preserve">Who can see it</w:t>
       </w:r>
     </w:p>
     <w:p>
@@ -16552,7 +17300,20 @@
         <w:pStyle w:val="Compact"/>
       </w:pPr>
       <w:r>
-        <w:t xml:space="preserve">Open the link while signed in with your own company account.</w:t>
+        <w:t xml:space="preserve">Your answers are visible only to</w:t>
+      </w:r>
+      <w:r>
+        <w:t xml:space="preserve"> </w:t>
+      </w:r>
+      <w:r>
+        <w:rPr>
+          <w:bCs/>
+          <w:b/>
+        </w:rPr>
+        <w:t xml:space="preserve">you and me</w:t>
+      </w:r>
+      <w:r>
+        <w:t xml:space="preserve">.</w:t>
       </w:r>
     </w:p>
     <w:p>
@@ -16564,7 +17325,7 @@
         <w:pStyle w:val="Compact"/>
       </w:pPr>
       <w:r>
-        <w:t xml:space="preserve">Raise anything urgent with me directly. You don't need to wait for the form.</w:t>
+        <w:t xml:space="preserve">Other technicians can't see your form, your answers or your feedback, and you can't see theirs.</w:t>
       </w:r>
     </w:p>
     <w:p>
@@ -16576,7 +17337,7 @@
         <w:pStyle w:val="Compact"/>
       </w:pPr>
       <w:r>
-        <w:t xml:space="preserve">If something doesn't work, tell me what you saw (a screenshot helps).</w:t>
+        <w:t xml:space="preserve">Like any company system, IT administrators could technically access it.</w:t>
       </w:r>
     </w:p>
     <w:p>
@@ -16584,24 +17345,11 @@
         <w:pStyle w:val="FirstParagraph"/>
       </w:pPr>
       <w:r>
-        <w:t xml:space="preserve">Thanks,</w:t>
-      </w:r>
-      <w:r>
-        <w:t xml:space="preserve"> </w:t>
-      </w:r>
-      <w:r>
-        <w:t xml:space="preserve">[Your name]</w:t>
-      </w:r>
-    </w:p>
-    <w:bookmarkEnd w:id="38"/>
-    <w:bookmarkEnd w:id="39"/>
-    <w:bookmarkStart w:id="40" w:name="Xaad55d400e196b0a86da29e5b294466c98e396d"/>
-    <w:p>
-      <w:pPr>
-        <w:pStyle w:val="Heading2"/>
-      </w:pPr>
-      <w:r>
-        <w:t xml:space="preserve">9. Phase F — Go live (15 min)</w:t>
+        <w:rPr>
+          <w:bCs/>
+          <w:b/>
+        </w:rPr>
+        <w:t xml:space="preserve">Things to know</w:t>
       </w:r>
     </w:p>
     <w:p>
@@ -16613,36 +17361,7 @@
         <w:pStyle w:val="Compact"/>
       </w:pPr>
       <w:r>
-        <w:t xml:space="preserve">☐</w:t>
-      </w:r>
-      <w:r>
-        <w:t xml:space="preserve"> </w:t>
-      </w:r>
-      <w:r>
-        <w:rPr>
-          <w:bCs/>
-          <w:b/>
-        </w:rPr>
-        <w:t xml:space="preserve">Flow 1 → Run</w:t>
-      </w:r>
-      <w:r>
-        <w:t xml:space="preserve"> </w:t>
-      </w:r>
-      <w:r>
-        <w:t xml:space="preserve">to start the current month now, or leave it to run automatically at</w:t>
-      </w:r>
-      <w:r>
-        <w:t xml:space="preserve"> </w:t>
-      </w:r>
-      <w:r>
-        <w:rPr>
-          <w:bCs/>
-          <w:b/>
-        </w:rPr>
-        <w:t xml:space="preserve">07:00 on the 1st</w:t>
-      </w:r>
-      <w:r>
-        <w:t xml:space="preserve">.</w:t>
+        <w:t xml:space="preserve">Open the link while signed in with your own company account.</w:t>
       </w:r>
     </w:p>
     <w:p>
@@ -16654,39 +17373,7 @@
         <w:pStyle w:val="Compact"/>
       </w:pPr>
       <w:r>
-        <w:t xml:space="preserve">☐ Each technician has</w:t>
-      </w:r>
-      <w:r>
-        <w:t xml:space="preserve"> </w:t>
-      </w:r>
-      <w:r>
-        <w:rPr>
-          <w:bCs/>
-          <w:b/>
-        </w:rPr>
-        <w:t xml:space="preserve">exactly one</w:t>
-      </w:r>
-      <w:r>
-        <w:t xml:space="preserve"> </w:t>
-      </w:r>
-      <w:r>
-        <w:t xml:space="preserve">review and got</w:t>
-      </w:r>
-      <w:r>
-        <w:t xml:space="preserve"> </w:t>
-      </w:r>
-      <w:r>
-        <w:rPr>
-          <w:bCs/>
-          <w:b/>
-        </w:rPr>
-        <w:t xml:space="preserve">exactly one</w:t>
-      </w:r>
-      <w:r>
-        <w:t xml:space="preserve"> </w:t>
-      </w:r>
-      <w:r>
-        <w:t xml:space="preserve">email.</w:t>
+        <w:t xml:space="preserve">Raise anything urgent with me directly. You don't need to wait for the form.</w:t>
       </w:r>
     </w:p>
     <w:p>
@@ -16694,6 +17381,128 @@
         <w:numPr>
           <w:ilvl w:val="0"/>
           <w:numId w:val="1043"/>
+        </w:numPr>
+        <w:pStyle w:val="Compact"/>
+      </w:pPr>
+      <w:r>
+        <w:t xml:space="preserve">If something doesn't work, tell me what you saw (a screenshot helps).</w:t>
+      </w:r>
+    </w:p>
+    <w:p>
+      <w:pPr>
+        <w:pStyle w:val="FirstParagraph"/>
+      </w:pPr>
+      <w:r>
+        <w:t xml:space="preserve">Thanks,</w:t>
+      </w:r>
+      <w:r>
+        <w:t xml:space="preserve"> </w:t>
+      </w:r>
+      <w:r>
+        <w:t xml:space="preserve">[Your name]</w:t>
+      </w:r>
+    </w:p>
+    <w:bookmarkEnd w:id="38"/>
+    <w:bookmarkEnd w:id="39"/>
+    <w:bookmarkStart w:id="40" w:name="Xaad55d400e196b0a86da29e5b294466c98e396d"/>
+    <w:p>
+      <w:pPr>
+        <w:pStyle w:val="Heading2"/>
+      </w:pPr>
+      <w:r>
+        <w:t xml:space="preserve">9. Phase F — Go live (15 min)</w:t>
+      </w:r>
+    </w:p>
+    <w:p>
+      <w:pPr>
+        <w:numPr>
+          <w:ilvl w:val="0"/>
+          <w:numId w:val="1044"/>
+        </w:numPr>
+        <w:pStyle w:val="Compact"/>
+      </w:pPr>
+      <w:r>
+        <w:t xml:space="preserve">☐</w:t>
+      </w:r>
+      <w:r>
+        <w:t xml:space="preserve"> </w:t>
+      </w:r>
+      <w:r>
+        <w:rPr>
+          <w:bCs/>
+          <w:b/>
+        </w:rPr>
+        <w:t xml:space="preserve">Flow 1 → Run</w:t>
+      </w:r>
+      <w:r>
+        <w:t xml:space="preserve"> </w:t>
+      </w:r>
+      <w:r>
+        <w:t xml:space="preserve">to start the current month now, or leave it to run automatically at</w:t>
+      </w:r>
+      <w:r>
+        <w:t xml:space="preserve"> </w:t>
+      </w:r>
+      <w:r>
+        <w:rPr>
+          <w:bCs/>
+          <w:b/>
+        </w:rPr>
+        <w:t xml:space="preserve">07:00 on the 1st</w:t>
+      </w:r>
+      <w:r>
+        <w:t xml:space="preserve">.</w:t>
+      </w:r>
+    </w:p>
+    <w:p>
+      <w:pPr>
+        <w:numPr>
+          <w:ilvl w:val="0"/>
+          <w:numId w:val="1044"/>
+        </w:numPr>
+        <w:pStyle w:val="Compact"/>
+      </w:pPr>
+      <w:r>
+        <w:t xml:space="preserve">☐ Each technician has</w:t>
+      </w:r>
+      <w:r>
+        <w:t xml:space="preserve"> </w:t>
+      </w:r>
+      <w:r>
+        <w:rPr>
+          <w:bCs/>
+          <w:b/>
+        </w:rPr>
+        <w:t xml:space="preserve">exactly one</w:t>
+      </w:r>
+      <w:r>
+        <w:t xml:space="preserve"> </w:t>
+      </w:r>
+      <w:r>
+        <w:t xml:space="preserve">review and got</w:t>
+      </w:r>
+      <w:r>
+        <w:t xml:space="preserve"> </w:t>
+      </w:r>
+      <w:r>
+        <w:rPr>
+          <w:bCs/>
+          <w:b/>
+        </w:rPr>
+        <w:t xml:space="preserve">exactly one</w:t>
+      </w:r>
+      <w:r>
+        <w:t xml:space="preserve"> </w:t>
+      </w:r>
+      <w:r>
+        <w:t xml:space="preserve">email.</w:t>
+      </w:r>
+    </w:p>
+    <w:p>
+      <w:pPr>
+        <w:numPr>
+          <w:ilvl w:val="0"/>
+          <w:numId w:val="1044"/>
         </w:numPr>
         <w:pStyle w:val="Compact"/>
       </w:pPr>
@@ -16775,8 +17584,8 @@
         <w:tblLayout w:type="fixed"/>
       </w:tblPr>
       <w:tblGrid>
-        <w:gridCol w:w="2557"/>
-        <w:gridCol w:w="7307"/>
+        <w:gridCol w:w="4061"/>
+        <w:gridCol w:w="5802"/>
       </w:tblGrid>
       <w:tr>
         <w:trPr>
@@ -16784,7 +17593,7 @@
         </w:trPr>
         <w:tc>
           <w:tcPr>
-            <w:tcW w:type="dxa" w:w="2557"/>
+            <w:tcW w:type="dxa" w:w="4062"/>
             <w:shd w:val="clear" w:color="auto" w:fill="E4EDF2"/>
           </w:tcPr>
           <w:p>
@@ -16803,7 +17612,7 @@
         </w:tc>
         <w:tc>
           <w:tcPr>
-            <w:tcW w:type="dxa" w:w="7307"/>
+            <w:tcW w:type="dxa" w:w="5803"/>
             <w:shd w:val="clear" w:color="auto" w:fill="E4EDF2"/>
           </w:tcPr>
           <w:p>
@@ -16824,7 +17633,7 @@
       <w:tr>
         <w:tc>
           <w:tcPr>
-            <w:tcW w:type="dxa" w:w="2557"/>
+            <w:tcW w:type="dxa" w:w="4062"/>
           </w:tcPr>
           <w:p>
             <w:pPr>
@@ -16841,7 +17650,7 @@
         </w:tc>
         <w:tc>
           <w:tcPr>
-            <w:tcW w:type="dxa" w:w="7307"/>
+            <w:tcW w:type="dxa" w:w="5803"/>
           </w:tcPr>
           <w:p>
             <w:pPr>
@@ -16860,7 +17669,7 @@
       <w:tr>
         <w:tc>
           <w:tcPr>
-            <w:tcW w:type="dxa" w:w="2557"/>
+            <w:tcW w:type="dxa" w:w="4062"/>
           </w:tcPr>
           <w:p>
             <w:pPr>
@@ -16877,7 +17686,7 @@
         </w:tc>
         <w:tc>
           <w:tcPr>
-            <w:tcW w:type="dxa" w:w="7307"/>
+            <w:tcW w:type="dxa" w:w="5803"/>
           </w:tcPr>
           <w:p>
             <w:pPr>
@@ -16924,24 +17733,24 @@
       <w:tr>
         <w:tc>
           <w:tcPr>
-            <w:tcW w:type="dxa" w:w="2557"/>
-          </w:tcPr>
-          <w:p>
-            <w:pPr>
-              <w:pStyle w:val="Compact"/>
-              <w:jc w:val="left"/>
-            </w:pPr>
-            <w:r>
-              <w:rPr>
-                <w:sz w:val="18"/>
-              </w:rPr>
-              <w:t xml:space="preserve">20th and 27th</w:t>
-            </w:r>
-          </w:p>
-        </w:tc>
-        <w:tc>
-          <w:tcPr>
-            <w:tcW w:type="dxa" w:w="7307"/>
+            <w:tcW w:type="dxa" w:w="4062"/>
+          </w:tcPr>
+          <w:p>
+            <w:pPr>
+              <w:pStyle w:val="Compact"/>
+              <w:jc w:val="left"/>
+            </w:pPr>
+            <w:r>
+              <w:rPr>
+                <w:sz w:val="18"/>
+              </w:rPr>
+              <w:t xml:space="preserve">Your reminder days (default 20th and 27th)</w:t>
+            </w:r>
+          </w:p>
+        </w:tc>
+        <w:tc>
+          <w:tcPr>
+            <w:tcW w:type="dxa" w:w="5803"/>
           </w:tcPr>
           <w:p>
             <w:pPr>
@@ -16960,7 +17769,7 @@
       <w:tr>
         <w:tc>
           <w:tcPr>
-            <w:tcW w:type="dxa" w:w="2557"/>
+            <w:tcW w:type="dxa" w:w="4062"/>
           </w:tcPr>
           <w:p>
             <w:pPr>
@@ -16977,7 +17786,7 @@
         </w:tc>
         <w:tc>
           <w:tcPr>
-            <w:tcW w:type="dxa" w:w="7307"/>
+            <w:tcW w:type="dxa" w:w="5803"/>
           </w:tcPr>
           <w:p>
             <w:pPr>
@@ -18087,7 +18896,7 @@
                 <w:b/>
                 <w:sz w:val="18"/>
               </w:rPr>
-              <w:t xml:space="preserve">Monthly retention (first working day)</w:t>
+              <w:t xml:space="preserve">Feedback from the page</w:t>
             </w:r>
           </w:p>
         </w:tc>
@@ -18104,7 +18913,7 @@
               <w:rPr>
                 <w:sz w:val="18"/>
               </w:rPr>
-              <w:t xml:space="preserve">Delete reviews whose month is</w:t>
+              <w:t xml:space="preserve">Arrives by email (E13) as people use the 💬</w:t>
             </w:r>
             <w:r>
               <w:rPr>
@@ -18118,19 +18927,45 @@
                 <w:b/>
                 <w:sz w:val="18"/>
               </w:rPr>
-              <w:t xml:space="preserve">more than 24 months</w:t>
-            </w:r>
-            <w:r>
-              <w:rPr>
-                <w:sz w:val="18"/>
-              </w:rPr>
-              <w:t xml:space="preserve"> </w:t>
-            </w:r>
-            <w:r>
-              <w:rPr>
-                <w:sz w:val="18"/>
-              </w:rPr>
-              <w:t xml:space="preserve">ago, from</w:t>
+              <w:t xml:space="preserve">Feedback</w:t>
+            </w:r>
+            <w:r>
+              <w:rPr>
+                <w:sz w:val="18"/>
+              </w:rPr>
+              <w:t xml:space="preserve"> </w:t>
+            </w:r>
+            <w:r>
+              <w:rPr>
+                <w:sz w:val="18"/>
+              </w:rPr>
+              <w:t xml:space="preserve">bubble. If an email fails, the item shows in</w:t>
+            </w:r>
+            <w:r>
+              <w:rPr>
+                <w:sz w:val="18"/>
+              </w:rPr>
+              <w:t xml:space="preserve"> </w:t>
+            </w:r>
+            <w:r>
+              <w:rPr>
+                <w:iCs/>
+                <w:i/>
+                <w:sz w:val="18"/>
+              </w:rPr>
+              <w:t xml:space="preserve">Needs your attention</w:t>
+            </w:r>
+            <w:r>
+              <w:rPr>
+                <w:sz w:val="18"/>
+              </w:rPr>
+              <w:t xml:space="preserve"> </w:t>
+            </w:r>
+            <w:r>
+              <w:rPr>
+                <w:sz w:val="18"/>
+              </w:rPr>
+              <w:t xml:space="preserve">– read it there and</w:t>
             </w:r>
             <w:r>
               <w:rPr>
@@ -18144,19 +18979,13 @@
                 <w:b/>
                 <w:sz w:val="18"/>
               </w:rPr>
-              <w:t xml:space="preserve">both</w:t>
-            </w:r>
-            <w:r>
-              <w:rPr>
-                <w:sz w:val="18"/>
-              </w:rPr>
-              <w:t xml:space="preserve"> </w:t>
-            </w:r>
-            <w:r>
-              <w:rPr>
-                <w:sz w:val="18"/>
-              </w:rPr>
-              <w:t xml:space="preserve">Monthly Reviews and Manager Reviews (filter by MonthKey), and</w:t>
+              <w:t xml:space="preserve">Mark as read</w:t>
+            </w:r>
+            <w:r>
+              <w:rPr>
+                <w:sz w:val="18"/>
+              </w:rPr>
+              <w:t xml:space="preserve">. Everything sent stays in the</w:t>
             </w:r>
             <w:r>
               <w:rPr>
@@ -18170,13 +18999,155 @@
                 <w:b/>
                 <w:sz w:val="18"/>
               </w:rPr>
+              <w:t xml:space="preserve">1-to-1 Feedback</w:t>
+            </w:r>
+            <w:r>
+              <w:rPr>
+                <w:sz w:val="18"/>
+              </w:rPr>
+              <w:t xml:space="preserve"> </w:t>
+            </w:r>
+            <w:r>
+              <w:rPr>
+                <w:sz w:val="18"/>
+              </w:rPr>
+              <w:t xml:space="preserve">list (Owners only).</w:t>
+            </w:r>
+          </w:p>
+        </w:tc>
+      </w:tr>
+      <w:tr>
+        <w:tc>
+          <w:tcPr>
+            <w:tcW w:type="dxa" w:w="3946"/>
+          </w:tcPr>
+          <w:p>
+            <w:pPr>
+              <w:pStyle w:val="Compact"/>
+              <w:jc w:val="left"/>
+            </w:pPr>
+            <w:r>
+              <w:rPr>
+                <w:bCs/>
+                <w:b/>
+                <w:sz w:val="18"/>
+              </w:rPr>
+              <w:t xml:space="preserve">Monthly retention (first working day)</w:t>
+            </w:r>
+          </w:p>
+        </w:tc>
+        <w:tc>
+          <w:tcPr>
+            <w:tcW w:type="dxa" w:w="5919"/>
+          </w:tcPr>
+          <w:p>
+            <w:pPr>
+              <w:pStyle w:val="Compact"/>
+              <w:jc w:val="left"/>
+            </w:pPr>
+            <w:r>
+              <w:rPr>
+                <w:sz w:val="18"/>
+              </w:rPr>
+              <w:t xml:space="preserve">Delete reviews whose month is</w:t>
+            </w:r>
+            <w:r>
+              <w:rPr>
+                <w:sz w:val="18"/>
+              </w:rPr>
+              <w:t xml:space="preserve"> </w:t>
+            </w:r>
+            <w:r>
+              <w:rPr>
+                <w:bCs/>
+                <w:b/>
+                <w:sz w:val="18"/>
+              </w:rPr>
+              <w:t xml:space="preserve">more than 24 months</w:t>
+            </w:r>
+            <w:r>
+              <w:rPr>
+                <w:sz w:val="18"/>
+              </w:rPr>
+              <w:t xml:space="preserve"> </w:t>
+            </w:r>
+            <w:r>
+              <w:rPr>
+                <w:sz w:val="18"/>
+              </w:rPr>
+              <w:t xml:space="preserve">ago, from</w:t>
+            </w:r>
+            <w:r>
+              <w:rPr>
+                <w:sz w:val="18"/>
+              </w:rPr>
+              <w:t xml:space="preserve"> </w:t>
+            </w:r>
+            <w:r>
+              <w:rPr>
+                <w:bCs/>
+                <w:b/>
+                <w:sz w:val="18"/>
+              </w:rPr>
+              <w:t xml:space="preserve">both</w:t>
+            </w:r>
+            <w:r>
+              <w:rPr>
+                <w:sz w:val="18"/>
+              </w:rPr>
+              <w:t xml:space="preserve"> </w:t>
+            </w:r>
+            <w:r>
+              <w:rPr>
+                <w:sz w:val="18"/>
+              </w:rPr>
+              <w:t xml:space="preserve">Monthly Reviews and Manager Reviews (filter by MonthKey),</w:t>
+            </w:r>
+            <w:r>
+              <w:rPr>
+                <w:sz w:val="18"/>
+              </w:rPr>
+              <w:t xml:space="preserve"> </w:t>
+            </w:r>
+            <w:r>
+              <w:rPr>
+                <w:bCs/>
+                <w:b/>
+                <w:sz w:val="18"/>
+              </w:rPr>
               <w:t xml:space="preserve">Wellbeing Assessments completed (or, if never completed, created) more than 24 months ago</w:t>
             </w:r>
             <w:r>
               <w:rPr>
                 <w:sz w:val="18"/>
               </w:rPr>
-              <w:t xml:space="preserve">. Keeping the latest assessment of a current person for longer is an exception that needs HR's agreement. Record the deletion in a dated note, then empty the site recycle bin</w:t>
+              <w:t xml:space="preserve">, and</w:t>
+            </w:r>
+            <w:r>
+              <w:rPr>
+                <w:sz w:val="18"/>
+              </w:rPr>
+              <w:t xml:space="preserve"> </w:t>
+            </w:r>
+            <w:r>
+              <w:rPr>
+                <w:bCs/>
+                <w:b/>
+                <w:sz w:val="18"/>
+              </w:rPr>
+              <w:t xml:space="preserve">1-to-1 Feedback</w:t>
+            </w:r>
+            <w:r>
+              <w:rPr>
+                <w:sz w:val="18"/>
+              </w:rPr>
+              <w:t xml:space="preserve"> </w:t>
+            </w:r>
+            <w:r>
+              <w:rPr>
+                <w:sz w:val="18"/>
+              </w:rPr>
+              <w:t xml:space="preserve">items created more than 24 months ago. Keeping the latest assessment of a current person for longer is an exception that needs HR's agreement. Record the deletion in a dated note, then empty the site recycle bin</w:t>
             </w:r>
             <w:r>
               <w:rPr>
@@ -18928,6 +19899,140 @@
                 <w:sz w:val="18"/>
               </w:rPr>
               <w:t xml:space="preserve">; it runs within about 5 minutes. Check its run history.</w:t>
+            </w:r>
+          </w:p>
+        </w:tc>
+      </w:tr>
+      <w:tr>
+        <w:tc>
+          <w:tcPr>
+            <w:tcW w:type="dxa" w:w="4932"/>
+          </w:tcPr>
+          <w:p>
+            <w:pPr>
+              <w:pStyle w:val="Compact"/>
+              <w:jc w:val="left"/>
+            </w:pPr>
+            <w:r>
+              <w:rPr>
+                <w:sz w:val="18"/>
+              </w:rPr>
+              <w:t xml:space="preserve">A feedback email didn't arrive</w:t>
+            </w:r>
+          </w:p>
+        </w:tc>
+        <w:tc>
+          <w:tcPr>
+            <w:tcW w:type="dxa" w:w="4932"/>
+          </w:tcPr>
+          <w:p>
+            <w:pPr>
+              <w:pStyle w:val="Compact"/>
+              <w:jc w:val="left"/>
+            </w:pPr>
+            <w:r>
+              <w:rPr>
+                <w:sz w:val="18"/>
+              </w:rPr>
+              <w:t xml:space="preserve">Flow 6 must be</w:t>
+            </w:r>
+            <w:r>
+              <w:rPr>
+                <w:sz w:val="18"/>
+              </w:rPr>
+              <w:t xml:space="preserve"> </w:t>
+            </w:r>
+            <w:r>
+              <w:rPr>
+                <w:bCs/>
+                <w:b/>
+                <w:sz w:val="18"/>
+              </w:rPr>
+              <w:t xml:space="preserve">On</w:t>
+            </w:r>
+            <w:r>
+              <w:rPr>
+                <w:sz w:val="18"/>
+              </w:rPr>
+              <w:t xml:space="preserve">. If the email failed, the item is marked</w:t>
+            </w:r>
+            <w:r>
+              <w:rPr>
+                <w:sz w:val="18"/>
+              </w:rPr>
+              <w:t xml:space="preserve"> </w:t>
+            </w:r>
+            <w:r>
+              <w:rPr>
+                <w:iCs/>
+                <w:i/>
+                <w:sz w:val="18"/>
+              </w:rPr>
+              <w:t xml:space="preserve">Failed</w:t>
+            </w:r>
+            <w:r>
+              <w:rPr>
+                <w:sz w:val="18"/>
+              </w:rPr>
+              <w:t xml:space="preserve"> </w:t>
+            </w:r>
+            <w:r>
+              <w:rPr>
+                <w:sz w:val="18"/>
+              </w:rPr>
+              <w:t xml:space="preserve">in</w:t>
+            </w:r>
+            <w:r>
+              <w:rPr>
+                <w:sz w:val="18"/>
+              </w:rPr>
+              <w:t xml:space="preserve"> </w:t>
+            </w:r>
+            <w:r>
+              <w:rPr>
+                <w:bCs/>
+                <w:b/>
+                <w:sz w:val="18"/>
+              </w:rPr>
+              <w:t xml:space="preserve">1-to-1 Feedback</w:t>
+            </w:r>
+            <w:r>
+              <w:rPr>
+                <w:sz w:val="18"/>
+              </w:rPr>
+              <w:t xml:space="preserve"> </w:t>
+            </w:r>
+            <w:r>
+              <w:rPr>
+                <w:sz w:val="18"/>
+              </w:rPr>
+              <w:t xml:space="preserve">and shows in</w:t>
+            </w:r>
+            <w:r>
+              <w:rPr>
+                <w:sz w:val="18"/>
+              </w:rPr>
+              <w:t xml:space="preserve"> </w:t>
+            </w:r>
+            <w:r>
+              <w:rPr>
+                <w:iCs/>
+                <w:i/>
+                <w:sz w:val="18"/>
+              </w:rPr>
+              <w:t xml:space="preserve">Needs your attention</w:t>
+            </w:r>
+            <w:r>
+              <w:rPr>
+                <w:sz w:val="18"/>
+              </w:rPr>
+              <w:t xml:space="preserve"> </w:t>
+            </w:r>
+            <w:r>
+              <w:rPr>
+                <w:sz w:val="18"/>
+              </w:rPr>
+              <w:t xml:space="preserve">on the page – read it there. Check the run history.</w:t>
             </w:r>
           </w:p>
         </w:tc>
@@ -21339,9 +22444,9 @@
         <w:tblLayout w:type="fixed"/>
       </w:tblPr>
       <w:tblGrid>
-        <w:gridCol w:w="2636"/>
-        <w:gridCol w:w="2125"/>
-        <w:gridCol w:w="5102"/>
+        <w:gridCol w:w="2025"/>
+        <w:gridCol w:w="3919"/>
+        <w:gridCol w:w="3919"/>
       </w:tblGrid>
       <w:tr>
         <w:trPr>
@@ -21349,7 +22454,7 @@
         </w:trPr>
         <w:tc>
           <w:tcPr>
-            <w:tcW w:type="dxa" w:w="2636"/>
+            <w:tcW w:type="dxa" w:w="2025"/>
             <w:shd w:val="clear" w:color="auto" w:fill="E4EDF2"/>
           </w:tcPr>
           <w:p>
@@ -21368,7 +22473,7 @@
         </w:tc>
         <w:tc>
           <w:tcPr>
-            <w:tcW w:type="dxa" w:w="2126"/>
+            <w:tcW w:type="dxa" w:w="3920"/>
             <w:shd w:val="clear" w:color="auto" w:fill="E4EDF2"/>
           </w:tcPr>
           <w:p>
@@ -21387,7 +22492,7 @@
         </w:tc>
         <w:tc>
           <w:tcPr>
-            <w:tcW w:type="dxa" w:w="5102"/>
+            <w:tcW w:type="dxa" w:w="3920"/>
             <w:shd w:val="clear" w:color="auto" w:fill="E4EDF2"/>
           </w:tcPr>
           <w:p>
@@ -21408,7 +22513,7 @@
       <w:tr>
         <w:tc>
           <w:tcPr>
-            <w:tcW w:type="dxa" w:w="2636"/>
+            <w:tcW w:type="dxa" w:w="2025"/>
           </w:tcPr>
           <w:p>
             <w:pPr>
@@ -21425,7 +22530,7 @@
         </w:tc>
         <w:tc>
           <w:tcPr>
-            <w:tcW w:type="dxa" w:w="2126"/>
+            <w:tcW w:type="dxa" w:w="3920"/>
           </w:tcPr>
           <w:p>
             <w:pPr>
@@ -21442,18 +22547,18 @@
         </w:tc>
         <w:tc>
           <w:tcPr>
-            <w:tcW w:type="dxa" w:w="5102"/>
-          </w:tcPr>
-          <w:p>
-            <w:pPr>
-              <w:pStyle w:val="Compact"/>
-              <w:jc w:val="left"/>
-            </w:pPr>
-            <w:r>
-              <w:rPr>
-                <w:sz w:val="18"/>
-              </w:rPr>
-              <w:t xml:space="preserve">Creates or completes the lists, columns, indexes, views, permission levels, group, list permissions and the Bands setting. Safe to re-run; never deletes data; emails a summary.</w:t>
+            <w:tcW w:type="dxa" w:w="3920"/>
+          </w:tcPr>
+          <w:p>
+            <w:pPr>
+              <w:pStyle w:val="Compact"/>
+              <w:jc w:val="left"/>
+            </w:pPr>
+            <w:r>
+              <w:rPr>
+                <w:sz w:val="18"/>
+              </w:rPr>
+              <w:t xml:space="preserve">Creates or completes the lists, columns, indexes, views, permission levels, group, list permissions and the Bands and Reminders settings. Safe to re-run; never deletes data; emails a summary.</w:t>
             </w:r>
           </w:p>
         </w:tc>
@@ -21461,7 +22566,7 @@
       <w:tr>
         <w:tc>
           <w:tcPr>
-            <w:tcW w:type="dxa" w:w="2636"/>
+            <w:tcW w:type="dxa" w:w="2025"/>
           </w:tcPr>
           <w:p>
             <w:pPr>
@@ -21478,7 +22583,7 @@
         </w:tc>
         <w:tc>
           <w:tcPr>
-            <w:tcW w:type="dxa" w:w="2126"/>
+            <w:tcW w:type="dxa" w:w="3920"/>
           </w:tcPr>
           <w:p>
             <w:pPr>
@@ -21495,18 +22600,18 @@
         </w:tc>
         <w:tc>
           <w:tcPr>
-            <w:tcW w:type="dxa" w:w="5102"/>
-          </w:tcPr>
-          <w:p>
-            <w:pPr>
-              <w:pStyle w:val="Compact"/>
-              <w:jc w:val="left"/>
-            </w:pPr>
-            <w:r>
-              <w:rPr>
-                <w:sz w:val="18"/>
-              </w:rPr>
-              <w:t xml:space="preserve">Creates each month's reviews, makes them private, emails each technician their own link, sends reminders on the 20th and 27th, and reports problems to you</w:t>
+            <w:tcW w:type="dxa" w:w="3920"/>
+          </w:tcPr>
+          <w:p>
+            <w:pPr>
+              <w:pStyle w:val="Compact"/>
+              <w:jc w:val="left"/>
+            </w:pPr>
+            <w:r>
+              <w:rPr>
+                <w:sz w:val="18"/>
+              </w:rPr>
+              <w:t xml:space="preserve">Creates each month's reviews, makes them private, emails each technician their own link, sends reminders on your reminder days (default 20th and 27th), emails you before wellbeing reviews are due, and reports problems to you</w:t>
             </w:r>
           </w:p>
         </w:tc>
@@ -21514,7 +22619,7 @@
       <w:tr>
         <w:tc>
           <w:tcPr>
-            <w:tcW w:type="dxa" w:w="2636"/>
+            <w:tcW w:type="dxa" w:w="2025"/>
           </w:tcPr>
           <w:p>
             <w:pPr>
@@ -21531,7 +22636,7 @@
         </w:tc>
         <w:tc>
           <w:tcPr>
-            <w:tcW w:type="dxa" w:w="2126"/>
+            <w:tcW w:type="dxa" w:w="3920"/>
           </w:tcPr>
           <w:p>
             <w:pPr>
@@ -21548,7 +22653,7 @@
         </w:tc>
         <w:tc>
           <w:tcPr>
-            <w:tcW w:type="dxa" w:w="5102"/>
+            <w:tcW w:type="dxa" w:w="3920"/>
           </w:tcPr>
           <w:p>
             <w:pPr>
@@ -21567,7 +22672,7 @@
       <w:tr>
         <w:tc>
           <w:tcPr>
-            <w:tcW w:type="dxa" w:w="2636"/>
+            <w:tcW w:type="dxa" w:w="2025"/>
           </w:tcPr>
           <w:p>
             <w:pPr>
@@ -21584,7 +22689,7 @@
         </w:tc>
         <w:tc>
           <w:tcPr>
-            <w:tcW w:type="dxa" w:w="2126"/>
+            <w:tcW w:type="dxa" w:w="3920"/>
           </w:tcPr>
           <w:p>
             <w:pPr>
@@ -21601,7 +22706,7 @@
         </w:tc>
         <w:tc>
           <w:tcPr>
-            <w:tcW w:type="dxa" w:w="5102"/>
+            <w:tcW w:type="dxa" w:w="3920"/>
           </w:tcPr>
           <w:p>
             <w:pPr>
@@ -21613,6 +22718,179 @@
                 <w:sz w:val="18"/>
               </w:rPr>
               <w:t xml:space="preserve">Validates, locks, releases your feedback to that technician only, emails them</w:t>
+            </w:r>
+          </w:p>
+        </w:tc>
+      </w:tr>
+      <w:tr>
+        <w:tc>
+          <w:tcPr>
+            <w:tcW w:type="dxa" w:w="2025"/>
+          </w:tcPr>
+          <w:p>
+            <w:pPr>
+              <w:pStyle w:val="Compact"/>
+              <w:jc w:val="left"/>
+            </w:pPr>
+            <w:r>
+              <w:rPr>
+                <w:sz w:val="18"/>
+              </w:rPr>
+              <w:t xml:space="preserve">ESG 1-to-1 | 4 Team members</w:t>
+            </w:r>
+          </w:p>
+        </w:tc>
+        <w:tc>
+          <w:tcPr>
+            <w:tcW w:type="dxa" w:w="3920"/>
+          </w:tcPr>
+          <w:p>
+            <w:pPr>
+              <w:pStyle w:val="Compact"/>
+              <w:jc w:val="left"/>
+            </w:pPr>
+            <w:r>
+              <w:rPr>
+                <w:sz w:val="18"/>
+              </w:rPr>
+              <w:t xml:space="preserve">when you add or deactivate someone (checks every 5 min)</w:t>
+            </w:r>
+          </w:p>
+        </w:tc>
+        <w:tc>
+          <w:tcPr>
+            <w:tcW w:type="dxa" w:w="3920"/>
+          </w:tcPr>
+          <w:p>
+            <w:pPr>
+              <w:pStyle w:val="Compact"/>
+              <w:jc w:val="left"/>
+            </w:pPr>
+            <w:r>
+              <w:rPr>
+                <w:sz w:val="18"/>
+              </w:rPr>
+              <w:t xml:space="preserve">Gives or removes access to the page; removes anyone in the group without an Active row; emails you</w:t>
+            </w:r>
+          </w:p>
+        </w:tc>
+      </w:tr>
+      <w:tr>
+        <w:tc>
+          <w:tcPr>
+            <w:tcW w:type="dxa" w:w="2025"/>
+          </w:tcPr>
+          <w:p>
+            <w:pPr>
+              <w:pStyle w:val="Compact"/>
+              <w:jc w:val="left"/>
+            </w:pPr>
+            <w:r>
+              <w:rPr>
+                <w:sz w:val="18"/>
+              </w:rPr>
+              <w:t xml:space="preserve">ESG 1-to-1 | 5 Wellbeing</w:t>
+            </w:r>
+          </w:p>
+        </w:tc>
+        <w:tc>
+          <w:tcPr>
+            <w:tcW w:type="dxa" w:w="3920"/>
+          </w:tcPr>
+          <w:p>
+            <w:pPr>
+              <w:pStyle w:val="Compact"/>
+              <w:jc w:val="left"/>
+            </w:pPr>
+            <w:r>
+              <w:rPr>
+                <w:sz w:val="18"/>
+              </w:rPr>
+              <w:t xml:space="preserve">as a wellbeing assessment moves on (checks every 5 min)</w:t>
+            </w:r>
+          </w:p>
+        </w:tc>
+        <w:tc>
+          <w:tcPr>
+            <w:tcW w:type="dxa" w:w="3920"/>
+          </w:tcPr>
+          <w:p>
+            <w:pPr>
+              <w:pStyle w:val="Compact"/>
+              <w:jc w:val="left"/>
+            </w:pPr>
+            <w:r>
+              <w:rPr>
+                <w:sz w:val="18"/>
+              </w:rPr>
+              <w:t xml:space="preserve">Shares it with that person only, locks it when they submit, stamps completion, emails you both</w:t>
+            </w:r>
+          </w:p>
+        </w:tc>
+      </w:tr>
+      <w:tr>
+        <w:tc>
+          <w:tcPr>
+            <w:tcW w:type="dxa" w:w="2025"/>
+          </w:tcPr>
+          <w:p>
+            <w:pPr>
+              <w:pStyle w:val="Compact"/>
+              <w:jc w:val="left"/>
+            </w:pPr>
+            <w:r>
+              <w:rPr>
+                <w:sz w:val="18"/>
+              </w:rPr>
+              <w:t xml:space="preserve">ESG 1-to-1 | 6 Feedback</w:t>
+            </w:r>
+          </w:p>
+        </w:tc>
+        <w:tc>
+          <w:tcPr>
+            <w:tcW w:type="dxa" w:w="3920"/>
+          </w:tcPr>
+          <w:p>
+            <w:pPr>
+              <w:pStyle w:val="Compact"/>
+              <w:jc w:val="left"/>
+            </w:pPr>
+            <w:r>
+              <w:rPr>
+                <w:sz w:val="18"/>
+              </w:rPr>
+              <w:t xml:space="preserve">when someone uses the 💬 Feedback bubble (checks every 5 min)</w:t>
+            </w:r>
+          </w:p>
+        </w:tc>
+        <w:tc>
+          <w:tcPr>
+            <w:tcW w:type="dxa" w:w="3920"/>
+          </w:tcPr>
+          <w:p>
+            <w:pPr>
+              <w:pStyle w:val="Compact"/>
+              <w:jc w:val="left"/>
+            </w:pPr>
+            <w:r>
+              <w:rPr>
+                <w:sz w:val="18"/>
+              </w:rPr>
+              <w:t xml:space="preserve">Makes the item Owners-only and emails it to you; if that fails, marks it Failed and it shows in</w:t>
+            </w:r>
+            <w:r>
+              <w:rPr>
+                <w:sz w:val="18"/>
+              </w:rPr>
+              <w:t xml:space="preserve"> </w:t>
+            </w:r>
+            <w:r>
+              <w:rPr>
+                <w:iCs/>
+                <w:i/>
+                <w:sz w:val="18"/>
+              </w:rPr>
+              <w:t xml:space="preserve">Needs your attention</w:t>
             </w:r>
           </w:p>
         </w:tc>
@@ -23381,6 +24659,9 @@
     <w:abstractNumId w:val="991"/>
   </w:num>
   <w:num w:numId="1034">
+    <w:abstractNumId w:val="991"/>
+  </w:num>
+  <w:num w:numId="1035">
     <w:abstractNumId w:val="99411"/>
     <w:lvlOverride w:ilvl="0">
       <w:startOverride w:val="1"/>
@@ -23410,9 +24691,6 @@
       <w:startOverride w:val="1"/>
     </w:lvlOverride>
   </w:num>
-  <w:num w:numId="1035">
-    <w:abstractNumId w:val="991"/>
-  </w:num>
   <w:num w:numId="1036">
     <w:abstractNumId w:val="991"/>
   </w:num>
@@ -23435,6 +24713,9 @@
     <w:abstractNumId w:val="991"/>
   </w:num>
   <w:num w:numId="1043">
+    <w:abstractNumId w:val="991"/>
+  </w:num>
+  <w:num w:numId="1044">
     <w:abstractNumId w:val="991"/>
   </w:num>
 </w:numbering>

</xml_diff>

<commit_message>
v4.4.0: auto-save, shorter form, Since last time (frontend only)
- Auto-save for the technician's monthly and wellbeing forms and the TL review until
  released (4 s after typing, max every 20 s, quiet status line)
- Time left on the form; Q2 folded while empty; Yes/No questions fold when No
- 'Since last time' card: last month's raised items, released replies, actions
- Tests section 20; mock failWrites hook; docs (F43, F44)

Co-Authored-By: Claude Opus 5.5 <noreply@anthropic.com>
Claude-Session: https://claude.ai/code/session_014y1MJU3GKp2dkeyoic78UT
</commit_message>
<xml_diff>
--- a/one-to-one/ESG-1to1-Finalisation-Guide.docx
+++ b/one-to-one/ESG-1to1-Finalisation-Guide.docx
@@ -34,7 +34,7 @@
         <w:pStyle w:val="BodyText"/>
       </w:pPr>
       <w:r>
-        <w:t xml:space="preserve">Version: system v4.3.0 (frontend) · solution 1.2.0.0 · guide dated 15-Oct-2026</w:t>
+        <w:t xml:space="preserve">Version: system v4.4.0 (frontend) · solution 1.2.0.0 · guide dated 15-Oct-2026</w:t>
       </w:r>
     </w:p>
     <w:p>
@@ -1430,7 +1430,7 @@
         <w:t xml:space="preserve"> </w:t>
       </w:r>
       <w:r>
-        <w:t xml:space="preserve">(v4.3.0). After installing, the top menu bar must show</w:t>
+        <w:t xml:space="preserve">(v4.4.0). After installing, the top menu bar must show</w:t>
       </w:r>
       <w:r>
         <w:t xml:space="preserve"> </w:t>
@@ -1440,7 +1440,7 @@
           <w:bCs/>
           <w:b/>
         </w:rPr>
-        <w:t xml:space="preserve">v4.3.0</w:t>
+        <w:t xml:space="preserve">v4.4.0</w:t>
       </w:r>
       <w:r>
         <w:t xml:space="preserve"> </w:t>
@@ -4462,7 +4462,7 @@
           <w:bCs/>
           <w:b/>
         </w:rPr>
-        <w:t xml:space="preserve">v4.3.0</w:t>
+        <w:t xml:space="preserve">v4.4.0</w:t>
       </w:r>
       <w:r>
         <w:t xml:space="preserve"> </w:t>
@@ -5854,7 +5854,7 @@
         <w:pStyle w:val="Compact"/>
       </w:pPr>
       <w:r>
-        <w:t xml:space="preserve">Fill in a few answers →</w:t>
+        <w:t xml:space="preserve">Fill in a few answers. Within about 5 seconds the top shows</w:t>
       </w:r>
       <w:r>
         <w:t xml:space="preserve"> </w:t>
@@ -5864,13 +5864,13 @@
           <w:bCs/>
           <w:b/>
         </w:rPr>
-        <w:t xml:space="preserve">Save</w:t>
-      </w:r>
-      <w:r>
-        <w:t xml:space="preserve"> </w:t>
-      </w:r>
-      <w:r>
-        <w:t xml:space="preserve">→ reload. The answers are kept.</w:t>
+        <w:t xml:space="preserve">Saved hh:mm</w:t>
+      </w:r>
+      <w:r>
+        <w:t xml:space="preserve"> </w:t>
+      </w:r>
+      <w:r>
+        <w:t xml:space="preserve">– no need to click Save. Reload: the answers are kept (F43).</w:t>
       </w:r>
     </w:p>
     <w:p>
@@ -6331,6 +6331,47 @@
       </w:r>
       <w:r>
         <w:t xml:space="preserve">works.</w:t>
+      </w:r>
+    </w:p>
+    <w:p>
+      <w:pPr>
+        <w:numPr>
+          <w:ilvl w:val="0"/>
+          <w:numId w:val="1026"/>
+        </w:numPr>
+        <w:pStyle w:val="Compact"/>
+      </w:pPr>
+      <w:r>
+        <w:t xml:space="preserve">☐</w:t>
+      </w:r>
+      <w:r>
+        <w:t xml:space="preserve"> </w:t>
+      </w:r>
+      <w:r>
+        <w:rPr>
+          <w:bCs/>
+          <w:b/>
+        </w:rPr>
+        <w:t xml:space="preserve">Month two – "Since last time" (F44):</w:t>
+      </w:r>
+      <w:r>
+        <w:t xml:space="preserve"> </w:t>
+      </w:r>
+      <w:r>
+        <w:t xml:space="preserve">with Flow 1's test date set to the next month (§6), Test A's new form starts with</w:t>
+      </w:r>
+      <w:r>
+        <w:t xml:space="preserve"> </w:t>
+      </w:r>
+      <w:r>
+        <w:rPr>
+          <w:bCs/>
+          <w:b/>
+        </w:rPr>
+        <w:t xml:space="preserve">Since last time</w:t>
+      </w:r>
+      <w:r>
+        <w:t xml:space="preserve">: what they raised, your replies and their actions.</w:t>
       </w:r>
     </w:p>
     <w:p>
@@ -7443,13 +7484,13 @@
         </w:tc>
       </w:tr>
     </w:tbl>
-    <w:bookmarkStart w:id="33" w:name="X29f1185c5b7a44551d9087d21e6bf3fb17d63d6"/>
+    <w:bookmarkStart w:id="33" w:name="X631a8b67414a0817466e69ebd2551d6d0d8e819"/>
     <w:p>
       <w:pPr>
         <w:pStyle w:val="Heading3"/>
       </w:pPr>
       <w:r>
-        <w:t xml:space="preserve">6.1 Functional tests (F1–F42)</w:t>
+        <w:t xml:space="preserve">6.1 Functional tests (F1–F44)</w:t>
       </w:r>
     </w:p>
     <w:tbl>
@@ -12193,6 +12234,226 @@
                 <w:sz w:val="18"/>
               </w:rPr>
               <w:t xml:space="preserve">Mark as read</w:t>
+            </w:r>
+            <w:r>
+              <w:rPr>
+                <w:sz w:val="18"/>
+              </w:rPr>
+              <w:t xml:space="preserve">.</w:t>
+            </w:r>
+          </w:p>
+        </w:tc>
+        <w:tc>
+          <w:tcPr>
+            <w:tcW w:type="dxa" w:w="907"/>
+          </w:tcPr>
+          <w:p>
+            <w:pPr>
+              <w:pStyle w:val="Compact"/>
+            </w:pPr>
+          </w:p>
+        </w:tc>
+        <w:tc>
+          <w:tcPr>
+            <w:tcW w:type="dxa" w:w="850"/>
+          </w:tcPr>
+          <w:p>
+            <w:pPr>
+              <w:pStyle w:val="Compact"/>
+            </w:pPr>
+          </w:p>
+        </w:tc>
+        <w:tc>
+          <w:tcPr>
+            <w:tcW w:type="dxa" w:w="1191"/>
+          </w:tcPr>
+          <w:p>
+            <w:pPr>
+              <w:pStyle w:val="Compact"/>
+            </w:pPr>
+          </w:p>
+        </w:tc>
+      </w:tr>
+      <w:tr>
+        <w:tc>
+          <w:tcPr>
+            <w:tcW w:type="dxa" w:w="737"/>
+          </w:tcPr>
+          <w:p>
+            <w:pPr>
+              <w:pStyle w:val="Compact"/>
+              <w:jc w:val="left"/>
+            </w:pPr>
+            <w:r>
+              <w:rPr>
+                <w:sz w:val="18"/>
+              </w:rPr>
+              <w:t xml:space="preserve">F43 (v4.4)</w:t>
+            </w:r>
+          </w:p>
+        </w:tc>
+        <w:tc>
+          <w:tcPr>
+            <w:tcW w:type="dxa" w:w="3118"/>
+          </w:tcPr>
+          <w:p>
+            <w:pPr>
+              <w:pStyle w:val="Compact"/>
+              <w:jc w:val="left"/>
+            </w:pPr>
+            <w:r>
+              <w:rPr>
+                <w:sz w:val="18"/>
+              </w:rPr>
+              <w:t xml:space="preserve">As A: type an answer, wait about 5 s, reload</w:t>
+            </w:r>
+          </w:p>
+        </w:tc>
+        <w:tc>
+          <w:tcPr>
+            <w:tcW w:type="dxa" w:w="3061"/>
+          </w:tcPr>
+          <w:p>
+            <w:pPr>
+              <w:pStyle w:val="Compact"/>
+              <w:jc w:val="left"/>
+            </w:pPr>
+            <w:r>
+              <w:rPr>
+                <w:sz w:val="18"/>
+              </w:rPr>
+              <w:t xml:space="preserve">Top shows</w:t>
+            </w:r>
+            <w:r>
+              <w:rPr>
+                <w:sz w:val="18"/>
+              </w:rPr>
+              <w:t xml:space="preserve"> </w:t>
+            </w:r>
+            <w:r>
+              <w:rPr>
+                <w:iCs/>
+                <w:i/>
+                <w:sz w:val="18"/>
+              </w:rPr>
+              <w:t xml:space="preserve">Saved hh:mm</w:t>
+            </w:r>
+            <w:r>
+              <w:rPr>
+                <w:sz w:val="18"/>
+              </w:rPr>
+              <w:t xml:space="preserve">; the answer is kept; the review is still a Draft (no submission email).</w:t>
+            </w:r>
+          </w:p>
+        </w:tc>
+        <w:tc>
+          <w:tcPr>
+            <w:tcW w:type="dxa" w:w="907"/>
+          </w:tcPr>
+          <w:p>
+            <w:pPr>
+              <w:pStyle w:val="Compact"/>
+            </w:pPr>
+          </w:p>
+        </w:tc>
+        <w:tc>
+          <w:tcPr>
+            <w:tcW w:type="dxa" w:w="850"/>
+          </w:tcPr>
+          <w:p>
+            <w:pPr>
+              <w:pStyle w:val="Compact"/>
+            </w:pPr>
+          </w:p>
+        </w:tc>
+        <w:tc>
+          <w:tcPr>
+            <w:tcW w:type="dxa" w:w="1191"/>
+          </w:tcPr>
+          <w:p>
+            <w:pPr>
+              <w:pStyle w:val="Compact"/>
+            </w:pPr>
+          </w:p>
+        </w:tc>
+      </w:tr>
+      <w:tr>
+        <w:tc>
+          <w:tcPr>
+            <w:tcW w:type="dxa" w:w="737"/>
+          </w:tcPr>
+          <w:p>
+            <w:pPr>
+              <w:pStyle w:val="Compact"/>
+              <w:jc w:val="left"/>
+            </w:pPr>
+            <w:r>
+              <w:rPr>
+                <w:sz w:val="18"/>
+              </w:rPr>
+              <w:t xml:space="preserve">F44 (v4.4)</w:t>
+            </w:r>
+          </w:p>
+        </w:tc>
+        <w:tc>
+          <w:tcPr>
+            <w:tcW w:type="dxa" w:w="3118"/>
+          </w:tcPr>
+          <w:p>
+            <w:pPr>
+              <w:pStyle w:val="Compact"/>
+              <w:jc w:val="left"/>
+            </w:pPr>
+            <w:r>
+              <w:rPr>
+                <w:sz w:val="18"/>
+              </w:rPr>
+              <w:t xml:space="preserve">Month two (test date next month): open A's new form</w:t>
+            </w:r>
+          </w:p>
+        </w:tc>
+        <w:tc>
+          <w:tcPr>
+            <w:tcW w:type="dxa" w:w="3061"/>
+          </w:tcPr>
+          <w:p>
+            <w:pPr>
+              <w:pStyle w:val="Compact"/>
+              <w:jc w:val="left"/>
+            </w:pPr>
+            <w:r>
+              <w:rPr>
+                <w:bCs/>
+                <w:b/>
+                <w:sz w:val="18"/>
+              </w:rPr>
+              <w:t xml:space="preserve">Since last time</w:t>
+            </w:r>
+            <w:r>
+              <w:rPr>
+                <w:sz w:val="18"/>
+              </w:rPr>
+              <w:t xml:space="preserve"> </w:t>
+            </w:r>
+            <w:r>
+              <w:rPr>
+                <w:sz w:val="18"/>
+              </w:rPr>
+              <w:t xml:space="preserve">lists last month's raised items, your released replies and A's actions. Before you release, it says</w:t>
+            </w:r>
+            <w:r>
+              <w:rPr>
+                <w:sz w:val="18"/>
+              </w:rPr>
+              <w:t xml:space="preserve"> </w:t>
+            </w:r>
+            <w:r>
+              <w:rPr>
+                <w:iCs/>
+                <w:i/>
+                <w:sz w:val="18"/>
+              </w:rPr>
+              <w:t xml:space="preserve">Feedback not released yet</w:t>
             </w:r>
             <w:r>
               <w:rPr>

</xml_diff>

<commit_message>
Security hardening, formatting fixes and solution 1.2.1.0
- Flow 6: lock decided from item permissions, flood guard (Held), Submit level
- Flow 5: exactly one holder, used assessments never re-shared, tidy while open
- Flows 1/2/4: active-only reminders, trusted submit time, any-Active membership
- Frontend 4.4.0: formatting fixes, feedback trust, robustness tests
- VERIFICATION third round, docs and guide updated

Co-Authored-By: Claude Opus 5.5 <noreply@anthropic.com>
Claude-Session: https://claude.ai/code/session_014y1MJU3GKp2dkeyoic78UT
</commit_message>
<xml_diff>
--- a/one-to-one/ESG-1to1-Finalisation-Guide.docx
+++ b/one-to-one/ESG-1to1-Finalisation-Guide.docx
@@ -34,7 +34,7 @@
         <w:pStyle w:val="BodyText"/>
       </w:pPr>
       <w:r>
-        <w:t xml:space="preserve">Version: system v4.4.0 (frontend) · solution 1.2.0.0 · guide dated 15-Oct-2026</w:t>
+        <w:t xml:space="preserve">Version: system v4.4.0 (frontend) · solution 1.2.1.0 · guide dated 15-Oct-2026</w:t>
       </w:r>
     </w:p>
     <w:p>
@@ -220,7 +220,7 @@
         <w:pStyle w:val="Compact"/>
       </w:pPr>
       <w:r>
-        <w:t xml:space="preserve">flows: simulated end to end, 167 checks, and 23 deliberately broken copies all caught by the validator;</w:t>
+        <w:t xml:space="preserve">flows: simulated end to end, 180 checks, and 23 deliberately broken copies all caught by the validator;</w:t>
       </w:r>
     </w:p>
     <w:p>
@@ -262,7 +262,7 @@
           <w:bCs/>
           <w:b/>
         </w:rPr>
-        <w:t xml:space="preserve">The system is fully implemented when Phase F (go-live) is done and every privacy test (P1–P25) in Phase C has passed.</w:t>
+        <w:t xml:space="preserve">The system is fully implemented when Phase F (go-live) is done and every privacy test (P1–P28) in Phase C has passed.</w:t>
       </w:r>
     </w:p>
     <w:tbl>
@@ -1042,7 +1042,7 @@
                 <w:rStyle w:val="VerbatimChar"/>
                 <w:sz w:val="18"/>
               </w:rPr>
-              <w:t xml:space="preserve">ESGOneToOne_1_2_0_0_unmanaged.zip</w:t>
+              <w:t xml:space="preserve">ESGOneToOne_1_2_1_0_unmanaged.zip</w:t>
             </w:r>
           </w:p>
         </w:tc>
@@ -1979,7 +1979,7 @@
         <w:rPr>
           <w:rStyle w:val="VerbatimChar"/>
         </w:rPr>
-        <w:t xml:space="preserve">ESGOneToOne_1_2_0_0_unmanaged.zip</w:t>
+        <w:t xml:space="preserve">ESGOneToOne_1_2_1_0_unmanaged.zip</w:t>
       </w:r>
       <w:r>
         <w:t xml:space="preserve"> </w:t>
@@ -2688,13 +2688,7 @@
               <w:rPr>
                 <w:sz w:val="18"/>
               </w:rPr>
-              <w:t xml:space="preserve"> </w:t>
-            </w:r>
-            <w:r>
-              <w:rPr>
-                <w:sz w:val="18"/>
-              </w:rPr>
-              <w:t xml:space="preserve">and</w:t>
+              <w:t xml:space="preserve">,</w:t>
             </w:r>
             <w:r>
               <w:rPr>
@@ -2708,6 +2702,31 @@
                 <w:sz w:val="18"/>
               </w:rPr>
               <w:t xml:space="preserve">1-to-1 Read</w:t>
+            </w:r>
+            <w:r>
+              <w:rPr>
+                <w:sz w:val="18"/>
+              </w:rPr>
+              <w:t xml:space="preserve"> </w:t>
+            </w:r>
+            <w:r>
+              <w:rPr>
+                <w:sz w:val="18"/>
+              </w:rPr>
+              <w:t xml:space="preserve">and (from 1.2.1)</w:t>
+            </w:r>
+            <w:r>
+              <w:rPr>
+                <w:sz w:val="18"/>
+              </w:rPr>
+              <w:t xml:space="preserve"> </w:t>
+            </w:r>
+            <w:r>
+              <w:rPr>
+                <w:rStyle w:val="VerbatimChar"/>
+                <w:sz w:val="18"/>
+              </w:rPr>
+              <w:t xml:space="preserve">1-to-1 Submit</w:t>
             </w:r>
             <w:r>
               <w:rPr>
@@ -3423,19 +3442,19 @@
                 <w:b/>
                 <w:sz w:val="18"/>
               </w:rPr>
-              <w:t xml:space="preserve">Contribute</w:t>
-            </w:r>
-            <w:r>
-              <w:rPr>
-                <w:sz w:val="18"/>
-              </w:rPr>
-              <w:t xml:space="preserve"> </w:t>
-            </w:r>
-            <w:r>
-              <w:rPr>
-                <w:sz w:val="18"/>
-              </w:rPr>
-              <w:t xml:space="preserve">on this list only</w:t>
+              <w:t xml:space="preserve">1-to-1 Submit</w:t>
+            </w:r>
+            <w:r>
+              <w:rPr>
+                <w:sz w:val="18"/>
+              </w:rPr>
+              <w:t xml:space="preserve"> </w:t>
+            </w:r>
+            <w:r>
+              <w:rPr>
+                <w:sz w:val="18"/>
+              </w:rPr>
+              <w:t xml:space="preserve">on this list only (a third permission level setup creates: Contribute without delete, versions, alerts or personal views)</w:t>
             </w:r>
           </w:p>
         </w:tc>
@@ -3718,7 +3737,7 @@
           <w:bCs/>
           <w:b/>
         </w:rPr>
-        <w:t xml:space="preserve">Contribute</w:t>
+        <w:t xml:space="preserve">1-to-1 Submit</w:t>
       </w:r>
       <w:r>
         <w:t xml:space="preserve">; its Advanced settings →</w:t>
@@ -12496,13 +12515,13 @@
       </w:tr>
     </w:tbl>
     <w:bookmarkEnd w:id="33"/>
-    <w:bookmarkStart w:id="34" w:name="X10f91ce9176fff7ec5cf8d524d1d2ceb5e26f44"/>
+    <w:bookmarkStart w:id="34" w:name="Xcdec7e7145c0d859a69163cb3e17298d32f23d5"/>
     <w:p>
       <w:pPr>
         <w:pStyle w:val="Heading3"/>
       </w:pPr>
       <w:r>
-        <w:t xml:space="preserve">6.2 Privacy and bypass tests (P1–P25) — all mandatory</w:t>
+        <w:t xml:space="preserve">6.2 Privacy and bypass tests (P1–P28) — all mandatory</w:t>
       </w:r>
     </w:p>
     <w:tbl>
@@ -16470,6 +16489,495 @@
                 <w:sz w:val="18"/>
               </w:rPr>
               <w:t xml:space="preserve">B gets none of A's items; A gets nothing back once it's locked.</w:t>
+            </w:r>
+          </w:p>
+        </w:tc>
+        <w:tc>
+          <w:tcPr>
+            <w:tcW w:type="dxa" w:w="850"/>
+          </w:tcPr>
+          <w:p>
+            <w:pPr>
+              <w:pStyle w:val="Compact"/>
+            </w:pPr>
+          </w:p>
+        </w:tc>
+        <w:tc>
+          <w:tcPr>
+            <w:tcW w:type="dxa" w:w="794"/>
+          </w:tcPr>
+          <w:p>
+            <w:pPr>
+              <w:pStyle w:val="Compact"/>
+            </w:pPr>
+          </w:p>
+        </w:tc>
+        <w:tc>
+          <w:tcPr>
+            <w:tcW w:type="dxa" w:w="850"/>
+          </w:tcPr>
+          <w:p>
+            <w:pPr>
+              <w:pStyle w:val="Compact"/>
+            </w:pPr>
+          </w:p>
+        </w:tc>
+      </w:tr>
+      <w:tr>
+        <w:tc>
+          <w:tcPr>
+            <w:tcW w:type="dxa" w:w="680"/>
+          </w:tcPr>
+          <w:p>
+            <w:pPr>
+              <w:pStyle w:val="Compact"/>
+              <w:jc w:val="left"/>
+            </w:pPr>
+            <w:r>
+              <w:rPr>
+                <w:sz w:val="18"/>
+              </w:rPr>
+              <w:t xml:space="preserve">P26 (v4.4)</w:t>
+            </w:r>
+          </w:p>
+        </w:tc>
+        <w:tc>
+          <w:tcPr>
+            <w:tcW w:type="dxa" w:w="1474"/>
+          </w:tcPr>
+          <w:p>
+            <w:pPr>
+              <w:pStyle w:val="Compact"/>
+              <w:jc w:val="left"/>
+            </w:pPr>
+            <w:r>
+              <w:rPr>
+                <w:bCs/>
+                <w:b/>
+                <w:sz w:val="18"/>
+              </w:rPr>
+              <w:t xml:space="preserve">Send feedback as someone else</w:t>
+            </w:r>
+          </w:p>
+        </w:tc>
+        <w:tc>
+          <w:tcPr>
+            <w:tcW w:type="dxa" w:w="2891"/>
+          </w:tcPr>
+          <w:p>
+            <w:pPr>
+              <w:pStyle w:val="Compact"/>
+              <w:jc w:val="left"/>
+            </w:pPr>
+            <w:r>
+              <w:rPr>
+                <w:sz w:val="18"/>
+              </w:rPr>
+              <w:t xml:space="preserve">A: POST</w:t>
+            </w:r>
+            <w:r>
+              <w:rPr>
+                <w:sz w:val="18"/>
+              </w:rPr>
+              <w:t xml:space="preserve"> </w:t>
+            </w:r>
+            <w:r>
+              <w:rPr>
+                <w:rStyle w:val="VerbatimChar"/>
+                <w:sz w:val="18"/>
+              </w:rPr>
+              <w:t xml:space="preserve">…getbytitle('1-to-1 Feedback')/AddValidateUpdateItemUsingPath</w:t>
+            </w:r>
+            <w:r>
+              <w:rPr>
+                <w:sz w:val="18"/>
+              </w:rPr>
+              <w:t xml:space="preserve"> </w:t>
+            </w:r>
+            <w:r>
+              <w:rPr>
+                <w:sz w:val="18"/>
+              </w:rPr>
+              <w:t xml:space="preserve">with form values</w:t>
+            </w:r>
+            <w:r>
+              <w:rPr>
+                <w:sz w:val="18"/>
+              </w:rPr>
+              <w:t xml:space="preserve"> </w:t>
+            </w:r>
+            <w:r>
+              <w:rPr>
+                <w:rStyle w:val="VerbatimChar"/>
+                <w:sz w:val="18"/>
+              </w:rPr>
+              <w:t xml:space="preserve">Author</w:t>
+            </w:r>
+            <w:r>
+              <w:rPr>
+                <w:sz w:val="18"/>
+              </w:rPr>
+              <w:t xml:space="preserve"> </w:t>
+            </w:r>
+            <w:r>
+              <w:rPr>
+                <w:sz w:val="18"/>
+              </w:rPr>
+              <w:t xml:space="preserve">/</w:t>
+            </w:r>
+            <w:r>
+              <w:rPr>
+                <w:sz w:val="18"/>
+              </w:rPr>
+              <w:t xml:space="preserve"> </w:t>
+            </w:r>
+            <w:r>
+              <w:rPr>
+                <w:rStyle w:val="VerbatimChar"/>
+                <w:sz w:val="18"/>
+              </w:rPr>
+              <w:t xml:space="preserve">Editor</w:t>
+            </w:r>
+            <w:r>
+              <w:rPr>
+                <w:sz w:val="18"/>
+              </w:rPr>
+              <w:t xml:space="preserve"> </w:t>
+            </w:r>
+            <w:r>
+              <w:rPr>
+                <w:sz w:val="18"/>
+              </w:rPr>
+              <w:t xml:space="preserve">set to B</w:t>
+            </w:r>
+          </w:p>
+        </w:tc>
+        <w:tc>
+          <w:tcPr>
+            <w:tcW w:type="dxa" w:w="2324"/>
+          </w:tcPr>
+          <w:p>
+            <w:pPr>
+              <w:pStyle w:val="Compact"/>
+              <w:jc w:val="left"/>
+            </w:pPr>
+            <w:r>
+              <w:rPr>
+                <w:sz w:val="18"/>
+              </w:rPr>
+              <w:t xml:space="preserve">The item is recorded as A (Author/Editor ignored or rejected). If SharePoint accepts the change, record it here: the E13 sender is then "as recorded", and the TL should confirm unexpected feedback in person.</w:t>
+            </w:r>
+          </w:p>
+        </w:tc>
+        <w:tc>
+          <w:tcPr>
+            <w:tcW w:type="dxa" w:w="850"/>
+          </w:tcPr>
+          <w:p>
+            <w:pPr>
+              <w:pStyle w:val="Compact"/>
+            </w:pPr>
+          </w:p>
+        </w:tc>
+        <w:tc>
+          <w:tcPr>
+            <w:tcW w:type="dxa" w:w="794"/>
+          </w:tcPr>
+          <w:p>
+            <w:pPr>
+              <w:pStyle w:val="Compact"/>
+            </w:pPr>
+          </w:p>
+        </w:tc>
+        <w:tc>
+          <w:tcPr>
+            <w:tcW w:type="dxa" w:w="850"/>
+          </w:tcPr>
+          <w:p>
+            <w:pPr>
+              <w:pStyle w:val="Compact"/>
+            </w:pPr>
+          </w:p>
+        </w:tc>
+      </w:tr>
+      <w:tr>
+        <w:tc>
+          <w:tcPr>
+            <w:tcW w:type="dxa" w:w="680"/>
+          </w:tcPr>
+          <w:p>
+            <w:pPr>
+              <w:pStyle w:val="Compact"/>
+              <w:jc w:val="left"/>
+            </w:pPr>
+            <w:r>
+              <w:rPr>
+                <w:sz w:val="18"/>
+              </w:rPr>
+              <w:t xml:space="preserve">P27 (v4.4)</w:t>
+            </w:r>
+          </w:p>
+        </w:tc>
+        <w:tc>
+          <w:tcPr>
+            <w:tcW w:type="dxa" w:w="1474"/>
+          </w:tcPr>
+          <w:p>
+            <w:pPr>
+              <w:pStyle w:val="Compact"/>
+              <w:jc w:val="left"/>
+            </w:pPr>
+            <w:r>
+              <w:rPr>
+                <w:bCs/>
+                <w:b/>
+                <w:sz w:val="18"/>
+              </w:rPr>
+              <w:t xml:space="preserve">Get alerted to others' feedback</w:t>
+            </w:r>
+          </w:p>
+        </w:tc>
+        <w:tc>
+          <w:tcPr>
+            <w:tcW w:type="dxa" w:w="2891"/>
+          </w:tcPr>
+          <w:p>
+            <w:pPr>
+              <w:pStyle w:val="Compact"/>
+              <w:jc w:val="left"/>
+            </w:pPr>
+            <w:r>
+              <w:rPr>
+                <w:sz w:val="18"/>
+              </w:rPr>
+              <w:t xml:space="preserve">B: try</w:t>
+            </w:r>
+            <w:r>
+              <w:rPr>
+                <w:sz w:val="18"/>
+              </w:rPr>
+              <w:t xml:space="preserve"> </w:t>
+            </w:r>
+            <w:r>
+              <w:rPr>
+                <w:iCs/>
+                <w:i/>
+                <w:sz w:val="18"/>
+              </w:rPr>
+              <w:t xml:space="preserve">Alert me</w:t>
+            </w:r>
+            <w:r>
+              <w:rPr>
+                <w:sz w:val="18"/>
+              </w:rPr>
+              <w:t xml:space="preserve"> </w:t>
+            </w:r>
+            <w:r>
+              <w:rPr>
+                <w:sz w:val="18"/>
+              </w:rPr>
+              <w:t xml:space="preserve">on 1-to-1 Feedback, and POST</w:t>
+            </w:r>
+            <w:r>
+              <w:rPr>
+                <w:sz w:val="18"/>
+              </w:rPr>
+              <w:t xml:space="preserve"> </w:t>
+            </w:r>
+            <w:r>
+              <w:rPr>
+                <w:rStyle w:val="VerbatimChar"/>
+                <w:sz w:val="18"/>
+              </w:rPr>
+              <w:t xml:space="preserve">…/alerts/add</w:t>
+            </w:r>
+          </w:p>
+        </w:tc>
+        <w:tc>
+          <w:tcPr>
+            <w:tcW w:type="dxa" w:w="2324"/>
+          </w:tcPr>
+          <w:p>
+            <w:pPr>
+              <w:pStyle w:val="Compact"/>
+              <w:jc w:val="left"/>
+            </w:pPr>
+            <w:r>
+              <w:rPr>
+                <w:sz w:val="18"/>
+              </w:rPr>
+              <w:t xml:space="preserve">Denied –</w:t>
+            </w:r>
+            <w:r>
+              <w:rPr>
+                <w:sz w:val="18"/>
+              </w:rPr>
+              <w:t xml:space="preserve"> </w:t>
+            </w:r>
+            <w:r>
+              <w:rPr>
+                <w:rStyle w:val="VerbatimChar"/>
+                <w:sz w:val="18"/>
+              </w:rPr>
+              <w:t xml:space="preserve">1-to-1 Submit</w:t>
+            </w:r>
+            <w:r>
+              <w:rPr>
+                <w:sz w:val="18"/>
+              </w:rPr>
+              <w:t xml:space="preserve"> </w:t>
+            </w:r>
+            <w:r>
+              <w:rPr>
+                <w:sz w:val="18"/>
+              </w:rPr>
+              <w:t xml:space="preserve">has no Create Alerts.</w:t>
+            </w:r>
+          </w:p>
+        </w:tc>
+        <w:tc>
+          <w:tcPr>
+            <w:tcW w:type="dxa" w:w="850"/>
+          </w:tcPr>
+          <w:p>
+            <w:pPr>
+              <w:pStyle w:val="Compact"/>
+            </w:pPr>
+          </w:p>
+        </w:tc>
+        <w:tc>
+          <w:tcPr>
+            <w:tcW w:type="dxa" w:w="794"/>
+          </w:tcPr>
+          <w:p>
+            <w:pPr>
+              <w:pStyle w:val="Compact"/>
+            </w:pPr>
+          </w:p>
+        </w:tc>
+        <w:tc>
+          <w:tcPr>
+            <w:tcW w:type="dxa" w:w="850"/>
+          </w:tcPr>
+          <w:p>
+            <w:pPr>
+              <w:pStyle w:val="Compact"/>
+            </w:pPr>
+          </w:p>
+        </w:tc>
+      </w:tr>
+      <w:tr>
+        <w:tc>
+          <w:tcPr>
+            <w:tcW w:type="dxa" w:w="680"/>
+          </w:tcPr>
+          <w:p>
+            <w:pPr>
+              <w:pStyle w:val="Compact"/>
+              <w:jc w:val="left"/>
+            </w:pPr>
+            <w:r>
+              <w:rPr>
+                <w:sz w:val="18"/>
+              </w:rPr>
+              <w:t xml:space="preserve">P28 (v4.4)</w:t>
+            </w:r>
+          </w:p>
+        </w:tc>
+        <w:tc>
+          <w:tcPr>
+            <w:tcW w:type="dxa" w:w="1474"/>
+          </w:tcPr>
+          <w:p>
+            <w:pPr>
+              <w:pStyle w:val="Compact"/>
+              <w:jc w:val="left"/>
+            </w:pPr>
+            <w:r>
+              <w:rPr>
+                <w:bCs/>
+                <w:b/>
+                <w:sz w:val="18"/>
+              </w:rPr>
+              <w:t xml:space="preserve">List metadata / change log</w:t>
+            </w:r>
+          </w:p>
+        </w:tc>
+        <w:tc>
+          <w:tcPr>
+            <w:tcW w:type="dxa" w:w="2891"/>
+          </w:tcPr>
+          <w:p>
+            <w:pPr>
+              <w:pStyle w:val="Compact"/>
+              <w:jc w:val="left"/>
+            </w:pPr>
+            <w:r>
+              <w:rPr>
+                <w:sz w:val="18"/>
+              </w:rPr>
+              <w:t xml:space="preserve">B: GET</w:t>
+            </w:r>
+            <w:r>
+              <w:rPr>
+                <w:sz w:val="18"/>
+              </w:rPr>
+              <w:t xml:space="preserve"> </w:t>
+            </w:r>
+            <w:r>
+              <w:rPr>
+                <w:rStyle w:val="VerbatimChar"/>
+                <w:sz w:val="18"/>
+              </w:rPr>
+              <w:t xml:space="preserve">…getbytitle('Wellbeing Assessments')?$select=ItemCount,LastItemUserModifiedDate</w:t>
+            </w:r>
+            <w:r>
+              <w:rPr>
+                <w:sz w:val="18"/>
+              </w:rPr>
+              <w:t xml:space="preserve">; POST</w:t>
+            </w:r>
+            <w:r>
+              <w:rPr>
+                <w:sz w:val="18"/>
+              </w:rPr>
+              <w:t xml:space="preserve"> </w:t>
+            </w:r>
+            <w:r>
+              <w:rPr>
+                <w:rStyle w:val="VerbatimChar"/>
+                <w:sz w:val="18"/>
+              </w:rPr>
+              <w:t xml:space="preserve">…/GetChanges</w:t>
+            </w:r>
+            <w:r>
+              <w:rPr>
+                <w:sz w:val="18"/>
+              </w:rPr>
+              <w:t xml:space="preserve"> </w:t>
+            </w:r>
+            <w:r>
+              <w:rPr>
+                <w:sz w:val="18"/>
+              </w:rPr>
+              <w:t xml:space="preserve">on Wellbeing Assessments and 1-to-1 Feedback</w:t>
+            </w:r>
+          </w:p>
+        </w:tc>
+        <w:tc>
+          <w:tcPr>
+            <w:tcW w:type="dxa" w:w="2324"/>
+          </w:tcPr>
+          <w:p>
+            <w:pPr>
+              <w:pStyle w:val="Compact"/>
+              <w:jc w:val="left"/>
+            </w:pPr>
+            <w:r>
+              <w:rPr>
+                <w:sz w:val="18"/>
+              </w:rPr>
+              <w:t xml:space="preserve">Denied, or reveals nothing personal. If dates/counts are visible, record it as an accepted risk (no content is exposed).</w:t>
             </w:r>
           </w:p>
         </w:tc>

</xml_diff>

<commit_message>
Final counts (273 frontend, 220 simulations, 25 mutations) and guide
Co-Authored-By: Claude Opus 5.5 <noreply@anthropic.com>
Claude-Session: https://claude.ai/code/session_014y1MJU3GKp2dkeyoic78UT
</commit_message>
<xml_diff>
--- a/one-to-one/ESG-1to1-Finalisation-Guide.docx
+++ b/one-to-one/ESG-1to1-Finalisation-Guide.docx
@@ -208,7 +208,7 @@
         <w:pStyle w:val="Compact"/>
       </w:pPr>
       <w:r>
-        <w:t xml:space="preserve">frontend: 219 automated checks;</w:t>
+        <w:t xml:space="preserve">frontend: 273 automated checks;</w:t>
       </w:r>
     </w:p>
     <w:p>
@@ -220,7 +220,7 @@
         <w:pStyle w:val="Compact"/>
       </w:pPr>
       <w:r>
-        <w:t xml:space="preserve">flows: simulated end to end, 213 checks, and 25 deliberately broken copies all caught by the validator;</w:t>
+        <w:t xml:space="preserve">flows: simulated end to end, 220 checks, and 25 deliberately broken copies all caught by the validator;</w:t>
       </w:r>
     </w:p>
     <w:p>

</xml_diff>

<commit_message>
Docs for 1.4 / 5.0.0: finalisation guide generator, retention and subject-access notes for Amendments, plan tests F49–F56 / P30, risks R20–R21
Co-Authored-By: Claude Opus 5.5 <noreply@anthropic.com>
Claude-Session: https://claude.ai/code/session_014y1MJU3GKp2dkeyoic78UT
</commit_message>
<xml_diff>
--- a/one-to-one/ESG-1to1-Finalisation-Guide.docx
+++ b/one-to-one/ESG-1to1-Finalisation-Guide.docx
@@ -208,7 +208,7 @@
         <w:pStyle w:val="Compact"/>
       </w:pPr>
       <w:r>
-        <w:t xml:space="preserve">frontend: 305 automated checks (plus 31 for the one-time reset tool);</w:t>
+        <w:t xml:space="preserve">frontend: 306 automated checks (plus 31 for the one-time reset tool);</w:t>
       </w:r>
     </w:p>
     <w:p>
@@ -220,7 +220,7 @@
         <w:pStyle w:val="Compact"/>
       </w:pPr>
       <w:r>
-        <w:t xml:space="preserve">flows: simulated end to end, 215 checks, and 29 deliberately broken copies all caught by the validator;</w:t>
+        <w:t xml:space="preserve">flows: simulated end to end, 216 checks, and 34 deliberately broken copies all caught by the validator;</w:t>
       </w:r>
     </w:p>
     <w:p>
@@ -2688,7 +2688,7 @@
         <w:rPr>
           <w:rStyle w:val="VerbatimChar"/>
         </w:rPr>
-        <w:t xml:space="preserve">ESGOneToOne_1_3_0_0_unmanaged.zip</w:t>
+        <w:t xml:space="preserve">ESGOneToOne_1_4_0_0_unmanaged.zip</w:t>
       </w:r>
       <w:r>
         <w:t xml:space="preserve"> </w:t>

</xml_diff>